<commit_message>
Commit 4: - Added more papers - Added a summary for Band et al paper in the docx file.
</commit_message>
<xml_diff>
--- a/Literature Review/literature review.docx
+++ b/Literature Review/literature review.docx
@@ -2,744 +2,8 @@
 <file path=word/document.xml><?xml version="1.0" encoding="utf-8"?>
 <w:document xmlns:wpc="http://schemas.microsoft.com/office/word/2010/wordprocessingCanvas" xmlns:cx="http://schemas.microsoft.com/office/drawing/2014/chartex" xmlns:cx1="http://schemas.microsoft.com/office/drawing/2015/9/8/chartex" xmlns:cx2="http://schemas.microsoft.com/office/drawing/2015/10/21/chartex" xmlns:cx3="http://schemas.microsoft.com/office/drawing/2016/5/9/chartex" xmlns:cx4="http://schemas.microsoft.com/office/drawing/2016/5/10/chartex" xmlns:cx5="http://schemas.microsoft.com/office/drawing/2016/5/11/chartex" xmlns:cx6="http://schemas.microsoft.com/office/drawing/2016/5/12/chartex" xmlns:cx7="http://schemas.microsoft.com/office/drawing/2016/5/13/chartex" xmlns:cx8="http://schemas.microsoft.com/office/drawing/2016/5/14/chartex" xmlns:mc="http://schemas.openxmlformats.org/markup-compatibility/2006" xmlns:aink="http://schemas.microsoft.com/office/drawing/2016/ink" xmlns:am3d="http://schemas.microsoft.com/office/drawing/2017/model3d" xmlns:o="urn:schemas-microsoft-com:office:office" xmlns:oel="http://schemas.microsoft.com/office/2019/extlst" xmlns:r="http://schemas.openxmlformats.org/officeDocument/2006/relationships" xmlns:m="http://schemas.openxmlformats.org/officeDocument/2006/math" xmlns:v="urn:schemas-microsoft-com:vml" xmlns:wp14="http://schemas.microsoft.com/office/word/2010/wordprocessingDrawing" xmlns:wp="http://schemas.openxmlformats.org/drawingml/2006/wordprocessingDrawing" xmlns:w10="urn:schemas-microsoft-com:office:word" xmlns:w="http://schemas.openxmlformats.org/wordprocessingml/2006/main" xmlns:w14="http://schemas.microsoft.com/office/word/2010/wordml" xmlns:w15="http://schemas.microsoft.com/office/word/2012/wordml" xmlns:w16cex="http://schemas.microsoft.com/office/word/2018/wordml/cex" xmlns:w16cid="http://schemas.microsoft.com/office/word/2016/wordml/cid" xmlns:w16="http://schemas.microsoft.com/office/word/2018/wordml" xmlns:w16du="http://schemas.microsoft.com/office/word/2023/wordml/word16du" xmlns:w16sdtdh="http://schemas.microsoft.com/office/word/2020/wordml/sdtdatahash" xmlns:w16sdtfl="http://schemas.microsoft.com/office/word/2024/wordml/sdtformatlock" xmlns:w16se="http://schemas.microsoft.com/office/word/2015/wordml/symex" xmlns:wpg="http://schemas.microsoft.com/office/word/2010/wordprocessingGroup" xmlns:wpi="http://schemas.microsoft.com/office/word/2010/wordprocessingInk" xmlns:wne="http://schemas.microsoft.com/office/word/2006/wordml" xmlns:wps="http://schemas.microsoft.com/office/word/2010/wordprocessingShape" mc:Ignorable="w14 w15 w16se w16cid w16 w16cex w16sdtdh w16sdtfl w16du wp14">
   <w:body>
-    <w:tbl>
-      <w:tblPr>
-        <w:tblW w:w="0" w:type="auto"/>
-        <w:tblCellSpacing w:w="15" w:type="dxa"/>
-        <w:tblBorders>
-          <w:top w:val="single" w:sz="4" w:space="0" w:color="auto"/>
-          <w:left w:val="single" w:sz="4" w:space="0" w:color="auto"/>
-          <w:bottom w:val="single" w:sz="4" w:space="0" w:color="auto"/>
-          <w:right w:val="single" w:sz="4" w:space="0" w:color="auto"/>
-          <w:insideH w:val="single" w:sz="4" w:space="0" w:color="auto"/>
-          <w:insideV w:val="single" w:sz="4" w:space="0" w:color="auto"/>
-        </w:tblBorders>
-        <w:tblCellMar>
-          <w:top w:w="15" w:type="dxa"/>
-          <w:left w:w="15" w:type="dxa"/>
-          <w:bottom w:w="15" w:type="dxa"/>
-          <w:right w:w="15" w:type="dxa"/>
-        </w:tblCellMar>
-        <w:tblLook w:val="04A0" w:firstRow="1" w:lastRow="0" w:firstColumn="1" w:lastColumn="0" w:noHBand="0" w:noVBand="1"/>
-      </w:tblPr>
-      <w:tblGrid>
-        <w:gridCol w:w="1905"/>
-        <w:gridCol w:w="3250"/>
-        <w:gridCol w:w="2448"/>
-        <w:gridCol w:w="1747"/>
-      </w:tblGrid>
-      <w:tr>
-        <w:trPr>
-          <w:tblHeader/>
-          <w:tblCellSpacing w:w="15" w:type="dxa"/>
-        </w:trPr>
-        <w:tc>
-          <w:tcPr>
-            <w:tcW w:w="0" w:type="auto"/>
-            <w:vAlign w:val="center"/>
-            <w:hideMark/>
-          </w:tcPr>
-          <w:p>
-            <w:pPr>
-              <w:rPr>
-                <w:b/>
-                <w:bCs/>
-              </w:rPr>
-            </w:pPr>
-            <w:r>
-              <w:rPr>
-                <w:b/>
-                <w:bCs/>
-              </w:rPr>
-              <w:t>Model</w:t>
-            </w:r>
-          </w:p>
-        </w:tc>
-        <w:tc>
-          <w:tcPr>
-            <w:tcW w:w="0" w:type="auto"/>
-            <w:vAlign w:val="center"/>
-            <w:hideMark/>
-          </w:tcPr>
-          <w:p>
-            <w:pPr>
-              <w:rPr>
-                <w:b/>
-                <w:bCs/>
-              </w:rPr>
-            </w:pPr>
-            <w:r>
-              <w:rPr>
-                <w:b/>
-                <w:bCs/>
-              </w:rPr>
-              <w:t>Concept</w:t>
-            </w:r>
-          </w:p>
-        </w:tc>
-        <w:tc>
-          <w:tcPr>
-            <w:tcW w:w="0" w:type="auto"/>
-            <w:vAlign w:val="center"/>
-            <w:hideMark/>
-          </w:tcPr>
-          <w:p>
-            <w:pPr>
-              <w:rPr>
-                <w:b/>
-                <w:bCs/>
-              </w:rPr>
-            </w:pPr>
-            <w:r>
-              <w:rPr>
-                <w:b/>
-                <w:bCs/>
-              </w:rPr>
-              <w:t>Spectral Signature</w:t>
-            </w:r>
-          </w:p>
-        </w:tc>
-        <w:tc>
-          <w:tcPr>
-            <w:tcW w:w="0" w:type="auto"/>
-            <w:vAlign w:val="center"/>
-            <w:hideMark/>
-          </w:tcPr>
-          <w:p>
-            <w:pPr>
-              <w:rPr>
-                <w:b/>
-                <w:bCs/>
-              </w:rPr>
-            </w:pPr>
-            <w:r>
-              <w:rPr>
-                <w:b/>
-                <w:bCs/>
-              </w:rPr>
-              <w:t>Key References</w:t>
-            </w:r>
-          </w:p>
-        </w:tc>
-      </w:tr>
-      <w:tr>
-        <w:trPr>
-          <w:tblCellSpacing w:w="15" w:type="dxa"/>
-        </w:trPr>
-        <w:tc>
-          <w:tcPr>
-            <w:tcW w:w="0" w:type="auto"/>
-            <w:vAlign w:val="center"/>
-            <w:hideMark/>
-          </w:tcPr>
-          <w:p>
-            <w:pPr>
-              <w:rPr>
-                <w:highlight w:val="yellow"/>
-              </w:rPr>
-            </w:pPr>
-            <w:r>
-              <w:rPr>
-                <w:b/>
-                <w:bCs/>
-                <w:highlight w:val="yellow"/>
-              </w:rPr>
-              <w:t xml:space="preserve">Pure </w:t>
-            </w:r>
-            <w:proofErr w:type="spellStart"/>
-            <w:r>
-              <w:rPr>
-                <w:b/>
-                <w:bCs/>
-                <w:highlight w:val="yellow"/>
-              </w:rPr>
-              <w:t>Photospheric</w:t>
-            </w:r>
-            <w:proofErr w:type="spellEnd"/>
-            <w:r>
-              <w:rPr>
-                <w:b/>
-                <w:bCs/>
-                <w:highlight w:val="yellow"/>
-              </w:rPr>
-              <w:t xml:space="preserve"> Fireball</w:t>
-            </w:r>
-          </w:p>
-        </w:tc>
-        <w:tc>
-          <w:tcPr>
-            <w:tcW w:w="0" w:type="auto"/>
-            <w:vAlign w:val="center"/>
-            <w:hideMark/>
-          </w:tcPr>
-          <w:p>
-            <w:pPr>
-              <w:rPr>
-                <w:highlight w:val="yellow"/>
-              </w:rPr>
-            </w:pPr>
-            <w:r>
-              <w:rPr>
-                <w:highlight w:val="yellow"/>
-              </w:rPr>
-              <w:t>GRB fireball becomes transparent at the photosphere; photons escape as thermal radiation.</w:t>
-            </w:r>
-          </w:p>
-        </w:tc>
-        <w:tc>
-          <w:tcPr>
-            <w:tcW w:w="0" w:type="auto"/>
-            <w:vAlign w:val="center"/>
-            <w:hideMark/>
-          </w:tcPr>
-          <w:p>
-            <w:pPr>
-              <w:rPr>
-                <w:highlight w:val="yellow"/>
-              </w:rPr>
-            </w:pPr>
-            <w:r>
-              <w:rPr>
-                <w:highlight w:val="yellow"/>
-              </w:rPr>
-              <w:t>Nearly Planckian blackbody peak (too narrow compared to observed GRBs).</w:t>
-            </w:r>
-          </w:p>
-        </w:tc>
-        <w:tc>
-          <w:tcPr>
-            <w:tcW w:w="0" w:type="auto"/>
-            <w:vAlign w:val="center"/>
-            <w:hideMark/>
-          </w:tcPr>
-          <w:p>
-            <w:pPr>
-              <w:rPr>
-                <w:highlight w:val="yellow"/>
-              </w:rPr>
-            </w:pPr>
-            <w:r>
-              <w:rPr>
-                <w:highlight w:val="yellow"/>
-              </w:rPr>
-              <w:t>Goodman (1986); Paczyński (1986)</w:t>
-            </w:r>
-          </w:p>
-        </w:tc>
-      </w:tr>
-      <w:tr>
-        <w:trPr>
-          <w:tblCellSpacing w:w="15" w:type="dxa"/>
-        </w:trPr>
-        <w:tc>
-          <w:tcPr>
-            <w:tcW w:w="0" w:type="auto"/>
-            <w:vAlign w:val="center"/>
-            <w:hideMark/>
-          </w:tcPr>
-          <w:p>
-            <w:pPr>
-              <w:rPr>
-                <w:highlight w:val="yellow"/>
-                <w:lang w:val="it-IT"/>
-              </w:rPr>
-            </w:pPr>
-            <w:r>
-              <w:rPr>
-                <w:b/>
-                <w:bCs/>
-                <w:highlight w:val="yellow"/>
-                <w:lang w:val="it-IT"/>
-              </w:rPr>
-              <w:t>Multi-Color / Multi-Temperature BB (mBB)</w:t>
-            </w:r>
-          </w:p>
-        </w:tc>
-        <w:tc>
-          <w:tcPr>
-            <w:tcW w:w="0" w:type="auto"/>
-            <w:vAlign w:val="center"/>
-            <w:hideMark/>
-          </w:tcPr>
-          <w:p>
-            <w:pPr>
-              <w:rPr>
-                <w:highlight w:val="yellow"/>
-              </w:rPr>
-            </w:pPr>
-            <w:r>
-              <w:rPr>
-                <w:highlight w:val="yellow"/>
-              </w:rPr>
-              <w:t>Jet angle/geometry produces temperature variation across the emitting surface.</w:t>
-            </w:r>
-          </w:p>
-        </w:tc>
-        <w:tc>
-          <w:tcPr>
-            <w:tcW w:w="0" w:type="auto"/>
-            <w:vAlign w:val="center"/>
-            <w:hideMark/>
-          </w:tcPr>
-          <w:p>
-            <w:pPr>
-              <w:rPr>
-                <w:highlight w:val="yellow"/>
-              </w:rPr>
-            </w:pPr>
-            <w:r>
-              <w:rPr>
-                <w:highlight w:val="yellow"/>
-              </w:rPr>
-              <w:t>Superposition of BBs → broadened spectrum.</w:t>
-            </w:r>
-          </w:p>
-        </w:tc>
-        <w:tc>
-          <w:tcPr>
-            <w:tcW w:w="0" w:type="auto"/>
-            <w:vAlign w:val="center"/>
-            <w:hideMark/>
-          </w:tcPr>
-          <w:p>
-            <w:r>
-              <w:rPr>
-                <w:highlight w:val="yellow"/>
-              </w:rPr>
-              <w:t>Ryde (2004, 2005); Pe’er &amp; Ryde (2011)</w:t>
-            </w:r>
-          </w:p>
-        </w:tc>
-      </w:tr>
-      <w:tr>
-        <w:trPr>
-          <w:tblCellSpacing w:w="15" w:type="dxa"/>
-        </w:trPr>
-        <w:tc>
-          <w:tcPr>
-            <w:tcW w:w="0" w:type="auto"/>
-            <w:vAlign w:val="center"/>
-            <w:hideMark/>
-          </w:tcPr>
-          <w:p>
-            <w:pPr>
-              <w:rPr>
-                <w:highlight w:val="yellow"/>
-              </w:rPr>
-            </w:pPr>
-            <w:r>
-              <w:rPr>
-                <w:b/>
-                <w:bCs/>
-                <w:highlight w:val="yellow"/>
-              </w:rPr>
-              <w:t>Sub-</w:t>
-            </w:r>
-            <w:proofErr w:type="spellStart"/>
-            <w:r>
-              <w:rPr>
-                <w:b/>
-                <w:bCs/>
-                <w:highlight w:val="yellow"/>
-              </w:rPr>
-              <w:t>Photospheric</w:t>
-            </w:r>
-            <w:proofErr w:type="spellEnd"/>
-            <w:r>
-              <w:rPr>
-                <w:b/>
-                <w:bCs/>
-                <w:highlight w:val="yellow"/>
-              </w:rPr>
-              <w:t xml:space="preserve"> Dissipation</w:t>
-            </w:r>
-          </w:p>
-        </w:tc>
-        <w:tc>
-          <w:tcPr>
-            <w:tcW w:w="0" w:type="auto"/>
-            <w:vAlign w:val="center"/>
-            <w:hideMark/>
-          </w:tcPr>
-          <w:p>
-            <w:pPr>
-              <w:rPr>
-                <w:highlight w:val="yellow"/>
-              </w:rPr>
-            </w:pPr>
-            <w:r>
-              <w:rPr>
-                <w:highlight w:val="yellow"/>
-              </w:rPr>
-              <w:t>Dissipation (shocks, magnetic reconnection, collisional heating) below the photosphere modifies the emerging BB.</w:t>
-            </w:r>
-          </w:p>
-        </w:tc>
-        <w:tc>
-          <w:tcPr>
-            <w:tcW w:w="0" w:type="auto"/>
-            <w:vAlign w:val="center"/>
-            <w:hideMark/>
-          </w:tcPr>
-          <w:p>
-            <w:pPr>
-              <w:rPr>
-                <w:highlight w:val="yellow"/>
-              </w:rPr>
-            </w:pPr>
-            <w:proofErr w:type="spellStart"/>
-            <w:r>
-              <w:rPr>
-                <w:highlight w:val="yellow"/>
-              </w:rPr>
-              <w:t>Comptonized</w:t>
-            </w:r>
-            <w:proofErr w:type="spellEnd"/>
-            <w:r>
-              <w:rPr>
-                <w:highlight w:val="yellow"/>
-              </w:rPr>
-              <w:t xml:space="preserve"> BB: thermal peak + broader high-energy tail.</w:t>
-            </w:r>
-          </w:p>
-        </w:tc>
-        <w:tc>
-          <w:tcPr>
-            <w:tcW w:w="0" w:type="auto"/>
-            <w:vAlign w:val="center"/>
-            <w:hideMark/>
-          </w:tcPr>
-          <w:p>
-            <w:pPr>
-              <w:rPr>
-                <w:highlight w:val="yellow"/>
-              </w:rPr>
-            </w:pPr>
-            <w:r>
-              <w:rPr>
-                <w:highlight w:val="yellow"/>
-              </w:rPr>
-              <w:t>Rees &amp; Mészáros (2005); Pe’er et al. (2006)</w:t>
-            </w:r>
-          </w:p>
-        </w:tc>
-      </w:tr>
-      <w:tr>
-        <w:trPr>
-          <w:tblCellSpacing w:w="15" w:type="dxa"/>
-        </w:trPr>
-        <w:tc>
-          <w:tcPr>
-            <w:tcW w:w="0" w:type="auto"/>
-            <w:vAlign w:val="center"/>
-            <w:hideMark/>
-          </w:tcPr>
-          <w:p>
-            <w:pPr>
-              <w:rPr>
-                <w:highlight w:val="yellow"/>
-              </w:rPr>
-            </w:pPr>
-            <w:proofErr w:type="spellStart"/>
-            <w:r>
-              <w:rPr>
-                <w:b/>
-                <w:bCs/>
-                <w:highlight w:val="yellow"/>
-              </w:rPr>
-              <w:t>Comptonized</w:t>
-            </w:r>
-            <w:proofErr w:type="spellEnd"/>
-            <w:r>
-              <w:rPr>
-                <w:b/>
-                <w:bCs/>
-                <w:highlight w:val="yellow"/>
-              </w:rPr>
-              <w:t xml:space="preserve"> Blackbody (BB + PL/CPL)</w:t>
-            </w:r>
-          </w:p>
-        </w:tc>
-        <w:tc>
-          <w:tcPr>
-            <w:tcW w:w="0" w:type="auto"/>
-            <w:vAlign w:val="center"/>
-            <w:hideMark/>
-          </w:tcPr>
-          <w:p>
-            <w:pPr>
-              <w:rPr>
-                <w:highlight w:val="yellow"/>
-              </w:rPr>
-            </w:pPr>
-            <w:r>
-              <w:rPr>
-                <w:highlight w:val="yellow"/>
-              </w:rPr>
-              <w:t>Observed GRB fits often need a thermal peak plus a non-thermal power-law tail.</w:t>
-            </w:r>
-          </w:p>
-        </w:tc>
-        <w:tc>
-          <w:tcPr>
-            <w:tcW w:w="0" w:type="auto"/>
-            <w:vAlign w:val="center"/>
-            <w:hideMark/>
-          </w:tcPr>
-          <w:p>
-            <w:pPr>
-              <w:rPr>
-                <w:highlight w:val="yellow"/>
-              </w:rPr>
-            </w:pPr>
-            <w:r>
-              <w:rPr>
-                <w:highlight w:val="yellow"/>
-              </w:rPr>
-              <w:t>BB core with an additional PL or cutoff PL.</w:t>
-            </w:r>
-          </w:p>
-        </w:tc>
-        <w:tc>
-          <w:tcPr>
-            <w:tcW w:w="0" w:type="auto"/>
-            <w:vAlign w:val="center"/>
-            <w:hideMark/>
-          </w:tcPr>
-          <w:p>
-            <w:r>
-              <w:rPr>
-                <w:highlight w:val="yellow"/>
-              </w:rPr>
-              <w:t>Ryde (2004, 20</w:t>
-            </w:r>
-            <w:r>
-              <w:rPr>
-                <w:highlight w:val="yellow"/>
-              </w:rPr>
-              <w:t>09</w:t>
-            </w:r>
-            <w:r>
-              <w:rPr>
-                <w:highlight w:val="yellow"/>
-              </w:rPr>
-              <w:t>);</w:t>
-            </w:r>
-            <w:r>
-              <w:t xml:space="preserve"> </w:t>
-            </w:r>
-            <w:proofErr w:type="spellStart"/>
-            <w:r>
-              <w:rPr>
-                <w:highlight w:val="yellow"/>
-              </w:rPr>
-              <w:t>Guiriec</w:t>
-            </w:r>
-            <w:proofErr w:type="spellEnd"/>
-            <w:r>
-              <w:rPr>
-                <w:highlight w:val="yellow"/>
-              </w:rPr>
-              <w:t xml:space="preserve"> et al. (2011, 2013</w:t>
-            </w:r>
-            <w:r>
-              <w:t>)</w:t>
-            </w:r>
-          </w:p>
-        </w:tc>
-      </w:tr>
-      <w:tr>
-        <w:trPr>
-          <w:tblCellSpacing w:w="15" w:type="dxa"/>
-        </w:trPr>
-        <w:tc>
-          <w:tcPr>
-            <w:tcW w:w="0" w:type="auto"/>
-            <w:vAlign w:val="center"/>
-            <w:hideMark/>
-          </w:tcPr>
-          <w:p>
-            <w:pPr>
-              <w:rPr>
-                <w:highlight w:val="yellow"/>
-              </w:rPr>
-            </w:pPr>
-            <w:r>
-              <w:rPr>
-                <w:b/>
-                <w:bCs/>
-                <w:highlight w:val="yellow"/>
-              </w:rPr>
-              <w:t>Two-Component Jet (Spine–Sheath)</w:t>
-            </w:r>
-          </w:p>
-        </w:tc>
-        <w:tc>
-          <w:tcPr>
-            <w:tcW w:w="0" w:type="auto"/>
-            <w:vAlign w:val="center"/>
-            <w:hideMark/>
-          </w:tcPr>
-          <w:p>
-            <w:pPr>
-              <w:rPr>
-                <w:highlight w:val="yellow"/>
-              </w:rPr>
-            </w:pPr>
-            <w:r>
-              <w:rPr>
-                <w:highlight w:val="yellow"/>
-              </w:rPr>
-              <w:t>Jet has inner spine (thermal photosphere) + outer sheath (shocks, non-thermal).</w:t>
-            </w:r>
-          </w:p>
-        </w:tc>
-        <w:tc>
-          <w:tcPr>
-            <w:tcW w:w="0" w:type="auto"/>
-            <w:vAlign w:val="center"/>
-            <w:hideMark/>
-          </w:tcPr>
-          <w:p>
-            <w:pPr>
-              <w:rPr>
-                <w:highlight w:val="yellow"/>
-              </w:rPr>
-            </w:pPr>
-            <w:r>
-              <w:rPr>
-                <w:highlight w:val="yellow"/>
-              </w:rPr>
-              <w:t>BB + Band-like non-thermal component.</w:t>
-            </w:r>
-          </w:p>
-        </w:tc>
-        <w:tc>
-          <w:tcPr>
-            <w:tcW w:w="0" w:type="auto"/>
-            <w:vAlign w:val="center"/>
-            <w:hideMark/>
-          </w:tcPr>
-          <w:p>
-            <w:r>
-              <w:rPr>
-                <w:highlight w:val="yellow"/>
-              </w:rPr>
-              <w:t>Lundman</w:t>
-            </w:r>
-            <w:r>
-              <w:rPr>
-                <w:highlight w:val="yellow"/>
-              </w:rPr>
-              <w:t xml:space="preserve"> </w:t>
-            </w:r>
-            <w:r>
-              <w:rPr>
-                <w:highlight w:val="yellow"/>
-              </w:rPr>
-              <w:t>(201</w:t>
-            </w:r>
-            <w:r>
-              <w:rPr>
-                <w:highlight w:val="yellow"/>
-              </w:rPr>
-              <w:t>2)</w:t>
-            </w:r>
-          </w:p>
-        </w:tc>
-      </w:tr>
-      <w:tr>
-        <w:trPr>
-          <w:tblCellSpacing w:w="15" w:type="dxa"/>
-        </w:trPr>
-        <w:tc>
-          <w:tcPr>
-            <w:tcW w:w="0" w:type="auto"/>
-            <w:vAlign w:val="center"/>
-            <w:hideMark/>
-          </w:tcPr>
-          <w:p>
-            <w:pPr>
-              <w:rPr>
-                <w:highlight w:val="yellow"/>
-              </w:rPr>
-            </w:pPr>
-            <w:r>
-              <w:rPr>
-                <w:b/>
-                <w:bCs/>
-                <w:highlight w:val="yellow"/>
-              </w:rPr>
-              <w:t>Hybrid BB + Synchrotron</w:t>
-            </w:r>
-          </w:p>
-        </w:tc>
-        <w:tc>
-          <w:tcPr>
-            <w:tcW w:w="0" w:type="auto"/>
-            <w:vAlign w:val="center"/>
-            <w:hideMark/>
-          </w:tcPr>
-          <w:p>
-            <w:pPr>
-              <w:rPr>
-                <w:highlight w:val="yellow"/>
-              </w:rPr>
-            </w:pPr>
-            <w:r>
-              <w:rPr>
-                <w:highlight w:val="yellow"/>
-              </w:rPr>
-              <w:t>Photosphere contributes a BB, while accelerated electrons in the jet produce synchrotron radiation.</w:t>
-            </w:r>
-          </w:p>
-        </w:tc>
-        <w:tc>
-          <w:tcPr>
-            <w:tcW w:w="0" w:type="auto"/>
-            <w:vAlign w:val="center"/>
-            <w:hideMark/>
-          </w:tcPr>
-          <w:p>
-            <w:pPr>
-              <w:rPr>
-                <w:highlight w:val="yellow"/>
-              </w:rPr>
-            </w:pPr>
-            <w:r>
-              <w:rPr>
-                <w:highlight w:val="yellow"/>
-              </w:rPr>
-              <w:t>Thermal peak + broader synchrotron-dominated spectrum.</w:t>
-            </w:r>
-          </w:p>
-        </w:tc>
-        <w:tc>
-          <w:tcPr>
-            <w:tcW w:w="0" w:type="auto"/>
-            <w:vAlign w:val="center"/>
-            <w:hideMark/>
-          </w:tcPr>
-          <w:p>
-            <w:r>
-              <w:rPr>
-                <w:highlight w:val="yellow"/>
-              </w:rPr>
-              <w:t>Burgess et al. (2014); Yu et al. (2019)</w:t>
-            </w:r>
-          </w:p>
-        </w:tc>
-      </w:tr>
-    </w:tbl>
-    <w:p/>
-    <w:p>
-      <w:r>
-        <w:br w:type="page"/>
-      </w:r>
-    </w:p>
-    <w:p>
-      <w:r>
-        <w:lastRenderedPageBreak/>
+    <w:p>
+      <w:r>
         <w:t xml:space="preserve">A </w:t>
       </w:r>
       <w:proofErr w:type="spellStart"/>
@@ -1279,15 +543,7 @@
         <w:t>you don’t need exotic new physics</w:t>
       </w:r>
       <w:r>
-        <w:t xml:space="preserve"> to broaden a thermal peak — geometry + relativistic motion </w:t>
-      </w:r>
-      <w:proofErr w:type="gramStart"/>
-      <w:r>
-        <w:t>are</w:t>
-      </w:r>
-      <w:proofErr w:type="gramEnd"/>
-      <w:r>
-        <w:t xml:space="preserve"> enough.</w:t>
+        <w:t xml:space="preserve"> to broaden a thermal peak — geometry + relativistic motion are enough.</w:t>
       </w:r>
     </w:p>
     <w:p>
@@ -1331,53 +587,6 @@
       <w:r>
         <w:t>.</w:t>
       </w:r>
-    </w:p>
-    <w:p>
-      <w:r>
-        <w:pict w14:anchorId="77A04061">
-          <v:rect id="_x0000_i1025" style="width:0;height:1.5pt" o:hralign="center" o:hrstd="t" o:hr="t" fillcolor="#a0a0a0" stroked="f"/>
-        </w:pict>
-      </w:r>
-    </w:p>
-    <w:p>
-      <w:pPr>
-        <w:rPr>
-          <w:b/>
-          <w:bCs/>
-        </w:rPr>
-      </w:pPr>
-      <w:r>
-        <w:rPr>
-          <w:b/>
-          <w:bCs/>
-        </w:rPr>
-        <w:t xml:space="preserve"> In one line:</w:t>
-      </w:r>
-    </w:p>
-    <w:p>
-      <w:r>
-        <w:t xml:space="preserve">Pe’er &amp; Ryde (2011) showed that the photosphere of a </w:t>
-      </w:r>
-      <w:proofErr w:type="spellStart"/>
-      <w:r>
-        <w:t>relativistically</w:t>
-      </w:r>
-      <w:proofErr w:type="spellEnd"/>
-      <w:r>
-        <w:t xml:space="preserve"> expanding GRB outflow produces a </w:t>
-      </w:r>
-      <w:r>
-        <w:rPr>
-          <w:b/>
-          <w:bCs/>
-        </w:rPr>
-        <w:t>multi-color blackbody spectrum</w:t>
-      </w:r>
-      <w:r>
-        <w:t xml:space="preserve"> — broader and flatter than a single Planck function — simply due to angular and Doppler effects, naturally explaining the thermal-like components seen in GRBs.</w:t>
-      </w:r>
-    </w:p>
-    <w:p>
       <w:r>
         <w:br w:type="page"/>
       </w:r>
@@ -2202,7 +1411,7 @@
     <w:p>
       <w:r>
         <w:pict w14:anchorId="73EEE44A">
-          <v:rect id="_x0000_i1026" style="width:0;height:1.5pt" o:hralign="center" o:hrstd="t" o:hr="t" fillcolor="#a0a0a0" stroked="f"/>
+          <v:rect id="_x0000_i1025" style="width:0;height:1.5pt" o:hralign="center" o:hrstd="t" o:hr="t" fillcolor="#a0a0a0" stroked="f"/>
         </w:pict>
       </w:r>
     </w:p>
@@ -4385,6 +3594,1873 @@
       </w:tr>
     </w:tbl>
     <w:p/>
+    <w:p>
+      <w:r>
+        <w:br w:type="page"/>
+      </w:r>
+    </w:p>
+    <w:p>
+      <w:pPr>
+        <w:rPr>
+          <w:b/>
+          <w:bCs/>
+        </w:rPr>
+      </w:pPr>
+      <w:r>
+        <w:rPr>
+          <w:b/>
+          <w:bCs/>
+        </w:rPr>
+        <w:lastRenderedPageBreak/>
+        <w:t>Detailed Summary of Band et al. (1993)</w:t>
+      </w:r>
+    </w:p>
+    <w:p>
+      <w:pPr>
+        <w:rPr>
+          <w:b/>
+          <w:bCs/>
+        </w:rPr>
+      </w:pPr>
+      <w:r>
+        <w:rPr>
+          <w:b/>
+          <w:bCs/>
+          <w:i/>
+          <w:iCs/>
+        </w:rPr>
+        <w:t>BATSE Observations of Gamma-Ray Burst Spectra. I. Spectral Diversity</w:t>
+      </w:r>
+    </w:p>
+    <w:p>
+      <w:r>
+        <w:pict w14:anchorId="4D1B4159">
+          <v:rect id="_x0000_i1050" style="width:0;height:1.5pt" o:hralign="center" o:hrstd="t" o:hr="t" fillcolor="#a0a0a0" stroked="f"/>
+        </w:pict>
+      </w:r>
+    </w:p>
+    <w:p>
+      <w:pPr>
+        <w:rPr>
+          <w:b/>
+          <w:bCs/>
+        </w:rPr>
+      </w:pPr>
+      <w:r>
+        <w:rPr>
+          <w:rFonts w:ascii="Segoe UI Emoji" w:hAnsi="Segoe UI Emoji" w:cs="Segoe UI Emoji"/>
+          <w:b/>
+          <w:bCs/>
+        </w:rPr>
+        <w:t>🔹</w:t>
+      </w:r>
+      <w:r>
+        <w:rPr>
+          <w:b/>
+          <w:bCs/>
+        </w:rPr>
+        <w:t xml:space="preserve"> 1. Motivation &amp; Background</w:t>
+      </w:r>
+    </w:p>
+    <w:p>
+      <w:r>
+        <w:t>Before BATSE (on the Compton Gamma-Ray Observatory), GRB spectra were studied by earlier detectors such as IMP 6–7, Venera/</w:t>
+      </w:r>
+      <w:proofErr w:type="spellStart"/>
+      <w:r>
+        <w:t>Konus</w:t>
+      </w:r>
+      <w:proofErr w:type="spellEnd"/>
+      <w:r>
+        <w:t>, and SMM, but those instruments had:</w:t>
+      </w:r>
+    </w:p>
+    <w:p>
+      <w:pPr>
+        <w:numPr>
+          <w:ilvl w:val="0"/>
+          <w:numId w:val="6"/>
+        </w:numPr>
+      </w:pPr>
+      <w:r>
+        <w:t>limited energy coverage,</w:t>
+      </w:r>
+    </w:p>
+    <w:p>
+      <w:pPr>
+        <w:numPr>
+          <w:ilvl w:val="0"/>
+          <w:numId w:val="6"/>
+        </w:numPr>
+      </w:pPr>
+      <w:r>
+        <w:t>few spectral channels, and</w:t>
+      </w:r>
+    </w:p>
+    <w:p>
+      <w:pPr>
+        <w:numPr>
+          <w:ilvl w:val="0"/>
+          <w:numId w:val="6"/>
+        </w:numPr>
+      </w:pPr>
+      <w:r>
+        <w:t>large uncertainties.</w:t>
+      </w:r>
+    </w:p>
+    <w:p>
+      <w:r>
+        <w:t xml:space="preserve">Earlier missions found GRB spectra could often be described by a </w:t>
+      </w:r>
+      <w:r>
+        <w:rPr>
+          <w:b/>
+          <w:bCs/>
+        </w:rPr>
+        <w:t>power law with an exponential cutoff</w:t>
+      </w:r>
+      <w:r>
+        <w:t xml:space="preserve"> (like a </w:t>
+      </w:r>
+      <w:proofErr w:type="spellStart"/>
+      <w:r>
+        <w:t>Comptonized</w:t>
+      </w:r>
+      <w:proofErr w:type="spellEnd"/>
+      <w:r>
+        <w:t xml:space="preserve"> or CPL model).</w:t>
+      </w:r>
+      <w:r>
+        <w:br/>
+        <w:t xml:space="preserve">However, with BATSE’s broad 30 keV – 2 MeV range, it became possible to analyze GRB spectra </w:t>
+      </w:r>
+      <w:r>
+        <w:rPr>
+          <w:b/>
+          <w:bCs/>
+        </w:rPr>
+        <w:t>with much higher accuracy</w:t>
+      </w:r>
+      <w:r>
+        <w:t xml:space="preserve"> and identify </w:t>
+      </w:r>
+      <w:r>
+        <w:rPr>
+          <w:b/>
+          <w:bCs/>
+        </w:rPr>
+        <w:t>true spectral diversity</w:t>
+      </w:r>
+      <w:r>
+        <w:t>.</w:t>
+      </w:r>
+    </w:p>
+    <w:p>
+      <w:r>
+        <w:t>The authors aimed to:</w:t>
+      </w:r>
+    </w:p>
+    <w:p>
+      <w:pPr>
+        <w:numPr>
+          <w:ilvl w:val="0"/>
+          <w:numId w:val="7"/>
+        </w:numPr>
+      </w:pPr>
+      <w:r>
+        <w:t>characterize the shapes of GRB prompt emission spectra,</w:t>
+      </w:r>
+    </w:p>
+    <w:p>
+      <w:pPr>
+        <w:numPr>
+          <w:ilvl w:val="0"/>
+          <w:numId w:val="7"/>
+        </w:numPr>
+      </w:pPr>
+      <w:r>
+        <w:t>determine typical parameter ranges,</w:t>
+      </w:r>
+    </w:p>
+    <w:p>
+      <w:pPr>
+        <w:numPr>
+          <w:ilvl w:val="0"/>
+          <w:numId w:val="7"/>
+        </w:numPr>
+      </w:pPr>
+      <w:r>
+        <w:t>test empirical fitting models, and</w:t>
+      </w:r>
+    </w:p>
+    <w:p>
+      <w:pPr>
+        <w:numPr>
+          <w:ilvl w:val="0"/>
+          <w:numId w:val="7"/>
+        </w:numPr>
+      </w:pPr>
+      <w:r>
+        <w:t>understand the physical meaning of these parameters.</w:t>
+      </w:r>
+    </w:p>
+    <w:p>
+      <w:r>
+        <w:pict w14:anchorId="29A6CF0C">
+          <v:rect id="_x0000_i1051" style="width:0;height:1.5pt" o:hralign="center" o:hrstd="t" o:hr="t" fillcolor="#a0a0a0" stroked="f"/>
+        </w:pict>
+      </w:r>
+    </w:p>
+    <w:p>
+      <w:pPr>
+        <w:rPr>
+          <w:b/>
+          <w:bCs/>
+        </w:rPr>
+      </w:pPr>
+      <w:r>
+        <w:rPr>
+          <w:rFonts w:ascii="Segoe UI Emoji" w:hAnsi="Segoe UI Emoji" w:cs="Segoe UI Emoji"/>
+          <w:b/>
+          <w:bCs/>
+        </w:rPr>
+        <w:t>🔹</w:t>
+      </w:r>
+      <w:r>
+        <w:rPr>
+          <w:b/>
+          <w:bCs/>
+        </w:rPr>
+        <w:t xml:space="preserve"> 2. Instrument &amp; Data</w:t>
+      </w:r>
+    </w:p>
+    <w:p>
+      <w:pPr>
+        <w:numPr>
+          <w:ilvl w:val="0"/>
+          <w:numId w:val="8"/>
+        </w:numPr>
+      </w:pPr>
+      <w:r>
+        <w:rPr>
+          <w:b/>
+          <w:bCs/>
+        </w:rPr>
+        <w:t>BATSE</w:t>
+      </w:r>
+      <w:r>
+        <w:t xml:space="preserve"> had 8 </w:t>
+      </w:r>
+      <w:r>
+        <w:rPr>
+          <w:i/>
+          <w:iCs/>
+        </w:rPr>
+        <w:t>Large Area Detectors</w:t>
+      </w:r>
+      <w:r>
+        <w:t xml:space="preserve"> (LADs) for detecting GRBs in the energy range </w:t>
+      </w:r>
+      <w:r>
+        <w:rPr>
+          <w:rFonts w:ascii="Cambria Math" w:hAnsi="Cambria Math" w:cs="Cambria Math"/>
+          <w:b/>
+          <w:bCs/>
+        </w:rPr>
+        <w:t>∼</w:t>
+      </w:r>
+      <w:r>
+        <w:rPr>
+          <w:b/>
+          <w:bCs/>
+        </w:rPr>
+        <w:t xml:space="preserve">30 keV </w:t>
+      </w:r>
+      <w:r>
+        <w:rPr>
+          <w:rFonts w:ascii="Calibri" w:hAnsi="Calibri" w:cs="Calibri"/>
+          <w:b/>
+          <w:bCs/>
+        </w:rPr>
+        <w:t>–</w:t>
+      </w:r>
+      <w:r>
+        <w:rPr>
+          <w:b/>
+          <w:bCs/>
+        </w:rPr>
+        <w:t xml:space="preserve"> 2 MeV</w:t>
+      </w:r>
+      <w:r>
+        <w:t>.</w:t>
+      </w:r>
+    </w:p>
+    <w:p>
+      <w:pPr>
+        <w:numPr>
+          <w:ilvl w:val="0"/>
+          <w:numId w:val="8"/>
+        </w:numPr>
+      </w:pPr>
+      <w:r>
+        <w:t xml:space="preserve">The </w:t>
+      </w:r>
+      <w:r>
+        <w:rPr>
+          <w:b/>
+          <w:bCs/>
+        </w:rPr>
+        <w:t>Spectroscopy Detectors (SDs)</w:t>
+      </w:r>
+      <w:r>
+        <w:t xml:space="preserve"> (or SHERB data mode) provided high-resolution spectra.</w:t>
+      </w:r>
+    </w:p>
+    <w:p>
+      <w:r>
+        <w:t xml:space="preserve">They used </w:t>
+      </w:r>
+      <w:r>
+        <w:rPr>
+          <w:b/>
+          <w:bCs/>
+        </w:rPr>
+        <w:t>spectra accumulated before, during, and after</w:t>
+      </w:r>
+      <w:r>
+        <w:t xml:space="preserve"> bursts to subtract background and isolate true GRB counts.</w:t>
+      </w:r>
+    </w:p>
+    <w:p>
+      <w:r>
+        <w:pict w14:anchorId="7F61BF6B">
+          <v:rect id="_x0000_i1052" style="width:0;height:1.5pt" o:hralign="center" o:hrstd="t" o:hr="t" fillcolor="#a0a0a0" stroked="f"/>
+        </w:pict>
+      </w:r>
+    </w:p>
+    <w:p>
+      <w:pPr>
+        <w:rPr>
+          <w:b/>
+          <w:bCs/>
+        </w:rPr>
+      </w:pPr>
+      <w:r>
+        <w:rPr>
+          <w:rFonts w:ascii="Segoe UI Emoji" w:hAnsi="Segoe UI Emoji" w:cs="Segoe UI Emoji"/>
+          <w:b/>
+          <w:bCs/>
+        </w:rPr>
+        <w:t>🔹</w:t>
+      </w:r>
+      <w:r>
+        <w:rPr>
+          <w:b/>
+          <w:bCs/>
+        </w:rPr>
+        <w:t xml:space="preserve"> 3. Background Subtraction</w:t>
+      </w:r>
+    </w:p>
+    <w:p>
+      <w:pPr>
+        <w:numPr>
+          <w:ilvl w:val="0"/>
+          <w:numId w:val="9"/>
+        </w:numPr>
+      </w:pPr>
+      <w:r>
+        <w:lastRenderedPageBreak/>
+        <w:t xml:space="preserve">Background spectra were derived by interpolating data from </w:t>
+      </w:r>
+      <w:r>
+        <w:rPr>
+          <w:b/>
+          <w:bCs/>
+        </w:rPr>
+        <w:t>~1000–2000 s before and after</w:t>
+      </w:r>
+      <w:r>
+        <w:t xml:space="preserve"> each burst.</w:t>
+      </w:r>
+    </w:p>
+    <w:p>
+      <w:pPr>
+        <w:numPr>
+          <w:ilvl w:val="0"/>
+          <w:numId w:val="9"/>
+        </w:numPr>
+      </w:pPr>
+      <w:r>
+        <w:t xml:space="preserve">Each energy channel’s background was fit over time using a </w:t>
+      </w:r>
+      <w:r>
+        <w:rPr>
+          <w:b/>
+          <w:bCs/>
+        </w:rPr>
+        <w:t>cubic polynomial</w:t>
+      </w:r>
+      <w:r>
+        <w:t xml:space="preserve"> (or a simpler fit if background was steady).</w:t>
+      </w:r>
+    </w:p>
+    <w:p>
+      <w:pPr>
+        <w:numPr>
+          <w:ilvl w:val="0"/>
+          <w:numId w:val="9"/>
+        </w:numPr>
+      </w:pPr>
+      <w:r>
+        <w:t>This provided a background model at the exact burst time.</w:t>
+      </w:r>
+    </w:p>
+    <w:p>
+      <w:pPr>
+        <w:numPr>
+          <w:ilvl w:val="0"/>
+          <w:numId w:val="9"/>
+        </w:numPr>
+      </w:pPr>
+      <w:r>
+        <w:t>Bursts with unstable or poorly modeled backgrounds were excluded.</w:t>
+      </w:r>
+    </w:p>
+    <w:p>
+      <w:r>
+        <w:t>This ensured accurate subtraction — crucial for obtaining reliable spectral shapes.</w:t>
+      </w:r>
+    </w:p>
+    <w:p>
+      <w:r>
+        <w:pict w14:anchorId="63F977AF">
+          <v:rect id="_x0000_i1053" style="width:0;height:1.5pt" o:hralign="center" o:hrstd="t" o:hr="t" fillcolor="#a0a0a0" stroked="f"/>
+        </w:pict>
+      </w:r>
+    </w:p>
+    <w:p>
+      <w:pPr>
+        <w:rPr>
+          <w:b/>
+          <w:bCs/>
+        </w:rPr>
+      </w:pPr>
+      <w:r>
+        <w:rPr>
+          <w:rFonts w:ascii="Segoe UI Emoji" w:hAnsi="Segoe UI Emoji" w:cs="Segoe UI Emoji"/>
+          <w:b/>
+          <w:bCs/>
+        </w:rPr>
+        <w:t>🔹</w:t>
+      </w:r>
+      <w:r>
+        <w:rPr>
+          <w:b/>
+          <w:bCs/>
+        </w:rPr>
+        <w:t xml:space="preserve"> 4. Burst Sample</w:t>
+      </w:r>
+    </w:p>
+    <w:p>
+      <w:pPr>
+        <w:numPr>
+          <w:ilvl w:val="0"/>
+          <w:numId w:val="10"/>
+        </w:numPr>
+      </w:pPr>
+      <w:r>
+        <w:t xml:space="preserve">The final analyzed set contained </w:t>
+      </w:r>
+      <w:r>
+        <w:rPr>
+          <w:b/>
+          <w:bCs/>
+        </w:rPr>
+        <w:t>54 GRBs</w:t>
+      </w:r>
+      <w:r>
+        <w:t xml:space="preserve"> (Table 1).</w:t>
+      </w:r>
+    </w:p>
+    <w:p>
+      <w:pPr>
+        <w:numPr>
+          <w:ilvl w:val="0"/>
+          <w:numId w:val="10"/>
+        </w:numPr>
+      </w:pPr>
+      <w:r>
+        <w:t xml:space="preserve">Selected mainly for </w:t>
+      </w:r>
+      <w:r>
+        <w:rPr>
+          <w:b/>
+          <w:bCs/>
+        </w:rPr>
+        <w:t>brightness</w:t>
+      </w:r>
+      <w:r>
+        <w:t xml:space="preserve">: bursts with </w:t>
+      </w:r>
+      <w:r>
+        <w:rPr>
+          <w:b/>
+          <w:bCs/>
+        </w:rPr>
+        <w:t>peak count rate &gt; 10 000 counts s⁻¹</w:t>
+      </w:r>
+      <w:r>
+        <w:t xml:space="preserve"> above background (in 64 </w:t>
+      </w:r>
+      <w:proofErr w:type="spellStart"/>
+      <w:r>
+        <w:t>ms</w:t>
+      </w:r>
+      <w:proofErr w:type="spellEnd"/>
+      <w:r>
+        <w:t xml:space="preserve"> bins).</w:t>
+      </w:r>
+    </w:p>
+    <w:p>
+      <w:pPr>
+        <w:numPr>
+          <w:ilvl w:val="0"/>
+          <w:numId w:val="10"/>
+        </w:numPr>
+      </w:pPr>
+      <w:r>
+        <w:t>Weak or short bursts were mostly excluded (due to limited SHERB sensitivity).</w:t>
+      </w:r>
+    </w:p>
+    <w:p>
+      <w:pPr>
+        <w:numPr>
+          <w:ilvl w:val="0"/>
+          <w:numId w:val="10"/>
+        </w:numPr>
+      </w:pPr>
+      <w:r>
+        <w:t xml:space="preserve">Sample not perfectly uniform but </w:t>
+      </w:r>
+      <w:r>
+        <w:rPr>
+          <w:b/>
+          <w:bCs/>
+        </w:rPr>
+        <w:t>“effectively complete”</w:t>
+      </w:r>
+      <w:r>
+        <w:t xml:space="preserve"> for bright bursts up to May 1992.</w:t>
+      </w:r>
+    </w:p>
+    <w:p>
+      <w:r>
+        <w:t>Each burst’s entry includes:</w:t>
+      </w:r>
+    </w:p>
+    <w:p>
+      <w:pPr>
+        <w:numPr>
+          <w:ilvl w:val="0"/>
+          <w:numId w:val="11"/>
+        </w:numPr>
+      </w:pPr>
+      <w:r>
+        <w:t>detector number used,</w:t>
+      </w:r>
+    </w:p>
+    <w:p>
+      <w:pPr>
+        <w:numPr>
+          <w:ilvl w:val="0"/>
+          <w:numId w:val="11"/>
+        </w:numPr>
+      </w:pPr>
+      <w:r>
+        <w:t>low/high energy range (E₁–E₂),</w:t>
+      </w:r>
+    </w:p>
+    <w:p>
+      <w:pPr>
+        <w:numPr>
+          <w:ilvl w:val="0"/>
+          <w:numId w:val="11"/>
+        </w:numPr>
+      </w:pPr>
+      <w:r>
+        <w:t>energy of last channel with S/N &gt; 3 (E3σ),</w:t>
+      </w:r>
+    </w:p>
+    <w:p>
+      <w:pPr>
+        <w:numPr>
+          <w:ilvl w:val="0"/>
+          <w:numId w:val="11"/>
+        </w:numPr>
+      </w:pPr>
+      <w:r>
+        <w:t>integration duration,</w:t>
+      </w:r>
+    </w:p>
+    <w:p>
+      <w:pPr>
+        <w:numPr>
+          <w:ilvl w:val="0"/>
+          <w:numId w:val="11"/>
+        </w:numPr>
+      </w:pPr>
+      <w:r>
+        <w:t>morphological class:</w:t>
+      </w:r>
+    </w:p>
+    <w:p>
+      <w:pPr>
+        <w:numPr>
+          <w:ilvl w:val="1"/>
+          <w:numId w:val="11"/>
+        </w:numPr>
+      </w:pPr>
+      <w:r>
+        <w:rPr>
+          <w:b/>
+          <w:bCs/>
+        </w:rPr>
+        <w:t>C</w:t>
+      </w:r>
+      <w:r>
+        <w:t xml:space="preserve"> = complex/multi-peaked,</w:t>
+      </w:r>
+    </w:p>
+    <w:p>
+      <w:pPr>
+        <w:numPr>
+          <w:ilvl w:val="1"/>
+          <w:numId w:val="11"/>
+        </w:numPr>
+      </w:pPr>
+      <w:r>
+        <w:rPr>
+          <w:b/>
+          <w:bCs/>
+        </w:rPr>
+        <w:t>S</w:t>
+      </w:r>
+      <w:r>
+        <w:t xml:space="preserve"> = single-pulsed.</w:t>
+      </w:r>
+    </w:p>
+    <w:p>
+      <w:r>
+        <w:lastRenderedPageBreak/>
+        <w:drawing>
+          <wp:anchor distT="0" distB="0" distL="114300" distR="114300" simplePos="0" relativeHeight="251658240" behindDoc="1" locked="0" layoutInCell="1" allowOverlap="1" wp14:anchorId="698C14B5" wp14:editId="10C67B1F">
+            <wp:simplePos x="0" y="0"/>
+            <wp:positionH relativeFrom="column">
+              <wp:posOffset>495300</wp:posOffset>
+            </wp:positionH>
+            <wp:positionV relativeFrom="paragraph">
+              <wp:posOffset>0</wp:posOffset>
+            </wp:positionV>
+            <wp:extent cx="5943600" cy="3421380"/>
+            <wp:effectExtent l="0" t="0" r="0" b="7620"/>
+            <wp:wrapTight wrapText="bothSides">
+              <wp:wrapPolygon edited="0">
+                <wp:start x="0" y="0"/>
+                <wp:lineTo x="0" y="21528"/>
+                <wp:lineTo x="21531" y="21528"/>
+                <wp:lineTo x="21531" y="0"/>
+                <wp:lineTo x="0" y="0"/>
+              </wp:wrapPolygon>
+            </wp:wrapTight>
+            <wp:docPr id="940535748" name="Picture 1"/>
+            <wp:cNvGraphicFramePr>
+              <a:graphicFrameLocks xmlns:a="http://schemas.openxmlformats.org/drawingml/2006/main" noChangeAspect="1"/>
+            </wp:cNvGraphicFramePr>
+            <a:graphic xmlns:a="http://schemas.openxmlformats.org/drawingml/2006/main">
+              <a:graphicData uri="http://schemas.openxmlformats.org/drawingml/2006/picture">
+                <pic:pic xmlns:pic="http://schemas.openxmlformats.org/drawingml/2006/picture">
+                  <pic:nvPicPr>
+                    <pic:cNvPr id="940535748" name=""/>
+                    <pic:cNvPicPr/>
+                  </pic:nvPicPr>
+                  <pic:blipFill>
+                    <a:blip r:embed="rId5">
+                      <a:extLst>
+                        <a:ext uri="{28A0092B-C50C-407E-A947-70E740481C1C}">
+                          <a14:useLocalDpi xmlns:a14="http://schemas.microsoft.com/office/drawing/2010/main" val="0"/>
+                        </a:ext>
+                      </a:extLst>
+                    </a:blip>
+                    <a:stretch>
+                      <a:fillRect/>
+                    </a:stretch>
+                  </pic:blipFill>
+                  <pic:spPr>
+                    <a:xfrm>
+                      <a:off x="0" y="0"/>
+                      <a:ext cx="5943600" cy="3421380"/>
+                    </a:xfrm>
+                    <a:prstGeom prst="rect">
+                      <a:avLst/>
+                    </a:prstGeom>
+                  </pic:spPr>
+                </pic:pic>
+              </a:graphicData>
+            </a:graphic>
+          </wp:anchor>
+        </w:drawing>
+      </w:r>
+    </w:p>
+    <w:p/>
+    <w:p/>
+    <w:p/>
+    <w:p/>
+    <w:p/>
+    <w:p/>
+    <w:p/>
+    <w:p/>
+    <w:p/>
+    <w:p/>
+    <w:p/>
+    <w:p>
+      <w:pPr>
+        <w:rPr>
+          <w:b/>
+          <w:bCs/>
+        </w:rPr>
+      </w:pPr>
+      <w:r>
+        <w:rPr>
+          <w:b/>
+          <w:bCs/>
+        </w:rPr>
+        <w:t>6. Data Analysis &amp; Fitting</w:t>
+      </w:r>
+    </w:p>
+    <w:p>
+      <w:r>
+        <w:t>They used:</w:t>
+      </w:r>
+    </w:p>
+    <w:p>
+      <w:pPr>
+        <w:numPr>
+          <w:ilvl w:val="0"/>
+          <w:numId w:val="12"/>
+        </w:numPr>
+      </w:pPr>
+      <w:r>
+        <w:rPr>
+          <w:b/>
+          <w:bCs/>
+        </w:rPr>
+        <w:t>CURFIT</w:t>
+      </w:r>
+      <w:r>
+        <w:t xml:space="preserve"> (Bevington 1969) for </w:t>
+      </w:r>
+      <w:r>
+        <w:rPr>
+          <w:b/>
+          <w:bCs/>
+        </w:rPr>
+        <w:t>χ² minimization</w:t>
+      </w:r>
+      <w:r>
+        <w:t>,</w:t>
+      </w:r>
+    </w:p>
+    <w:p>
+      <w:pPr>
+        <w:numPr>
+          <w:ilvl w:val="0"/>
+          <w:numId w:val="12"/>
+        </w:numPr>
+      </w:pPr>
+      <w:r>
+        <w:t>justified Gaussian statistics (since counts per bin were large),</w:t>
+      </w:r>
+    </w:p>
+    <w:p>
+      <w:pPr>
+        <w:numPr>
+          <w:ilvl w:val="0"/>
+          <w:numId w:val="12"/>
+        </w:numPr>
+      </w:pPr>
+      <w:r>
+        <w:t xml:space="preserve">the </w:t>
+      </w:r>
+      <w:r>
+        <w:rPr>
+          <w:b/>
+          <w:bCs/>
+        </w:rPr>
+        <w:t>Burst Spectral Analysis Software (BSAS)</w:t>
+      </w:r>
+      <w:r>
+        <w:t xml:space="preserve"> (Schaefer 1991) for pipeline fitting.</w:t>
+      </w:r>
+    </w:p>
+    <w:p>
+      <w:r>
+        <w:t xml:space="preserve">They required good fits with </w:t>
+      </w:r>
+      <w:r>
+        <w:rPr>
+          <w:b/>
+          <w:bCs/>
+        </w:rPr>
+        <w:t>χ²/ν ≈ 1</w:t>
+      </w:r>
+      <w:r>
+        <w:t xml:space="preserve"> (ν = degrees of freedom).</w:t>
+      </w:r>
+    </w:p>
+    <w:p>
+      <w:r>
+        <w:pict w14:anchorId="67D57914">
+          <v:rect id="_x0000_i1070" style="width:0;height:1.5pt" o:hralign="center" o:hrstd="t" o:hr="t" fillcolor="#a0a0a0" stroked="f"/>
+        </w:pict>
+      </w:r>
+    </w:p>
+    <w:p>
+      <w:pPr>
+        <w:rPr>
+          <w:b/>
+          <w:bCs/>
+        </w:rPr>
+      </w:pPr>
+      <w:r>
+        <w:rPr>
+          <w:rFonts w:ascii="Segoe UI Emoji" w:hAnsi="Segoe UI Emoji" w:cs="Segoe UI Emoji"/>
+          <w:b/>
+          <w:bCs/>
+        </w:rPr>
+        <w:t>🔹</w:t>
+      </w:r>
+      <w:r>
+        <w:rPr>
+          <w:b/>
+          <w:bCs/>
+        </w:rPr>
+        <w:t xml:space="preserve"> 7. Simulation Tests (Validation)</w:t>
+      </w:r>
+    </w:p>
+    <w:p>
+      <w:r>
+        <w:t>Before interpreting real spectra, the team tested the robustness of their fitting approach.</w:t>
+      </w:r>
+    </w:p>
+    <w:p>
+      <w:pPr>
+        <w:rPr>
+          <w:b/>
+          <w:bCs/>
+        </w:rPr>
+      </w:pPr>
+      <w:r>
+        <w:rPr>
+          <w:b/>
+          <w:bCs/>
+        </w:rPr>
+        <w:t>Steps:</w:t>
+      </w:r>
+    </w:p>
+    <w:p>
+      <w:pPr>
+        <w:numPr>
+          <w:ilvl w:val="0"/>
+          <w:numId w:val="13"/>
+        </w:numPr>
+      </w:pPr>
+      <w:r>
+        <w:t>Simulated count spectra from a known Band function (α = –0.5, β = –2, E₀ = 300 keV).</w:t>
+      </w:r>
+    </w:p>
+    <w:p>
+      <w:pPr>
+        <w:numPr>
+          <w:ilvl w:val="0"/>
+          <w:numId w:val="13"/>
+        </w:numPr>
+      </w:pPr>
+      <w:r>
+        <w:t>Added Poisson/Gaussian noise and optional background.</w:t>
+      </w:r>
+    </w:p>
+    <w:p>
+      <w:pPr>
+        <w:numPr>
+          <w:ilvl w:val="0"/>
+          <w:numId w:val="13"/>
+        </w:numPr>
+      </w:pPr>
+      <w:r>
+        <w:t>Fit them with:</w:t>
+      </w:r>
+    </w:p>
+    <w:p>
+      <w:pPr>
+        <w:numPr>
+          <w:ilvl w:val="1"/>
+          <w:numId w:val="13"/>
+        </w:numPr>
+      </w:pPr>
+      <w:r>
+        <w:rPr>
+          <w:b/>
+          <w:bCs/>
+        </w:rPr>
+        <w:t>the same 4-parameter Band model</w:t>
+      </w:r>
+      <w:r>
+        <w:t>, and</w:t>
+      </w:r>
+    </w:p>
+    <w:p>
+      <w:pPr>
+        <w:numPr>
+          <w:ilvl w:val="1"/>
+          <w:numId w:val="13"/>
+        </w:numPr>
+      </w:pPr>
+      <w:r>
+        <w:rPr>
+          <w:b/>
+          <w:bCs/>
+        </w:rPr>
+        <w:lastRenderedPageBreak/>
+        <w:t>a simpler 3-parameter cutoff power law (no β)</w:t>
+      </w:r>
+      <w:r>
+        <w:t>.</w:t>
+      </w:r>
+    </w:p>
+    <w:p>
+      <w:pPr>
+        <w:rPr>
+          <w:b/>
+          <w:bCs/>
+        </w:rPr>
+      </w:pPr>
+      <w:r>
+        <w:rPr>
+          <w:b/>
+          <w:bCs/>
+        </w:rPr>
+        <w:t>Results:</w:t>
+      </w:r>
+    </w:p>
+    <w:p>
+      <w:pPr>
+        <w:numPr>
+          <w:ilvl w:val="0"/>
+          <w:numId w:val="14"/>
+        </w:numPr>
+      </w:pPr>
+      <w:r>
+        <w:rPr>
+          <w:rFonts w:ascii="Segoe UI Emoji" w:hAnsi="Segoe UI Emoji" w:cs="Segoe UI Emoji"/>
+        </w:rPr>
+        <w:t>✅</w:t>
+      </w:r>
+      <w:r>
+        <w:t xml:space="preserve"> </w:t>
+      </w:r>
+      <w:r>
+        <w:rPr>
+          <w:b/>
+          <w:bCs/>
+        </w:rPr>
+        <w:t>When model = true model</w:t>
+      </w:r>
+      <w:r>
+        <w:t xml:space="preserve"> → parameters recovered accurately; χ² ≈ 1.</w:t>
+      </w:r>
+    </w:p>
+    <w:p>
+      <w:pPr>
+        <w:numPr>
+          <w:ilvl w:val="0"/>
+          <w:numId w:val="14"/>
+        </w:numPr>
+      </w:pPr>
+      <w:r>
+        <w:rPr>
+          <w:rFonts w:ascii="Segoe UI Emoji" w:hAnsi="Segoe UI Emoji" w:cs="Segoe UI Emoji"/>
+        </w:rPr>
+        <w:t>⚠️</w:t>
+      </w:r>
+      <w:r>
+        <w:t xml:space="preserve"> </w:t>
+      </w:r>
+      <w:r>
+        <w:rPr>
+          <w:b/>
+          <w:bCs/>
+        </w:rPr>
+        <w:t>When model is simpler (no β)</w:t>
+      </w:r>
+      <w:r>
+        <w:t xml:space="preserve"> → systematic bias:</w:t>
+      </w:r>
+    </w:p>
+    <w:p>
+      <w:pPr>
+        <w:numPr>
+          <w:ilvl w:val="1"/>
+          <w:numId w:val="14"/>
+        </w:numPr>
+      </w:pPr>
+      <w:r>
+        <w:t xml:space="preserve">α becomes </w:t>
+      </w:r>
+      <w:r>
+        <w:rPr>
+          <w:b/>
+          <w:bCs/>
+        </w:rPr>
+        <w:t>softer</w:t>
+      </w:r>
+      <w:r>
+        <w:t xml:space="preserve"> (~ –0.7 instead of –0.5)</w:t>
+      </w:r>
+    </w:p>
+    <w:p>
+      <w:pPr>
+        <w:numPr>
+          <w:ilvl w:val="1"/>
+          <w:numId w:val="14"/>
+        </w:numPr>
+      </w:pPr>
+      <w:r>
+        <w:t xml:space="preserve">E₀ becomes </w:t>
+      </w:r>
+      <w:r>
+        <w:rPr>
+          <w:b/>
+          <w:bCs/>
+        </w:rPr>
+        <w:t>higher</w:t>
+      </w:r>
+      <w:r>
+        <w:t xml:space="preserve"> (~ 480 keV instead of 300 keV).</w:t>
+      </w:r>
+    </w:p>
+    <w:p>
+      <w:pPr>
+        <w:numPr>
+          <w:ilvl w:val="1"/>
+          <w:numId w:val="14"/>
+        </w:numPr>
+      </w:pPr>
+      <w:r>
+        <w:t>Because without a high-energy tail, the exponential cutoff shifts upward to mimic it.</w:t>
+      </w:r>
+    </w:p>
+    <w:p>
+      <w:pPr>
+        <w:numPr>
+          <w:ilvl w:val="0"/>
+          <w:numId w:val="14"/>
+        </w:numPr>
+      </w:pPr>
+      <w:r>
+        <w:rPr>
+          <w:b/>
+          <w:bCs/>
+        </w:rPr>
+        <w:t>Lower S/N</w:t>
+      </w:r>
+      <w:r>
+        <w:t xml:space="preserve"> increases scatter but not systematic bias — fits remain statistically valid.</w:t>
+      </w:r>
+    </w:p>
+    <w:p>
+      <w:pPr>
+        <w:numPr>
+          <w:ilvl w:val="0"/>
+          <w:numId w:val="14"/>
+        </w:numPr>
+      </w:pPr>
+      <w:r>
+        <w:t xml:space="preserve">The correlation between α and E₀ forms a </w:t>
+      </w:r>
+      <w:r>
+        <w:rPr>
+          <w:b/>
+          <w:bCs/>
+        </w:rPr>
+        <w:t>thin, crescent-shaped locus</w:t>
+      </w:r>
+      <w:r>
+        <w:t xml:space="preserve"> — they vary together to preserve the overall curvature.</w:t>
+      </w:r>
+    </w:p>
+    <w:p>
+      <w:r>
+        <w:t xml:space="preserve">This explains why α and E₀ confidence regions are always </w:t>
+      </w:r>
+      <w:r>
+        <w:rPr>
+          <w:b/>
+          <w:bCs/>
+        </w:rPr>
+        <w:t>strongly correlated</w:t>
+      </w:r>
+      <w:r>
+        <w:t xml:space="preserve"> in real GRB data.</w:t>
+      </w:r>
+    </w:p>
+    <w:p>
+      <w:r>
+        <w:pict w14:anchorId="0392F020">
+          <v:rect id="_x0000_i1071" style="width:0;height:1.5pt" o:hralign="center" o:hrstd="t" o:hr="t" fillcolor="#a0a0a0" stroked="f"/>
+        </w:pict>
+      </w:r>
+    </w:p>
+    <w:p>
+      <w:pPr>
+        <w:rPr>
+          <w:b/>
+          <w:bCs/>
+        </w:rPr>
+      </w:pPr>
+      <w:r>
+        <w:rPr>
+          <w:rFonts w:ascii="Segoe UI Emoji" w:hAnsi="Segoe UI Emoji" w:cs="Segoe UI Emoji"/>
+          <w:b/>
+          <w:bCs/>
+        </w:rPr>
+        <w:t>🔹</w:t>
+      </w:r>
+      <w:r>
+        <w:rPr>
+          <w:b/>
+          <w:bCs/>
+        </w:rPr>
+        <w:t xml:space="preserve"> 8. Figure 3 (Correlation of α and E₀)</w:t>
+      </w:r>
+    </w:p>
+    <w:p>
+      <w:pPr>
+        <w:numPr>
+          <w:ilvl w:val="0"/>
+          <w:numId w:val="15"/>
+        </w:numPr>
+      </w:pPr>
+      <w:r>
+        <w:t>1000 simulated spectra show a strong anticorrelation (r = –0.93).</w:t>
+      </w:r>
+    </w:p>
+    <w:p>
+      <w:pPr>
+        <w:numPr>
+          <w:ilvl w:val="0"/>
+          <w:numId w:val="15"/>
+        </w:numPr>
+      </w:pPr>
+      <w:r>
+        <w:t>When E₀ shifts up, α shifts down (softer), and vice versa.</w:t>
+      </w:r>
+    </w:p>
+    <w:p>
+      <w:pPr>
+        <w:numPr>
+          <w:ilvl w:val="0"/>
+          <w:numId w:val="15"/>
+        </w:numPr>
+      </w:pPr>
+      <w:r>
+        <w:t>The fit remains good because these compensating changes preserve the spectral shape.</w:t>
+      </w:r>
+    </w:p>
+    <w:p>
+      <w:pPr>
+        <w:numPr>
+          <w:ilvl w:val="0"/>
+          <w:numId w:val="15"/>
+        </w:numPr>
+      </w:pPr>
+      <w:r>
+        <w:t xml:space="preserve">Demonstrates that α and E₀ are </w:t>
+      </w:r>
+      <w:r>
+        <w:rPr>
+          <w:b/>
+          <w:bCs/>
+        </w:rPr>
+        <w:t>not independent</w:t>
+      </w:r>
+      <w:r>
+        <w:t xml:space="preserve"> — a crucial insight for interpreting uncertainties in GRB fits.</w:t>
+      </w:r>
+    </w:p>
+    <w:p>
+      <w:r>
+        <w:drawing>
+          <wp:anchor distT="0" distB="0" distL="114300" distR="114300" simplePos="0" relativeHeight="251659264" behindDoc="1" locked="0" layoutInCell="1" allowOverlap="1" wp14:anchorId="21B727B5" wp14:editId="4A4F89B0">
+            <wp:simplePos x="0" y="0"/>
+            <wp:positionH relativeFrom="column">
+              <wp:posOffset>533400</wp:posOffset>
+            </wp:positionH>
+            <wp:positionV relativeFrom="paragraph">
+              <wp:posOffset>43180</wp:posOffset>
+            </wp:positionV>
+            <wp:extent cx="5943600" cy="1791970"/>
+            <wp:effectExtent l="0" t="0" r="0" b="0"/>
+            <wp:wrapTight wrapText="bothSides">
+              <wp:wrapPolygon edited="0">
+                <wp:start x="0" y="0"/>
+                <wp:lineTo x="0" y="21355"/>
+                <wp:lineTo x="21531" y="21355"/>
+                <wp:lineTo x="21531" y="0"/>
+                <wp:lineTo x="0" y="0"/>
+              </wp:wrapPolygon>
+            </wp:wrapTight>
+            <wp:docPr id="238356361" name="Picture 1"/>
+            <wp:cNvGraphicFramePr>
+              <a:graphicFrameLocks xmlns:a="http://schemas.openxmlformats.org/drawingml/2006/main" noChangeAspect="1"/>
+            </wp:cNvGraphicFramePr>
+            <a:graphic xmlns:a="http://schemas.openxmlformats.org/drawingml/2006/main">
+              <a:graphicData uri="http://schemas.openxmlformats.org/drawingml/2006/picture">
+                <pic:pic xmlns:pic="http://schemas.openxmlformats.org/drawingml/2006/picture">
+                  <pic:nvPicPr>
+                    <pic:cNvPr id="238356361" name=""/>
+                    <pic:cNvPicPr/>
+                  </pic:nvPicPr>
+                  <pic:blipFill>
+                    <a:blip r:embed="rId6">
+                      <a:extLst>
+                        <a:ext uri="{28A0092B-C50C-407E-A947-70E740481C1C}">
+                          <a14:useLocalDpi xmlns:a14="http://schemas.microsoft.com/office/drawing/2010/main" val="0"/>
+                        </a:ext>
+                      </a:extLst>
+                    </a:blip>
+                    <a:stretch>
+                      <a:fillRect/>
+                    </a:stretch>
+                  </pic:blipFill>
+                  <pic:spPr>
+                    <a:xfrm>
+                      <a:off x="0" y="0"/>
+                      <a:ext cx="5943600" cy="1791970"/>
+                    </a:xfrm>
+                    <a:prstGeom prst="rect">
+                      <a:avLst/>
+                    </a:prstGeom>
+                  </pic:spPr>
+                </pic:pic>
+              </a:graphicData>
+            </a:graphic>
+          </wp:anchor>
+        </w:drawing>
+      </w:r>
+    </w:p>
+    <w:p/>
+    <w:p/>
+    <w:p/>
+    <w:p/>
+    <w:p/>
+    <w:p>
+      <w:r>
+        <w:br w:type="page"/>
+      </w:r>
+    </w:p>
+    <w:p>
+      <w:pPr>
+        <w:rPr>
+          <w:b/>
+          <w:bCs/>
+        </w:rPr>
+      </w:pPr>
+      <w:r>
+        <w:rPr>
+          <w:rFonts w:ascii="Segoe UI Emoji" w:hAnsi="Segoe UI Emoji" w:cs="Segoe UI Emoji"/>
+          <w:b/>
+          <w:bCs/>
+        </w:rPr>
+        <w:lastRenderedPageBreak/>
+        <w:t>🔹</w:t>
+      </w:r>
+      <w:r>
+        <w:rPr>
+          <w:b/>
+          <w:bCs/>
+        </w:rPr>
+        <w:t xml:space="preserve"> 10. Results: Spectral Diversity</w:t>
+      </w:r>
+    </w:p>
+    <w:p>
+      <w:r>
+        <w:t>From the 54-burst sample:</w:t>
+      </w:r>
+    </w:p>
+    <w:p>
+      <w:pPr>
+        <w:numPr>
+          <w:ilvl w:val="0"/>
+          <w:numId w:val="16"/>
+        </w:numPr>
+      </w:pPr>
+      <w:proofErr w:type="spellStart"/>
+      <w:r>
+        <w:t>EpeakE</w:t>
+      </w:r>
+      <w:proofErr w:type="spellEnd"/>
+      <w:r>
+        <w:t>_{\text{peak</w:t>
+      </w:r>
+      <w:proofErr w:type="gramStart"/>
+      <w:r>
+        <w:t>}}</w:t>
+      </w:r>
+      <w:proofErr w:type="spellStart"/>
+      <w:r>
+        <w:t>Epeak</w:t>
+      </w:r>
+      <w:proofErr w:type="spellEnd"/>
+      <w:r>
+        <w:t>​</w:t>
+      </w:r>
+      <w:proofErr w:type="gramEnd"/>
+      <w:r>
+        <w:t xml:space="preserve"> typically lies between </w:t>
+      </w:r>
+      <w:r>
+        <w:rPr>
+          <w:b/>
+          <w:bCs/>
+        </w:rPr>
+        <w:t>100–500 keV</w:t>
+      </w:r>
+      <w:r>
+        <w:t>,</w:t>
+      </w:r>
+    </w:p>
+    <w:p>
+      <w:pPr>
+        <w:numPr>
+          <w:ilvl w:val="0"/>
+          <w:numId w:val="16"/>
+        </w:numPr>
+      </w:pPr>
+      <w:r>
+        <w:t xml:space="preserve">α clusters around </w:t>
+      </w:r>
+      <w:r>
+        <w:rPr>
+          <w:b/>
+          <w:bCs/>
+        </w:rPr>
+        <w:t>–1</w:t>
+      </w:r>
+      <w:r>
+        <w:t>,</w:t>
+      </w:r>
+    </w:p>
+    <w:p>
+      <w:pPr>
+        <w:numPr>
+          <w:ilvl w:val="0"/>
+          <w:numId w:val="16"/>
+        </w:numPr>
+      </w:pPr>
+      <w:r>
+        <w:t xml:space="preserve">β around </w:t>
+      </w:r>
+      <w:r>
+        <w:rPr>
+          <w:b/>
+          <w:bCs/>
+        </w:rPr>
+        <w:t>–2.3</w:t>
+      </w:r>
+      <w:r>
+        <w:t>,</w:t>
+      </w:r>
+    </w:p>
+    <w:p>
+      <w:pPr>
+        <w:numPr>
+          <w:ilvl w:val="0"/>
+          <w:numId w:val="16"/>
+        </w:numPr>
+      </w:pPr>
+      <w:r>
+        <w:t>significant diversity exists — some bursts show very hard or very soft slopes.</w:t>
+      </w:r>
+    </w:p>
+    <w:p>
+      <w:r>
+        <w:t>They also note:</w:t>
+      </w:r>
+    </w:p>
+    <w:p>
+      <w:pPr>
+        <w:numPr>
+          <w:ilvl w:val="0"/>
+          <w:numId w:val="17"/>
+        </w:numPr>
+      </w:pPr>
+      <w:r>
+        <w:t xml:space="preserve">Most bursts show a </w:t>
+      </w:r>
+      <w:r>
+        <w:rPr>
+          <w:b/>
+          <w:bCs/>
+        </w:rPr>
+        <w:t>smooth curvature</w:t>
+      </w:r>
+      <w:r>
+        <w:t>, well-described by the Band function.</w:t>
+      </w:r>
+    </w:p>
+    <w:p>
+      <w:pPr>
+        <w:numPr>
+          <w:ilvl w:val="0"/>
+          <w:numId w:val="17"/>
+        </w:numPr>
+      </w:pPr>
+      <w:r>
+        <w:t>Only a few require simpler or more complex models.</w:t>
+      </w:r>
+    </w:p>
+    <w:p>
+      <w:pPr>
+        <w:numPr>
+          <w:ilvl w:val="0"/>
+          <w:numId w:val="17"/>
+        </w:numPr>
+      </w:pPr>
+      <w:r>
+        <w:t>The high-energy tail (β) is critical; truncating it biases the results.</w:t>
+      </w:r>
+    </w:p>
+    <w:p>
+      <w:r>
+        <w:pict w14:anchorId="46F9EC96">
+          <v:rect id="_x0000_i1092" style="width:0;height:1.5pt" o:hralign="center" o:hrstd="t" o:hr="t" fillcolor="#a0a0a0" stroked="f"/>
+        </w:pict>
+      </w:r>
+    </w:p>
+    <w:p>
+      <w:pPr>
+        <w:rPr>
+          <w:b/>
+          <w:bCs/>
+        </w:rPr>
+      </w:pPr>
+      <w:r>
+        <w:rPr>
+          <w:rFonts w:ascii="Segoe UI Emoji" w:hAnsi="Segoe UI Emoji" w:cs="Segoe UI Emoji"/>
+          <w:b/>
+          <w:bCs/>
+        </w:rPr>
+        <w:t>🔹</w:t>
+      </w:r>
+      <w:r>
+        <w:rPr>
+          <w:b/>
+          <w:bCs/>
+        </w:rPr>
+        <w:t xml:space="preserve"> 11. Interpretation</w:t>
+      </w:r>
+    </w:p>
+    <w:p>
+      <w:pPr>
+        <w:numPr>
+          <w:ilvl w:val="0"/>
+          <w:numId w:val="18"/>
+        </w:numPr>
+      </w:pPr>
+      <w:r>
+        <w:t xml:space="preserve">The spectral shape is </w:t>
+      </w:r>
+      <w:r>
+        <w:rPr>
+          <w:b/>
+          <w:bCs/>
+        </w:rPr>
+        <w:t>empirical</w:t>
+      </w:r>
+      <w:r>
+        <w:t>, not yet tied to a unique physical model.</w:t>
+      </w:r>
+    </w:p>
+    <w:p>
+      <w:pPr>
+        <w:numPr>
+          <w:ilvl w:val="0"/>
+          <w:numId w:val="18"/>
+        </w:numPr>
+      </w:pPr>
+      <w:r>
+        <w:t xml:space="preserve">But α and β values are consistent with </w:t>
+      </w:r>
+      <w:r>
+        <w:rPr>
+          <w:b/>
+          <w:bCs/>
+        </w:rPr>
+        <w:t>non-thermal radiation</w:t>
+      </w:r>
+      <w:r>
+        <w:t xml:space="preserve"> (e.g., synchrotron, </w:t>
+      </w:r>
+      <w:proofErr w:type="spellStart"/>
+      <w:r>
+        <w:t>Comptonized</w:t>
+      </w:r>
+      <w:proofErr w:type="spellEnd"/>
+      <w:r>
+        <w:t xml:space="preserve"> emission).</w:t>
+      </w:r>
+    </w:p>
+    <w:p>
+      <w:pPr>
+        <w:numPr>
+          <w:ilvl w:val="0"/>
+          <w:numId w:val="18"/>
+        </w:numPr>
+      </w:pPr>
+      <w:r>
+        <w:t xml:space="preserve">The break energies correspond roughly to </w:t>
+      </w:r>
+      <w:r>
+        <w:rPr>
+          <w:b/>
+          <w:bCs/>
+        </w:rPr>
+        <w:t>photon energies at spectral peak</w:t>
+      </w:r>
+      <w:r>
+        <w:t xml:space="preserve"> in </w:t>
+      </w:r>
+      <w:proofErr w:type="spellStart"/>
+      <w:r>
+        <w:t>νFν</w:t>
+      </w:r>
+      <w:proofErr w:type="spellEnd"/>
+      <w:r>
+        <w:t xml:space="preserve"> space, tracing the energy release mechanism.</w:t>
+      </w:r>
+    </w:p>
+    <w:p>
+      <w:r>
+        <w:t>They caution that the shape is not always universal — spectra evolve in time and vary between bursts.</w:t>
+      </w:r>
+    </w:p>
+    <w:p>
+      <w:r>
+        <w:pict w14:anchorId="7CF6041D">
+          <v:rect id="_x0000_i1093" style="width:0;height:1.5pt" o:hralign="center" o:hrstd="t" o:hr="t" fillcolor="#a0a0a0" stroked="f"/>
+        </w:pict>
+      </w:r>
+    </w:p>
+    <w:p>
+      <w:pPr>
+        <w:rPr>
+          <w:b/>
+          <w:bCs/>
+        </w:rPr>
+      </w:pPr>
+      <w:r>
+        <w:rPr>
+          <w:rFonts w:ascii="Segoe UI Emoji" w:hAnsi="Segoe UI Emoji" w:cs="Segoe UI Emoji"/>
+          <w:b/>
+          <w:bCs/>
+        </w:rPr>
+        <w:t>🔹</w:t>
+      </w:r>
+      <w:r>
+        <w:rPr>
+          <w:b/>
+          <w:bCs/>
+        </w:rPr>
+        <w:t xml:space="preserve"> 12. Conclusions</w:t>
+      </w:r>
+    </w:p>
+    <w:p>
+      <w:pPr>
+        <w:numPr>
+          <w:ilvl w:val="0"/>
+          <w:numId w:val="19"/>
+        </w:numPr>
+      </w:pPr>
+      <w:r>
+        <w:rPr>
+          <w:b/>
+          <w:bCs/>
+        </w:rPr>
+        <w:t>BATSE spectra</w:t>
+      </w:r>
+      <w:r>
+        <w:t xml:space="preserve"> show a wide variety of shapes — confirming </w:t>
+      </w:r>
+      <w:r>
+        <w:rPr>
+          <w:b/>
+          <w:bCs/>
+        </w:rPr>
+        <w:t>true spectral diversity</w:t>
+      </w:r>
+      <w:r>
+        <w:t xml:space="preserve"> among GRBs.</w:t>
+      </w:r>
+    </w:p>
+    <w:p>
+      <w:pPr>
+        <w:numPr>
+          <w:ilvl w:val="0"/>
+          <w:numId w:val="19"/>
+        </w:numPr>
+      </w:pPr>
+      <w:r>
+        <w:t xml:space="preserve">The </w:t>
+      </w:r>
+      <w:r>
+        <w:rPr>
+          <w:b/>
+          <w:bCs/>
+        </w:rPr>
+        <w:t>Band function</w:t>
+      </w:r>
+      <w:r>
+        <w:t xml:space="preserve"> successfully fits most bursts, becoming the </w:t>
+      </w:r>
+      <w:r>
+        <w:rPr>
+          <w:b/>
+          <w:bCs/>
+        </w:rPr>
+        <w:t>standard empirical model</w:t>
+      </w:r>
+      <w:r>
+        <w:t>.</w:t>
+      </w:r>
+    </w:p>
+    <w:p>
+      <w:pPr>
+        <w:numPr>
+          <w:ilvl w:val="0"/>
+          <w:numId w:val="19"/>
+        </w:numPr>
+      </w:pPr>
+      <w:r>
+        <w:t xml:space="preserve">Simulations confirm that </w:t>
+      </w:r>
+      <w:r>
+        <w:rPr>
+          <w:b/>
+          <w:bCs/>
+        </w:rPr>
+        <w:t>χ² fitting</w:t>
+      </w:r>
+      <w:r>
+        <w:t xml:space="preserve"> is robust and that α–E₀ correlations arise naturally.</w:t>
+      </w:r>
+    </w:p>
+    <w:p>
+      <w:pPr>
+        <w:numPr>
+          <w:ilvl w:val="0"/>
+          <w:numId w:val="19"/>
+        </w:numPr>
+      </w:pPr>
+      <w:r>
+        <w:rPr>
+          <w:b/>
+          <w:bCs/>
+        </w:rPr>
+        <w:t>Truncating the high-energy tail</w:t>
+      </w:r>
+      <w:r>
+        <w:t xml:space="preserve"> or ignoring low-S/N channels can bias fits.</w:t>
+      </w:r>
+    </w:p>
+    <w:p>
+      <w:pPr>
+        <w:numPr>
+          <w:ilvl w:val="0"/>
+          <w:numId w:val="19"/>
+        </w:numPr>
+      </w:pPr>
+      <w:r>
+        <w:lastRenderedPageBreak/>
+        <w:t xml:space="preserve">The </w:t>
+      </w:r>
+      <w:r>
+        <w:rPr>
+          <w:b/>
+          <w:bCs/>
+        </w:rPr>
+        <w:t>log N–log P</w:t>
+      </w:r>
+      <w:r>
+        <w:t xml:space="preserve"> slope (–0.8) supports a </w:t>
+      </w:r>
+      <w:r>
+        <w:rPr>
+          <w:b/>
+          <w:bCs/>
+        </w:rPr>
+        <w:t>cosmological, non-uniform distribution</w:t>
+      </w:r>
+      <w:r>
+        <w:t xml:space="preserve"> of GRBs.</w:t>
+      </w:r>
+    </w:p>
+    <w:p>
+      <w:pPr>
+        <w:numPr>
+          <w:ilvl w:val="0"/>
+          <w:numId w:val="19"/>
+        </w:numPr>
+      </w:pPr>
+      <w:r>
+        <w:t xml:space="preserve">This work laid the statistical and methodological foundation for all subsequent GRB spectral catalogs (BATSE, </w:t>
+      </w:r>
+      <w:proofErr w:type="spellStart"/>
+      <w:r>
+        <w:t>Konus</w:t>
+      </w:r>
+      <w:proofErr w:type="spellEnd"/>
+      <w:r>
+        <w:t>, Fermi/GBM).</w:t>
+      </w:r>
+    </w:p>
+    <w:p>
+      <w:r>
+        <w:pict w14:anchorId="0508D3A3">
+          <v:rect id="_x0000_i1094" style="width:0;height:1.5pt" o:hralign="center" o:hrstd="t" o:hr="t" fillcolor="#a0a0a0" stroked="f"/>
+        </w:pict>
+      </w:r>
+    </w:p>
+    <w:p>
+      <w:pPr>
+        <w:rPr>
+          <w:b/>
+          <w:bCs/>
+        </w:rPr>
+      </w:pPr>
+      <w:r>
+        <w:rPr>
+          <w:rFonts w:ascii="Segoe UI Emoji" w:hAnsi="Segoe UI Emoji" w:cs="Segoe UI Emoji"/>
+          <w:b/>
+          <w:bCs/>
+        </w:rPr>
+        <w:t>🔹</w:t>
+      </w:r>
+      <w:r>
+        <w:rPr>
+          <w:b/>
+          <w:bCs/>
+        </w:rPr>
+        <w:t xml:space="preserve"> 13. Modern Significance</w:t>
+      </w:r>
+    </w:p>
+    <w:p>
+      <w:r>
+        <w:t>This 1993 paper remains the cornerstone of GRB spectral studies because:</w:t>
+      </w:r>
+    </w:p>
+    <w:p>
+      <w:pPr>
+        <w:numPr>
+          <w:ilvl w:val="0"/>
+          <w:numId w:val="20"/>
+        </w:numPr>
+      </w:pPr>
+      <w:r>
+        <w:t xml:space="preserve">The </w:t>
+      </w:r>
+      <w:r>
+        <w:rPr>
+          <w:b/>
+          <w:bCs/>
+        </w:rPr>
+        <w:t>Band function</w:t>
+      </w:r>
+      <w:r>
+        <w:t xml:space="preserve"> is still the </w:t>
+      </w:r>
+      <w:r>
+        <w:rPr>
+          <w:i/>
+          <w:iCs/>
+        </w:rPr>
+        <w:t>default model</w:t>
+      </w:r>
+      <w:r>
+        <w:t xml:space="preserve"> for GRB prompt spectra.</w:t>
+      </w:r>
+    </w:p>
+    <w:p>
+      <w:pPr>
+        <w:numPr>
+          <w:ilvl w:val="0"/>
+          <w:numId w:val="20"/>
+        </w:numPr>
+      </w:pPr>
+      <w:r>
+        <w:t xml:space="preserve">α and β distributions are key diagnostics for emission physics (e.g., synchrotron vs </w:t>
+      </w:r>
+      <w:proofErr w:type="spellStart"/>
+      <w:r>
+        <w:t>photospheric</w:t>
+      </w:r>
+      <w:proofErr w:type="spellEnd"/>
+      <w:r>
+        <w:t>).</w:t>
+      </w:r>
+    </w:p>
+    <w:p>
+      <w:pPr>
+        <w:numPr>
+          <w:ilvl w:val="0"/>
+          <w:numId w:val="20"/>
+        </w:numPr>
+      </w:pPr>
+      <w:r>
+        <w:t>The α–E₀ correlation still explains parameter degeneracy seen in all modern GRB catalogs.</w:t>
+      </w:r>
+    </w:p>
+    <w:p>
+      <w:pPr>
+        <w:numPr>
+          <w:ilvl w:val="0"/>
+          <w:numId w:val="20"/>
+        </w:numPr>
+      </w:pPr>
+      <w:r>
+        <w:t xml:space="preserve">The log N–log P result was among the </w:t>
+      </w:r>
+      <w:r>
+        <w:rPr>
+          <w:b/>
+          <w:bCs/>
+        </w:rPr>
+        <w:t>first clear indications</w:t>
+      </w:r>
+      <w:r>
+        <w:t xml:space="preserve"> that GRBs are </w:t>
+      </w:r>
+      <w:r>
+        <w:rPr>
+          <w:b/>
+          <w:bCs/>
+        </w:rPr>
+        <w:t>cosmological</w:t>
+      </w:r>
+      <w:r>
+        <w:t xml:space="preserve"> rather than Galactic.</w:t>
+      </w:r>
+    </w:p>
+    <w:p/>
     <w:sectPr>
       <w:pgSz w:w="12240" w:h="15840"/>
       <w:pgMar w:top="1440" w:right="1440" w:bottom="1440" w:left="1440" w:header="708" w:footer="708" w:gutter="0"/>
@@ -4398,6 +5474,417 @@
 <file path=word/numbering.xml><?xml version="1.0" encoding="utf-8"?>
 <w:numbering xmlns:wpc="http://schemas.microsoft.com/office/word/2010/wordprocessingCanvas" xmlns:cx="http://schemas.microsoft.com/office/drawing/2014/chartex" xmlns:cx1="http://schemas.microsoft.com/office/drawing/2015/9/8/chartex" xmlns:cx2="http://schemas.microsoft.com/office/drawing/2015/10/21/chartex" xmlns:cx3="http://schemas.microsoft.com/office/drawing/2016/5/9/chartex" xmlns:cx4="http://schemas.microsoft.com/office/drawing/2016/5/10/chartex" xmlns:cx5="http://schemas.microsoft.com/office/drawing/2016/5/11/chartex" xmlns:cx6="http://schemas.microsoft.com/office/drawing/2016/5/12/chartex" xmlns:cx7="http://schemas.microsoft.com/office/drawing/2016/5/13/chartex" xmlns:cx8="http://schemas.microsoft.com/office/drawing/2016/5/14/chartex" xmlns:mc="http://schemas.openxmlformats.org/markup-compatibility/2006" xmlns:aink="http://schemas.microsoft.com/office/drawing/2016/ink" xmlns:am3d="http://schemas.microsoft.com/office/drawing/2017/model3d" xmlns:o="urn:schemas-microsoft-com:office:office" xmlns:oel="http://schemas.microsoft.com/office/2019/extlst" xmlns:r="http://schemas.openxmlformats.org/officeDocument/2006/relationships" xmlns:m="http://schemas.openxmlformats.org/officeDocument/2006/math" xmlns:v="urn:schemas-microsoft-com:vml" xmlns:wp14="http://schemas.microsoft.com/office/word/2010/wordprocessingDrawing" xmlns:wp="http://schemas.openxmlformats.org/drawingml/2006/wordprocessingDrawing" xmlns:w10="urn:schemas-microsoft-com:office:word" xmlns:w="http://schemas.openxmlformats.org/wordprocessingml/2006/main" xmlns:w14="http://schemas.microsoft.com/office/word/2010/wordml" xmlns:w15="http://schemas.microsoft.com/office/word/2012/wordml" xmlns:w16cex="http://schemas.microsoft.com/office/word/2018/wordml/cex" xmlns:w16cid="http://schemas.microsoft.com/office/word/2016/wordml/cid" xmlns:w16="http://schemas.microsoft.com/office/word/2018/wordml" xmlns:w16du="http://schemas.microsoft.com/office/word/2023/wordml/word16du" xmlns:w16sdtdh="http://schemas.microsoft.com/office/word/2020/wordml/sdtdatahash" xmlns:w16sdtfl="http://schemas.microsoft.com/office/word/2024/wordml/sdtformatlock" xmlns:w16se="http://schemas.microsoft.com/office/word/2015/wordml/symex" xmlns:wpg="http://schemas.microsoft.com/office/word/2010/wordprocessingGroup" xmlns:wpi="http://schemas.microsoft.com/office/word/2010/wordprocessingInk" xmlns:wne="http://schemas.microsoft.com/office/word/2006/wordml" xmlns:wps="http://schemas.microsoft.com/office/word/2010/wordprocessingShape" mc:Ignorable="w14 w15 w16se w16cid w16 w16cex w16sdtdh w16sdtfl w16du wp14">
   <w:abstractNum w:abstractNumId="0" w15:restartNumberingAfterBreak="0">
+    <w:nsid w:val="04BE0CA3"/>
+    <w:multiLevelType w:val="multilevel"/>
+    <w:tmpl w:val="0FC66246"/>
+    <w:lvl w:ilvl="0">
+      <w:start w:val="1"/>
+      <w:numFmt w:val="decimal"/>
+      <w:lvlText w:val="%1."/>
+      <w:lvlJc w:val="left"/>
+      <w:pPr>
+        <w:tabs>
+          <w:tab w:val="num" w:pos="720"/>
+        </w:tabs>
+        <w:ind w:left="720" w:hanging="360"/>
+      </w:pPr>
+    </w:lvl>
+    <w:lvl w:ilvl="1">
+      <w:start w:val="1"/>
+      <w:numFmt w:val="bullet"/>
+      <w:lvlText w:val="o"/>
+      <w:lvlJc w:val="left"/>
+      <w:pPr>
+        <w:tabs>
+          <w:tab w:val="num" w:pos="1440"/>
+        </w:tabs>
+        <w:ind w:left="1440" w:hanging="360"/>
+      </w:pPr>
+      <w:rPr>
+        <w:rFonts w:ascii="Courier New" w:hAnsi="Courier New" w:hint="default"/>
+        <w:sz w:val="20"/>
+      </w:rPr>
+    </w:lvl>
+    <w:lvl w:ilvl="2" w:tentative="1">
+      <w:start w:val="1"/>
+      <w:numFmt w:val="decimal"/>
+      <w:lvlText w:val="%3."/>
+      <w:lvlJc w:val="left"/>
+      <w:pPr>
+        <w:tabs>
+          <w:tab w:val="num" w:pos="2160"/>
+        </w:tabs>
+        <w:ind w:left="2160" w:hanging="360"/>
+      </w:pPr>
+    </w:lvl>
+    <w:lvl w:ilvl="3" w:tentative="1">
+      <w:start w:val="1"/>
+      <w:numFmt w:val="decimal"/>
+      <w:lvlText w:val="%4."/>
+      <w:lvlJc w:val="left"/>
+      <w:pPr>
+        <w:tabs>
+          <w:tab w:val="num" w:pos="2880"/>
+        </w:tabs>
+        <w:ind w:left="2880" w:hanging="360"/>
+      </w:pPr>
+    </w:lvl>
+    <w:lvl w:ilvl="4" w:tentative="1">
+      <w:start w:val="1"/>
+      <w:numFmt w:val="decimal"/>
+      <w:lvlText w:val="%5."/>
+      <w:lvlJc w:val="left"/>
+      <w:pPr>
+        <w:tabs>
+          <w:tab w:val="num" w:pos="3600"/>
+        </w:tabs>
+        <w:ind w:left="3600" w:hanging="360"/>
+      </w:pPr>
+    </w:lvl>
+    <w:lvl w:ilvl="5" w:tentative="1">
+      <w:start w:val="1"/>
+      <w:numFmt w:val="decimal"/>
+      <w:lvlText w:val="%6."/>
+      <w:lvlJc w:val="left"/>
+      <w:pPr>
+        <w:tabs>
+          <w:tab w:val="num" w:pos="4320"/>
+        </w:tabs>
+        <w:ind w:left="4320" w:hanging="360"/>
+      </w:pPr>
+    </w:lvl>
+    <w:lvl w:ilvl="6" w:tentative="1">
+      <w:start w:val="1"/>
+      <w:numFmt w:val="decimal"/>
+      <w:lvlText w:val="%7."/>
+      <w:lvlJc w:val="left"/>
+      <w:pPr>
+        <w:tabs>
+          <w:tab w:val="num" w:pos="5040"/>
+        </w:tabs>
+        <w:ind w:left="5040" w:hanging="360"/>
+      </w:pPr>
+    </w:lvl>
+    <w:lvl w:ilvl="7" w:tentative="1">
+      <w:start w:val="1"/>
+      <w:numFmt w:val="decimal"/>
+      <w:lvlText w:val="%8."/>
+      <w:lvlJc w:val="left"/>
+      <w:pPr>
+        <w:tabs>
+          <w:tab w:val="num" w:pos="5760"/>
+        </w:tabs>
+        <w:ind w:left="5760" w:hanging="360"/>
+      </w:pPr>
+    </w:lvl>
+    <w:lvl w:ilvl="8" w:tentative="1">
+      <w:start w:val="1"/>
+      <w:numFmt w:val="decimal"/>
+      <w:lvlText w:val="%9."/>
+      <w:lvlJc w:val="left"/>
+      <w:pPr>
+        <w:tabs>
+          <w:tab w:val="num" w:pos="6480"/>
+        </w:tabs>
+        <w:ind w:left="6480" w:hanging="360"/>
+      </w:pPr>
+    </w:lvl>
+  </w:abstractNum>
+  <w:abstractNum w:abstractNumId="1" w15:restartNumberingAfterBreak="0">
+    <w:nsid w:val="07462E3B"/>
+    <w:multiLevelType w:val="multilevel"/>
+    <w:tmpl w:val="6E201F74"/>
+    <w:lvl w:ilvl="0">
+      <w:start w:val="1"/>
+      <w:numFmt w:val="bullet"/>
+      <w:lvlText w:val=""/>
+      <w:lvlJc w:val="left"/>
+      <w:pPr>
+        <w:tabs>
+          <w:tab w:val="num" w:pos="720"/>
+        </w:tabs>
+        <w:ind w:left="720" w:hanging="360"/>
+      </w:pPr>
+      <w:rPr>
+        <w:rFonts w:ascii="Symbol" w:hAnsi="Symbol" w:hint="default"/>
+        <w:sz w:val="20"/>
+      </w:rPr>
+    </w:lvl>
+    <w:lvl w:ilvl="1">
+      <w:start w:val="1"/>
+      <w:numFmt w:val="decimal"/>
+      <w:lvlText w:val="%2."/>
+      <w:lvlJc w:val="left"/>
+      <w:pPr>
+        <w:tabs>
+          <w:tab w:val="num" w:pos="1440"/>
+        </w:tabs>
+        <w:ind w:left="1440" w:hanging="360"/>
+      </w:pPr>
+    </w:lvl>
+    <w:lvl w:ilvl="2" w:tentative="1">
+      <w:start w:val="1"/>
+      <w:numFmt w:val="bullet"/>
+      <w:lvlText w:val=""/>
+      <w:lvlJc w:val="left"/>
+      <w:pPr>
+        <w:tabs>
+          <w:tab w:val="num" w:pos="2160"/>
+        </w:tabs>
+        <w:ind w:left="2160" w:hanging="360"/>
+      </w:pPr>
+      <w:rPr>
+        <w:rFonts w:ascii="Wingdings" w:hAnsi="Wingdings" w:hint="default"/>
+        <w:sz w:val="20"/>
+      </w:rPr>
+    </w:lvl>
+    <w:lvl w:ilvl="3" w:tentative="1">
+      <w:start w:val="1"/>
+      <w:numFmt w:val="bullet"/>
+      <w:lvlText w:val=""/>
+      <w:lvlJc w:val="left"/>
+      <w:pPr>
+        <w:tabs>
+          <w:tab w:val="num" w:pos="2880"/>
+        </w:tabs>
+        <w:ind w:left="2880" w:hanging="360"/>
+      </w:pPr>
+      <w:rPr>
+        <w:rFonts w:ascii="Wingdings" w:hAnsi="Wingdings" w:hint="default"/>
+        <w:sz w:val="20"/>
+      </w:rPr>
+    </w:lvl>
+    <w:lvl w:ilvl="4" w:tentative="1">
+      <w:start w:val="1"/>
+      <w:numFmt w:val="bullet"/>
+      <w:lvlText w:val=""/>
+      <w:lvlJc w:val="left"/>
+      <w:pPr>
+        <w:tabs>
+          <w:tab w:val="num" w:pos="3600"/>
+        </w:tabs>
+        <w:ind w:left="3600" w:hanging="360"/>
+      </w:pPr>
+      <w:rPr>
+        <w:rFonts w:ascii="Wingdings" w:hAnsi="Wingdings" w:hint="default"/>
+        <w:sz w:val="20"/>
+      </w:rPr>
+    </w:lvl>
+    <w:lvl w:ilvl="5" w:tentative="1">
+      <w:start w:val="1"/>
+      <w:numFmt w:val="bullet"/>
+      <w:lvlText w:val=""/>
+      <w:lvlJc w:val="left"/>
+      <w:pPr>
+        <w:tabs>
+          <w:tab w:val="num" w:pos="4320"/>
+        </w:tabs>
+        <w:ind w:left="4320" w:hanging="360"/>
+      </w:pPr>
+      <w:rPr>
+        <w:rFonts w:ascii="Wingdings" w:hAnsi="Wingdings" w:hint="default"/>
+        <w:sz w:val="20"/>
+      </w:rPr>
+    </w:lvl>
+    <w:lvl w:ilvl="6" w:tentative="1">
+      <w:start w:val="1"/>
+      <w:numFmt w:val="bullet"/>
+      <w:lvlText w:val=""/>
+      <w:lvlJc w:val="left"/>
+      <w:pPr>
+        <w:tabs>
+          <w:tab w:val="num" w:pos="5040"/>
+        </w:tabs>
+        <w:ind w:left="5040" w:hanging="360"/>
+      </w:pPr>
+      <w:rPr>
+        <w:rFonts w:ascii="Wingdings" w:hAnsi="Wingdings" w:hint="default"/>
+        <w:sz w:val="20"/>
+      </w:rPr>
+    </w:lvl>
+    <w:lvl w:ilvl="7" w:tentative="1">
+      <w:start w:val="1"/>
+      <w:numFmt w:val="bullet"/>
+      <w:lvlText w:val=""/>
+      <w:lvlJc w:val="left"/>
+      <w:pPr>
+        <w:tabs>
+          <w:tab w:val="num" w:pos="5760"/>
+        </w:tabs>
+        <w:ind w:left="5760" w:hanging="360"/>
+      </w:pPr>
+      <w:rPr>
+        <w:rFonts w:ascii="Wingdings" w:hAnsi="Wingdings" w:hint="default"/>
+        <w:sz w:val="20"/>
+      </w:rPr>
+    </w:lvl>
+    <w:lvl w:ilvl="8" w:tentative="1">
+      <w:start w:val="1"/>
+      <w:numFmt w:val="bullet"/>
+      <w:lvlText w:val=""/>
+      <w:lvlJc w:val="left"/>
+      <w:pPr>
+        <w:tabs>
+          <w:tab w:val="num" w:pos="6480"/>
+        </w:tabs>
+        <w:ind w:left="6480" w:hanging="360"/>
+      </w:pPr>
+      <w:rPr>
+        <w:rFonts w:ascii="Wingdings" w:hAnsi="Wingdings" w:hint="default"/>
+        <w:sz w:val="20"/>
+      </w:rPr>
+    </w:lvl>
+  </w:abstractNum>
+  <w:abstractNum w:abstractNumId="2" w15:restartNumberingAfterBreak="0">
+    <w:nsid w:val="097E5890"/>
+    <w:multiLevelType w:val="multilevel"/>
+    <w:tmpl w:val="C14614FC"/>
+    <w:lvl w:ilvl="0">
+      <w:start w:val="1"/>
+      <w:numFmt w:val="bullet"/>
+      <w:lvlText w:val=""/>
+      <w:lvlJc w:val="left"/>
+      <w:pPr>
+        <w:tabs>
+          <w:tab w:val="num" w:pos="720"/>
+        </w:tabs>
+        <w:ind w:left="720" w:hanging="360"/>
+      </w:pPr>
+      <w:rPr>
+        <w:rFonts w:ascii="Symbol" w:hAnsi="Symbol" w:hint="default"/>
+        <w:sz w:val="20"/>
+      </w:rPr>
+    </w:lvl>
+    <w:lvl w:ilvl="1" w:tentative="1">
+      <w:start w:val="1"/>
+      <w:numFmt w:val="bullet"/>
+      <w:lvlText w:val="o"/>
+      <w:lvlJc w:val="left"/>
+      <w:pPr>
+        <w:tabs>
+          <w:tab w:val="num" w:pos="1440"/>
+        </w:tabs>
+        <w:ind w:left="1440" w:hanging="360"/>
+      </w:pPr>
+      <w:rPr>
+        <w:rFonts w:ascii="Courier New" w:hAnsi="Courier New" w:hint="default"/>
+        <w:sz w:val="20"/>
+      </w:rPr>
+    </w:lvl>
+    <w:lvl w:ilvl="2" w:tentative="1">
+      <w:start w:val="1"/>
+      <w:numFmt w:val="bullet"/>
+      <w:lvlText w:val=""/>
+      <w:lvlJc w:val="left"/>
+      <w:pPr>
+        <w:tabs>
+          <w:tab w:val="num" w:pos="2160"/>
+        </w:tabs>
+        <w:ind w:left="2160" w:hanging="360"/>
+      </w:pPr>
+      <w:rPr>
+        <w:rFonts w:ascii="Wingdings" w:hAnsi="Wingdings" w:hint="default"/>
+        <w:sz w:val="20"/>
+      </w:rPr>
+    </w:lvl>
+    <w:lvl w:ilvl="3" w:tentative="1">
+      <w:start w:val="1"/>
+      <w:numFmt w:val="bullet"/>
+      <w:lvlText w:val=""/>
+      <w:lvlJc w:val="left"/>
+      <w:pPr>
+        <w:tabs>
+          <w:tab w:val="num" w:pos="2880"/>
+        </w:tabs>
+        <w:ind w:left="2880" w:hanging="360"/>
+      </w:pPr>
+      <w:rPr>
+        <w:rFonts w:ascii="Wingdings" w:hAnsi="Wingdings" w:hint="default"/>
+        <w:sz w:val="20"/>
+      </w:rPr>
+    </w:lvl>
+    <w:lvl w:ilvl="4" w:tentative="1">
+      <w:start w:val="1"/>
+      <w:numFmt w:val="bullet"/>
+      <w:lvlText w:val=""/>
+      <w:lvlJc w:val="left"/>
+      <w:pPr>
+        <w:tabs>
+          <w:tab w:val="num" w:pos="3600"/>
+        </w:tabs>
+        <w:ind w:left="3600" w:hanging="360"/>
+      </w:pPr>
+      <w:rPr>
+        <w:rFonts w:ascii="Wingdings" w:hAnsi="Wingdings" w:hint="default"/>
+        <w:sz w:val="20"/>
+      </w:rPr>
+    </w:lvl>
+    <w:lvl w:ilvl="5" w:tentative="1">
+      <w:start w:val="1"/>
+      <w:numFmt w:val="bullet"/>
+      <w:lvlText w:val=""/>
+      <w:lvlJc w:val="left"/>
+      <w:pPr>
+        <w:tabs>
+          <w:tab w:val="num" w:pos="4320"/>
+        </w:tabs>
+        <w:ind w:left="4320" w:hanging="360"/>
+      </w:pPr>
+      <w:rPr>
+        <w:rFonts w:ascii="Wingdings" w:hAnsi="Wingdings" w:hint="default"/>
+        <w:sz w:val="20"/>
+      </w:rPr>
+    </w:lvl>
+    <w:lvl w:ilvl="6" w:tentative="1">
+      <w:start w:val="1"/>
+      <w:numFmt w:val="bullet"/>
+      <w:lvlText w:val=""/>
+      <w:lvlJc w:val="left"/>
+      <w:pPr>
+        <w:tabs>
+          <w:tab w:val="num" w:pos="5040"/>
+        </w:tabs>
+        <w:ind w:left="5040" w:hanging="360"/>
+      </w:pPr>
+      <w:rPr>
+        <w:rFonts w:ascii="Wingdings" w:hAnsi="Wingdings" w:hint="default"/>
+        <w:sz w:val="20"/>
+      </w:rPr>
+    </w:lvl>
+    <w:lvl w:ilvl="7" w:tentative="1">
+      <w:start w:val="1"/>
+      <w:numFmt w:val="bullet"/>
+      <w:lvlText w:val=""/>
+      <w:lvlJc w:val="left"/>
+      <w:pPr>
+        <w:tabs>
+          <w:tab w:val="num" w:pos="5760"/>
+        </w:tabs>
+        <w:ind w:left="5760" w:hanging="360"/>
+      </w:pPr>
+      <w:rPr>
+        <w:rFonts w:ascii="Wingdings" w:hAnsi="Wingdings" w:hint="default"/>
+        <w:sz w:val="20"/>
+      </w:rPr>
+    </w:lvl>
+    <w:lvl w:ilvl="8" w:tentative="1">
+      <w:start w:val="1"/>
+      <w:numFmt w:val="bullet"/>
+      <w:lvlText w:val=""/>
+      <w:lvlJc w:val="left"/>
+      <w:pPr>
+        <w:tabs>
+          <w:tab w:val="num" w:pos="6480"/>
+        </w:tabs>
+        <w:ind w:left="6480" w:hanging="360"/>
+      </w:pPr>
+      <w:rPr>
+        <w:rFonts w:ascii="Wingdings" w:hAnsi="Wingdings" w:hint="default"/>
+        <w:sz w:val="20"/>
+      </w:rPr>
+    </w:lvl>
+  </w:abstractNum>
+  <w:abstractNum w:abstractNumId="3" w15:restartNumberingAfterBreak="0">
     <w:nsid w:val="09912490"/>
     <w:multiLevelType w:val="multilevel"/>
     <w:tmpl w:val="CF743838"/>
@@ -4546,7 +6033,716 @@
       </w:rPr>
     </w:lvl>
   </w:abstractNum>
-  <w:abstractNum w:abstractNumId="1" w15:restartNumberingAfterBreak="0">
+  <w:abstractNum w:abstractNumId="4" w15:restartNumberingAfterBreak="0">
+    <w:nsid w:val="0EE525D9"/>
+    <w:multiLevelType w:val="multilevel"/>
+    <w:tmpl w:val="4A946270"/>
+    <w:lvl w:ilvl="0">
+      <w:start w:val="1"/>
+      <w:numFmt w:val="bullet"/>
+      <w:lvlText w:val=""/>
+      <w:lvlJc w:val="left"/>
+      <w:pPr>
+        <w:tabs>
+          <w:tab w:val="num" w:pos="720"/>
+        </w:tabs>
+        <w:ind w:left="720" w:hanging="360"/>
+      </w:pPr>
+      <w:rPr>
+        <w:rFonts w:ascii="Symbol" w:hAnsi="Symbol" w:hint="default"/>
+        <w:sz w:val="20"/>
+      </w:rPr>
+    </w:lvl>
+    <w:lvl w:ilvl="1">
+      <w:start w:val="1"/>
+      <w:numFmt w:val="bullet"/>
+      <w:lvlText w:val="o"/>
+      <w:lvlJc w:val="left"/>
+      <w:pPr>
+        <w:tabs>
+          <w:tab w:val="num" w:pos="1440"/>
+        </w:tabs>
+        <w:ind w:left="1440" w:hanging="360"/>
+      </w:pPr>
+      <w:rPr>
+        <w:rFonts w:ascii="Courier New" w:hAnsi="Courier New" w:hint="default"/>
+        <w:sz w:val="20"/>
+      </w:rPr>
+    </w:lvl>
+    <w:lvl w:ilvl="2" w:tentative="1">
+      <w:start w:val="1"/>
+      <w:numFmt w:val="bullet"/>
+      <w:lvlText w:val=""/>
+      <w:lvlJc w:val="left"/>
+      <w:pPr>
+        <w:tabs>
+          <w:tab w:val="num" w:pos="2160"/>
+        </w:tabs>
+        <w:ind w:left="2160" w:hanging="360"/>
+      </w:pPr>
+      <w:rPr>
+        <w:rFonts w:ascii="Wingdings" w:hAnsi="Wingdings" w:hint="default"/>
+        <w:sz w:val="20"/>
+      </w:rPr>
+    </w:lvl>
+    <w:lvl w:ilvl="3" w:tentative="1">
+      <w:start w:val="1"/>
+      <w:numFmt w:val="bullet"/>
+      <w:lvlText w:val=""/>
+      <w:lvlJc w:val="left"/>
+      <w:pPr>
+        <w:tabs>
+          <w:tab w:val="num" w:pos="2880"/>
+        </w:tabs>
+        <w:ind w:left="2880" w:hanging="360"/>
+      </w:pPr>
+      <w:rPr>
+        <w:rFonts w:ascii="Wingdings" w:hAnsi="Wingdings" w:hint="default"/>
+        <w:sz w:val="20"/>
+      </w:rPr>
+    </w:lvl>
+    <w:lvl w:ilvl="4" w:tentative="1">
+      <w:start w:val="1"/>
+      <w:numFmt w:val="bullet"/>
+      <w:lvlText w:val=""/>
+      <w:lvlJc w:val="left"/>
+      <w:pPr>
+        <w:tabs>
+          <w:tab w:val="num" w:pos="3600"/>
+        </w:tabs>
+        <w:ind w:left="3600" w:hanging="360"/>
+      </w:pPr>
+      <w:rPr>
+        <w:rFonts w:ascii="Wingdings" w:hAnsi="Wingdings" w:hint="default"/>
+        <w:sz w:val="20"/>
+      </w:rPr>
+    </w:lvl>
+    <w:lvl w:ilvl="5" w:tentative="1">
+      <w:start w:val="1"/>
+      <w:numFmt w:val="bullet"/>
+      <w:lvlText w:val=""/>
+      <w:lvlJc w:val="left"/>
+      <w:pPr>
+        <w:tabs>
+          <w:tab w:val="num" w:pos="4320"/>
+        </w:tabs>
+        <w:ind w:left="4320" w:hanging="360"/>
+      </w:pPr>
+      <w:rPr>
+        <w:rFonts w:ascii="Wingdings" w:hAnsi="Wingdings" w:hint="default"/>
+        <w:sz w:val="20"/>
+      </w:rPr>
+    </w:lvl>
+    <w:lvl w:ilvl="6" w:tentative="1">
+      <w:start w:val="1"/>
+      <w:numFmt w:val="bullet"/>
+      <w:lvlText w:val=""/>
+      <w:lvlJc w:val="left"/>
+      <w:pPr>
+        <w:tabs>
+          <w:tab w:val="num" w:pos="5040"/>
+        </w:tabs>
+        <w:ind w:left="5040" w:hanging="360"/>
+      </w:pPr>
+      <w:rPr>
+        <w:rFonts w:ascii="Wingdings" w:hAnsi="Wingdings" w:hint="default"/>
+        <w:sz w:val="20"/>
+      </w:rPr>
+    </w:lvl>
+    <w:lvl w:ilvl="7" w:tentative="1">
+      <w:start w:val="1"/>
+      <w:numFmt w:val="bullet"/>
+      <w:lvlText w:val=""/>
+      <w:lvlJc w:val="left"/>
+      <w:pPr>
+        <w:tabs>
+          <w:tab w:val="num" w:pos="5760"/>
+        </w:tabs>
+        <w:ind w:left="5760" w:hanging="360"/>
+      </w:pPr>
+      <w:rPr>
+        <w:rFonts w:ascii="Wingdings" w:hAnsi="Wingdings" w:hint="default"/>
+        <w:sz w:val="20"/>
+      </w:rPr>
+    </w:lvl>
+    <w:lvl w:ilvl="8" w:tentative="1">
+      <w:start w:val="1"/>
+      <w:numFmt w:val="bullet"/>
+      <w:lvlText w:val=""/>
+      <w:lvlJc w:val="left"/>
+      <w:pPr>
+        <w:tabs>
+          <w:tab w:val="num" w:pos="6480"/>
+        </w:tabs>
+        <w:ind w:left="6480" w:hanging="360"/>
+      </w:pPr>
+      <w:rPr>
+        <w:rFonts w:ascii="Wingdings" w:hAnsi="Wingdings" w:hint="default"/>
+        <w:sz w:val="20"/>
+      </w:rPr>
+    </w:lvl>
+  </w:abstractNum>
+  <w:abstractNum w:abstractNumId="5" w15:restartNumberingAfterBreak="0">
+    <w:nsid w:val="22F37E5D"/>
+    <w:multiLevelType w:val="multilevel"/>
+    <w:tmpl w:val="2DC66F12"/>
+    <w:lvl w:ilvl="0">
+      <w:start w:val="1"/>
+      <w:numFmt w:val="bullet"/>
+      <w:lvlText w:val=""/>
+      <w:lvlJc w:val="left"/>
+      <w:pPr>
+        <w:tabs>
+          <w:tab w:val="num" w:pos="720"/>
+        </w:tabs>
+        <w:ind w:left="720" w:hanging="360"/>
+      </w:pPr>
+      <w:rPr>
+        <w:rFonts w:ascii="Symbol" w:hAnsi="Symbol" w:hint="default"/>
+        <w:sz w:val="20"/>
+      </w:rPr>
+    </w:lvl>
+    <w:lvl w:ilvl="1" w:tentative="1">
+      <w:start w:val="1"/>
+      <w:numFmt w:val="bullet"/>
+      <w:lvlText w:val="o"/>
+      <w:lvlJc w:val="left"/>
+      <w:pPr>
+        <w:tabs>
+          <w:tab w:val="num" w:pos="1440"/>
+        </w:tabs>
+        <w:ind w:left="1440" w:hanging="360"/>
+      </w:pPr>
+      <w:rPr>
+        <w:rFonts w:ascii="Courier New" w:hAnsi="Courier New" w:hint="default"/>
+        <w:sz w:val="20"/>
+      </w:rPr>
+    </w:lvl>
+    <w:lvl w:ilvl="2" w:tentative="1">
+      <w:start w:val="1"/>
+      <w:numFmt w:val="bullet"/>
+      <w:lvlText w:val=""/>
+      <w:lvlJc w:val="left"/>
+      <w:pPr>
+        <w:tabs>
+          <w:tab w:val="num" w:pos="2160"/>
+        </w:tabs>
+        <w:ind w:left="2160" w:hanging="360"/>
+      </w:pPr>
+      <w:rPr>
+        <w:rFonts w:ascii="Wingdings" w:hAnsi="Wingdings" w:hint="default"/>
+        <w:sz w:val="20"/>
+      </w:rPr>
+    </w:lvl>
+    <w:lvl w:ilvl="3" w:tentative="1">
+      <w:start w:val="1"/>
+      <w:numFmt w:val="bullet"/>
+      <w:lvlText w:val=""/>
+      <w:lvlJc w:val="left"/>
+      <w:pPr>
+        <w:tabs>
+          <w:tab w:val="num" w:pos="2880"/>
+        </w:tabs>
+        <w:ind w:left="2880" w:hanging="360"/>
+      </w:pPr>
+      <w:rPr>
+        <w:rFonts w:ascii="Wingdings" w:hAnsi="Wingdings" w:hint="default"/>
+        <w:sz w:val="20"/>
+      </w:rPr>
+    </w:lvl>
+    <w:lvl w:ilvl="4" w:tentative="1">
+      <w:start w:val="1"/>
+      <w:numFmt w:val="bullet"/>
+      <w:lvlText w:val=""/>
+      <w:lvlJc w:val="left"/>
+      <w:pPr>
+        <w:tabs>
+          <w:tab w:val="num" w:pos="3600"/>
+        </w:tabs>
+        <w:ind w:left="3600" w:hanging="360"/>
+      </w:pPr>
+      <w:rPr>
+        <w:rFonts w:ascii="Wingdings" w:hAnsi="Wingdings" w:hint="default"/>
+        <w:sz w:val="20"/>
+      </w:rPr>
+    </w:lvl>
+    <w:lvl w:ilvl="5" w:tentative="1">
+      <w:start w:val="1"/>
+      <w:numFmt w:val="bullet"/>
+      <w:lvlText w:val=""/>
+      <w:lvlJc w:val="left"/>
+      <w:pPr>
+        <w:tabs>
+          <w:tab w:val="num" w:pos="4320"/>
+        </w:tabs>
+        <w:ind w:left="4320" w:hanging="360"/>
+      </w:pPr>
+      <w:rPr>
+        <w:rFonts w:ascii="Wingdings" w:hAnsi="Wingdings" w:hint="default"/>
+        <w:sz w:val="20"/>
+      </w:rPr>
+    </w:lvl>
+    <w:lvl w:ilvl="6" w:tentative="1">
+      <w:start w:val="1"/>
+      <w:numFmt w:val="bullet"/>
+      <w:lvlText w:val=""/>
+      <w:lvlJc w:val="left"/>
+      <w:pPr>
+        <w:tabs>
+          <w:tab w:val="num" w:pos="5040"/>
+        </w:tabs>
+        <w:ind w:left="5040" w:hanging="360"/>
+      </w:pPr>
+      <w:rPr>
+        <w:rFonts w:ascii="Wingdings" w:hAnsi="Wingdings" w:hint="default"/>
+        <w:sz w:val="20"/>
+      </w:rPr>
+    </w:lvl>
+    <w:lvl w:ilvl="7" w:tentative="1">
+      <w:start w:val="1"/>
+      <w:numFmt w:val="bullet"/>
+      <w:lvlText w:val=""/>
+      <w:lvlJc w:val="left"/>
+      <w:pPr>
+        <w:tabs>
+          <w:tab w:val="num" w:pos="5760"/>
+        </w:tabs>
+        <w:ind w:left="5760" w:hanging="360"/>
+      </w:pPr>
+      <w:rPr>
+        <w:rFonts w:ascii="Wingdings" w:hAnsi="Wingdings" w:hint="default"/>
+        <w:sz w:val="20"/>
+      </w:rPr>
+    </w:lvl>
+    <w:lvl w:ilvl="8" w:tentative="1">
+      <w:start w:val="1"/>
+      <w:numFmt w:val="bullet"/>
+      <w:lvlText w:val=""/>
+      <w:lvlJc w:val="left"/>
+      <w:pPr>
+        <w:tabs>
+          <w:tab w:val="num" w:pos="6480"/>
+        </w:tabs>
+        <w:ind w:left="6480" w:hanging="360"/>
+      </w:pPr>
+      <w:rPr>
+        <w:rFonts w:ascii="Wingdings" w:hAnsi="Wingdings" w:hint="default"/>
+        <w:sz w:val="20"/>
+      </w:rPr>
+    </w:lvl>
+  </w:abstractNum>
+  <w:abstractNum w:abstractNumId="6" w15:restartNumberingAfterBreak="0">
+    <w:nsid w:val="27116028"/>
+    <w:multiLevelType w:val="multilevel"/>
+    <w:tmpl w:val="4D96FA7A"/>
+    <w:lvl w:ilvl="0">
+      <w:start w:val="1"/>
+      <w:numFmt w:val="bullet"/>
+      <w:lvlText w:val=""/>
+      <w:lvlJc w:val="left"/>
+      <w:pPr>
+        <w:tabs>
+          <w:tab w:val="num" w:pos="720"/>
+        </w:tabs>
+        <w:ind w:left="720" w:hanging="360"/>
+      </w:pPr>
+      <w:rPr>
+        <w:rFonts w:ascii="Symbol" w:hAnsi="Symbol" w:hint="default"/>
+        <w:sz w:val="20"/>
+      </w:rPr>
+    </w:lvl>
+    <w:lvl w:ilvl="1" w:tentative="1">
+      <w:start w:val="1"/>
+      <w:numFmt w:val="bullet"/>
+      <w:lvlText w:val="o"/>
+      <w:lvlJc w:val="left"/>
+      <w:pPr>
+        <w:tabs>
+          <w:tab w:val="num" w:pos="1440"/>
+        </w:tabs>
+        <w:ind w:left="1440" w:hanging="360"/>
+      </w:pPr>
+      <w:rPr>
+        <w:rFonts w:ascii="Courier New" w:hAnsi="Courier New" w:hint="default"/>
+        <w:sz w:val="20"/>
+      </w:rPr>
+    </w:lvl>
+    <w:lvl w:ilvl="2" w:tentative="1">
+      <w:start w:val="1"/>
+      <w:numFmt w:val="bullet"/>
+      <w:lvlText w:val=""/>
+      <w:lvlJc w:val="left"/>
+      <w:pPr>
+        <w:tabs>
+          <w:tab w:val="num" w:pos="2160"/>
+        </w:tabs>
+        <w:ind w:left="2160" w:hanging="360"/>
+      </w:pPr>
+      <w:rPr>
+        <w:rFonts w:ascii="Wingdings" w:hAnsi="Wingdings" w:hint="default"/>
+        <w:sz w:val="20"/>
+      </w:rPr>
+    </w:lvl>
+    <w:lvl w:ilvl="3" w:tentative="1">
+      <w:start w:val="1"/>
+      <w:numFmt w:val="bullet"/>
+      <w:lvlText w:val=""/>
+      <w:lvlJc w:val="left"/>
+      <w:pPr>
+        <w:tabs>
+          <w:tab w:val="num" w:pos="2880"/>
+        </w:tabs>
+        <w:ind w:left="2880" w:hanging="360"/>
+      </w:pPr>
+      <w:rPr>
+        <w:rFonts w:ascii="Wingdings" w:hAnsi="Wingdings" w:hint="default"/>
+        <w:sz w:val="20"/>
+      </w:rPr>
+    </w:lvl>
+    <w:lvl w:ilvl="4" w:tentative="1">
+      <w:start w:val="1"/>
+      <w:numFmt w:val="bullet"/>
+      <w:lvlText w:val=""/>
+      <w:lvlJc w:val="left"/>
+      <w:pPr>
+        <w:tabs>
+          <w:tab w:val="num" w:pos="3600"/>
+        </w:tabs>
+        <w:ind w:left="3600" w:hanging="360"/>
+      </w:pPr>
+      <w:rPr>
+        <w:rFonts w:ascii="Wingdings" w:hAnsi="Wingdings" w:hint="default"/>
+        <w:sz w:val="20"/>
+      </w:rPr>
+    </w:lvl>
+    <w:lvl w:ilvl="5" w:tentative="1">
+      <w:start w:val="1"/>
+      <w:numFmt w:val="bullet"/>
+      <w:lvlText w:val=""/>
+      <w:lvlJc w:val="left"/>
+      <w:pPr>
+        <w:tabs>
+          <w:tab w:val="num" w:pos="4320"/>
+        </w:tabs>
+        <w:ind w:left="4320" w:hanging="360"/>
+      </w:pPr>
+      <w:rPr>
+        <w:rFonts w:ascii="Wingdings" w:hAnsi="Wingdings" w:hint="default"/>
+        <w:sz w:val="20"/>
+      </w:rPr>
+    </w:lvl>
+    <w:lvl w:ilvl="6" w:tentative="1">
+      <w:start w:val="1"/>
+      <w:numFmt w:val="bullet"/>
+      <w:lvlText w:val=""/>
+      <w:lvlJc w:val="left"/>
+      <w:pPr>
+        <w:tabs>
+          <w:tab w:val="num" w:pos="5040"/>
+        </w:tabs>
+        <w:ind w:left="5040" w:hanging="360"/>
+      </w:pPr>
+      <w:rPr>
+        <w:rFonts w:ascii="Wingdings" w:hAnsi="Wingdings" w:hint="default"/>
+        <w:sz w:val="20"/>
+      </w:rPr>
+    </w:lvl>
+    <w:lvl w:ilvl="7" w:tentative="1">
+      <w:start w:val="1"/>
+      <w:numFmt w:val="bullet"/>
+      <w:lvlText w:val=""/>
+      <w:lvlJc w:val="left"/>
+      <w:pPr>
+        <w:tabs>
+          <w:tab w:val="num" w:pos="5760"/>
+        </w:tabs>
+        <w:ind w:left="5760" w:hanging="360"/>
+      </w:pPr>
+      <w:rPr>
+        <w:rFonts w:ascii="Wingdings" w:hAnsi="Wingdings" w:hint="default"/>
+        <w:sz w:val="20"/>
+      </w:rPr>
+    </w:lvl>
+    <w:lvl w:ilvl="8" w:tentative="1">
+      <w:start w:val="1"/>
+      <w:numFmt w:val="bullet"/>
+      <w:lvlText w:val=""/>
+      <w:lvlJc w:val="left"/>
+      <w:pPr>
+        <w:tabs>
+          <w:tab w:val="num" w:pos="6480"/>
+        </w:tabs>
+        <w:ind w:left="6480" w:hanging="360"/>
+      </w:pPr>
+      <w:rPr>
+        <w:rFonts w:ascii="Wingdings" w:hAnsi="Wingdings" w:hint="default"/>
+        <w:sz w:val="20"/>
+      </w:rPr>
+    </w:lvl>
+  </w:abstractNum>
+  <w:abstractNum w:abstractNumId="7" w15:restartNumberingAfterBreak="0">
+    <w:nsid w:val="38107853"/>
+    <w:multiLevelType w:val="multilevel"/>
+    <w:tmpl w:val="D51E9B30"/>
+    <w:lvl w:ilvl="0">
+      <w:start w:val="1"/>
+      <w:numFmt w:val="decimal"/>
+      <w:lvlText w:val="%1."/>
+      <w:lvlJc w:val="left"/>
+      <w:pPr>
+        <w:tabs>
+          <w:tab w:val="num" w:pos="720"/>
+        </w:tabs>
+        <w:ind w:left="720" w:hanging="360"/>
+      </w:pPr>
+    </w:lvl>
+    <w:lvl w:ilvl="1" w:tentative="1">
+      <w:start w:val="1"/>
+      <w:numFmt w:val="decimal"/>
+      <w:lvlText w:val="%2."/>
+      <w:lvlJc w:val="left"/>
+      <w:pPr>
+        <w:tabs>
+          <w:tab w:val="num" w:pos="1440"/>
+        </w:tabs>
+        <w:ind w:left="1440" w:hanging="360"/>
+      </w:pPr>
+    </w:lvl>
+    <w:lvl w:ilvl="2" w:tentative="1">
+      <w:start w:val="1"/>
+      <w:numFmt w:val="decimal"/>
+      <w:lvlText w:val="%3."/>
+      <w:lvlJc w:val="left"/>
+      <w:pPr>
+        <w:tabs>
+          <w:tab w:val="num" w:pos="2160"/>
+        </w:tabs>
+        <w:ind w:left="2160" w:hanging="360"/>
+      </w:pPr>
+    </w:lvl>
+    <w:lvl w:ilvl="3" w:tentative="1">
+      <w:start w:val="1"/>
+      <w:numFmt w:val="decimal"/>
+      <w:lvlText w:val="%4."/>
+      <w:lvlJc w:val="left"/>
+      <w:pPr>
+        <w:tabs>
+          <w:tab w:val="num" w:pos="2880"/>
+        </w:tabs>
+        <w:ind w:left="2880" w:hanging="360"/>
+      </w:pPr>
+    </w:lvl>
+    <w:lvl w:ilvl="4" w:tentative="1">
+      <w:start w:val="1"/>
+      <w:numFmt w:val="decimal"/>
+      <w:lvlText w:val="%5."/>
+      <w:lvlJc w:val="left"/>
+      <w:pPr>
+        <w:tabs>
+          <w:tab w:val="num" w:pos="3600"/>
+        </w:tabs>
+        <w:ind w:left="3600" w:hanging="360"/>
+      </w:pPr>
+    </w:lvl>
+    <w:lvl w:ilvl="5" w:tentative="1">
+      <w:start w:val="1"/>
+      <w:numFmt w:val="decimal"/>
+      <w:lvlText w:val="%6."/>
+      <w:lvlJc w:val="left"/>
+      <w:pPr>
+        <w:tabs>
+          <w:tab w:val="num" w:pos="4320"/>
+        </w:tabs>
+        <w:ind w:left="4320" w:hanging="360"/>
+      </w:pPr>
+    </w:lvl>
+    <w:lvl w:ilvl="6" w:tentative="1">
+      <w:start w:val="1"/>
+      <w:numFmt w:val="decimal"/>
+      <w:lvlText w:val="%7."/>
+      <w:lvlJc w:val="left"/>
+      <w:pPr>
+        <w:tabs>
+          <w:tab w:val="num" w:pos="5040"/>
+        </w:tabs>
+        <w:ind w:left="5040" w:hanging="360"/>
+      </w:pPr>
+    </w:lvl>
+    <w:lvl w:ilvl="7" w:tentative="1">
+      <w:start w:val="1"/>
+      <w:numFmt w:val="decimal"/>
+      <w:lvlText w:val="%8."/>
+      <w:lvlJc w:val="left"/>
+      <w:pPr>
+        <w:tabs>
+          <w:tab w:val="num" w:pos="5760"/>
+        </w:tabs>
+        <w:ind w:left="5760" w:hanging="360"/>
+      </w:pPr>
+    </w:lvl>
+    <w:lvl w:ilvl="8" w:tentative="1">
+      <w:start w:val="1"/>
+      <w:numFmt w:val="decimal"/>
+      <w:lvlText w:val="%9."/>
+      <w:lvlJc w:val="left"/>
+      <w:pPr>
+        <w:tabs>
+          <w:tab w:val="num" w:pos="6480"/>
+        </w:tabs>
+        <w:ind w:left="6480" w:hanging="360"/>
+      </w:pPr>
+    </w:lvl>
+  </w:abstractNum>
+  <w:abstractNum w:abstractNumId="8" w15:restartNumberingAfterBreak="0">
+    <w:nsid w:val="38CC3B28"/>
+    <w:multiLevelType w:val="multilevel"/>
+    <w:tmpl w:val="6E563286"/>
+    <w:lvl w:ilvl="0">
+      <w:start w:val="1"/>
+      <w:numFmt w:val="bullet"/>
+      <w:lvlText w:val=""/>
+      <w:lvlJc w:val="left"/>
+      <w:pPr>
+        <w:tabs>
+          <w:tab w:val="num" w:pos="720"/>
+        </w:tabs>
+        <w:ind w:left="720" w:hanging="360"/>
+      </w:pPr>
+      <w:rPr>
+        <w:rFonts w:ascii="Symbol" w:hAnsi="Symbol" w:hint="default"/>
+        <w:sz w:val="20"/>
+      </w:rPr>
+    </w:lvl>
+    <w:lvl w:ilvl="1" w:tentative="1">
+      <w:start w:val="1"/>
+      <w:numFmt w:val="bullet"/>
+      <w:lvlText w:val="o"/>
+      <w:lvlJc w:val="left"/>
+      <w:pPr>
+        <w:tabs>
+          <w:tab w:val="num" w:pos="1440"/>
+        </w:tabs>
+        <w:ind w:left="1440" w:hanging="360"/>
+      </w:pPr>
+      <w:rPr>
+        <w:rFonts w:ascii="Courier New" w:hAnsi="Courier New" w:hint="default"/>
+        <w:sz w:val="20"/>
+      </w:rPr>
+    </w:lvl>
+    <w:lvl w:ilvl="2" w:tentative="1">
+      <w:start w:val="1"/>
+      <w:numFmt w:val="bullet"/>
+      <w:lvlText w:val=""/>
+      <w:lvlJc w:val="left"/>
+      <w:pPr>
+        <w:tabs>
+          <w:tab w:val="num" w:pos="2160"/>
+        </w:tabs>
+        <w:ind w:left="2160" w:hanging="360"/>
+      </w:pPr>
+      <w:rPr>
+        <w:rFonts w:ascii="Wingdings" w:hAnsi="Wingdings" w:hint="default"/>
+        <w:sz w:val="20"/>
+      </w:rPr>
+    </w:lvl>
+    <w:lvl w:ilvl="3" w:tentative="1">
+      <w:start w:val="1"/>
+      <w:numFmt w:val="bullet"/>
+      <w:lvlText w:val=""/>
+      <w:lvlJc w:val="left"/>
+      <w:pPr>
+        <w:tabs>
+          <w:tab w:val="num" w:pos="2880"/>
+        </w:tabs>
+        <w:ind w:left="2880" w:hanging="360"/>
+      </w:pPr>
+      <w:rPr>
+        <w:rFonts w:ascii="Wingdings" w:hAnsi="Wingdings" w:hint="default"/>
+        <w:sz w:val="20"/>
+      </w:rPr>
+    </w:lvl>
+    <w:lvl w:ilvl="4" w:tentative="1">
+      <w:start w:val="1"/>
+      <w:numFmt w:val="bullet"/>
+      <w:lvlText w:val=""/>
+      <w:lvlJc w:val="left"/>
+      <w:pPr>
+        <w:tabs>
+          <w:tab w:val="num" w:pos="3600"/>
+        </w:tabs>
+        <w:ind w:left="3600" w:hanging="360"/>
+      </w:pPr>
+      <w:rPr>
+        <w:rFonts w:ascii="Wingdings" w:hAnsi="Wingdings" w:hint="default"/>
+        <w:sz w:val="20"/>
+      </w:rPr>
+    </w:lvl>
+    <w:lvl w:ilvl="5" w:tentative="1">
+      <w:start w:val="1"/>
+      <w:numFmt w:val="bullet"/>
+      <w:lvlText w:val=""/>
+      <w:lvlJc w:val="left"/>
+      <w:pPr>
+        <w:tabs>
+          <w:tab w:val="num" w:pos="4320"/>
+        </w:tabs>
+        <w:ind w:left="4320" w:hanging="360"/>
+      </w:pPr>
+      <w:rPr>
+        <w:rFonts w:ascii="Wingdings" w:hAnsi="Wingdings" w:hint="default"/>
+        <w:sz w:val="20"/>
+      </w:rPr>
+    </w:lvl>
+    <w:lvl w:ilvl="6" w:tentative="1">
+      <w:start w:val="1"/>
+      <w:numFmt w:val="bullet"/>
+      <w:lvlText w:val=""/>
+      <w:lvlJc w:val="left"/>
+      <w:pPr>
+        <w:tabs>
+          <w:tab w:val="num" w:pos="5040"/>
+        </w:tabs>
+        <w:ind w:left="5040" w:hanging="360"/>
+      </w:pPr>
+      <w:rPr>
+        <w:rFonts w:ascii="Wingdings" w:hAnsi="Wingdings" w:hint="default"/>
+        <w:sz w:val="20"/>
+      </w:rPr>
+    </w:lvl>
+    <w:lvl w:ilvl="7" w:tentative="1">
+      <w:start w:val="1"/>
+      <w:numFmt w:val="bullet"/>
+      <w:lvlText w:val=""/>
+      <w:lvlJc w:val="left"/>
+      <w:pPr>
+        <w:tabs>
+          <w:tab w:val="num" w:pos="5760"/>
+        </w:tabs>
+        <w:ind w:left="5760" w:hanging="360"/>
+      </w:pPr>
+      <w:rPr>
+        <w:rFonts w:ascii="Wingdings" w:hAnsi="Wingdings" w:hint="default"/>
+        <w:sz w:val="20"/>
+      </w:rPr>
+    </w:lvl>
+    <w:lvl w:ilvl="8" w:tentative="1">
+      <w:start w:val="1"/>
+      <w:numFmt w:val="bullet"/>
+      <w:lvlText w:val=""/>
+      <w:lvlJc w:val="left"/>
+      <w:pPr>
+        <w:tabs>
+          <w:tab w:val="num" w:pos="6480"/>
+        </w:tabs>
+        <w:ind w:left="6480" w:hanging="360"/>
+      </w:pPr>
+      <w:rPr>
+        <w:rFonts w:ascii="Wingdings" w:hAnsi="Wingdings" w:hint="default"/>
+        <w:sz w:val="20"/>
+      </w:rPr>
+    </w:lvl>
+  </w:abstractNum>
+  <w:abstractNum w:abstractNumId="9" w15:restartNumberingAfterBreak="0">
     <w:nsid w:val="38D1780E"/>
     <w:multiLevelType w:val="multilevel"/>
     <w:tmpl w:val="20BAFCE4"/>
@@ -4695,7 +6891,454 @@
       </w:rPr>
     </w:lvl>
   </w:abstractNum>
-  <w:abstractNum w:abstractNumId="2" w15:restartNumberingAfterBreak="0">
+  <w:abstractNum w:abstractNumId="10" w15:restartNumberingAfterBreak="0">
+    <w:nsid w:val="3E550C1A"/>
+    <w:multiLevelType w:val="multilevel"/>
+    <w:tmpl w:val="FDC29566"/>
+    <w:lvl w:ilvl="0">
+      <w:start w:val="1"/>
+      <w:numFmt w:val="bullet"/>
+      <w:lvlText w:val=""/>
+      <w:lvlJc w:val="left"/>
+      <w:pPr>
+        <w:tabs>
+          <w:tab w:val="num" w:pos="720"/>
+        </w:tabs>
+        <w:ind w:left="720" w:hanging="360"/>
+      </w:pPr>
+      <w:rPr>
+        <w:rFonts w:ascii="Symbol" w:hAnsi="Symbol" w:hint="default"/>
+        <w:sz w:val="20"/>
+      </w:rPr>
+    </w:lvl>
+    <w:lvl w:ilvl="1" w:tentative="1">
+      <w:start w:val="1"/>
+      <w:numFmt w:val="bullet"/>
+      <w:lvlText w:val="o"/>
+      <w:lvlJc w:val="left"/>
+      <w:pPr>
+        <w:tabs>
+          <w:tab w:val="num" w:pos="1440"/>
+        </w:tabs>
+        <w:ind w:left="1440" w:hanging="360"/>
+      </w:pPr>
+      <w:rPr>
+        <w:rFonts w:ascii="Courier New" w:hAnsi="Courier New" w:hint="default"/>
+        <w:sz w:val="20"/>
+      </w:rPr>
+    </w:lvl>
+    <w:lvl w:ilvl="2" w:tentative="1">
+      <w:start w:val="1"/>
+      <w:numFmt w:val="bullet"/>
+      <w:lvlText w:val=""/>
+      <w:lvlJc w:val="left"/>
+      <w:pPr>
+        <w:tabs>
+          <w:tab w:val="num" w:pos="2160"/>
+        </w:tabs>
+        <w:ind w:left="2160" w:hanging="360"/>
+      </w:pPr>
+      <w:rPr>
+        <w:rFonts w:ascii="Wingdings" w:hAnsi="Wingdings" w:hint="default"/>
+        <w:sz w:val="20"/>
+      </w:rPr>
+    </w:lvl>
+    <w:lvl w:ilvl="3" w:tentative="1">
+      <w:start w:val="1"/>
+      <w:numFmt w:val="bullet"/>
+      <w:lvlText w:val=""/>
+      <w:lvlJc w:val="left"/>
+      <w:pPr>
+        <w:tabs>
+          <w:tab w:val="num" w:pos="2880"/>
+        </w:tabs>
+        <w:ind w:left="2880" w:hanging="360"/>
+      </w:pPr>
+      <w:rPr>
+        <w:rFonts w:ascii="Wingdings" w:hAnsi="Wingdings" w:hint="default"/>
+        <w:sz w:val="20"/>
+      </w:rPr>
+    </w:lvl>
+    <w:lvl w:ilvl="4" w:tentative="1">
+      <w:start w:val="1"/>
+      <w:numFmt w:val="bullet"/>
+      <w:lvlText w:val=""/>
+      <w:lvlJc w:val="left"/>
+      <w:pPr>
+        <w:tabs>
+          <w:tab w:val="num" w:pos="3600"/>
+        </w:tabs>
+        <w:ind w:left="3600" w:hanging="360"/>
+      </w:pPr>
+      <w:rPr>
+        <w:rFonts w:ascii="Wingdings" w:hAnsi="Wingdings" w:hint="default"/>
+        <w:sz w:val="20"/>
+      </w:rPr>
+    </w:lvl>
+    <w:lvl w:ilvl="5" w:tentative="1">
+      <w:start w:val="1"/>
+      <w:numFmt w:val="bullet"/>
+      <w:lvlText w:val=""/>
+      <w:lvlJc w:val="left"/>
+      <w:pPr>
+        <w:tabs>
+          <w:tab w:val="num" w:pos="4320"/>
+        </w:tabs>
+        <w:ind w:left="4320" w:hanging="360"/>
+      </w:pPr>
+      <w:rPr>
+        <w:rFonts w:ascii="Wingdings" w:hAnsi="Wingdings" w:hint="default"/>
+        <w:sz w:val="20"/>
+      </w:rPr>
+    </w:lvl>
+    <w:lvl w:ilvl="6" w:tentative="1">
+      <w:start w:val="1"/>
+      <w:numFmt w:val="bullet"/>
+      <w:lvlText w:val=""/>
+      <w:lvlJc w:val="left"/>
+      <w:pPr>
+        <w:tabs>
+          <w:tab w:val="num" w:pos="5040"/>
+        </w:tabs>
+        <w:ind w:left="5040" w:hanging="360"/>
+      </w:pPr>
+      <w:rPr>
+        <w:rFonts w:ascii="Wingdings" w:hAnsi="Wingdings" w:hint="default"/>
+        <w:sz w:val="20"/>
+      </w:rPr>
+    </w:lvl>
+    <w:lvl w:ilvl="7" w:tentative="1">
+      <w:start w:val="1"/>
+      <w:numFmt w:val="bullet"/>
+      <w:lvlText w:val=""/>
+      <w:lvlJc w:val="left"/>
+      <w:pPr>
+        <w:tabs>
+          <w:tab w:val="num" w:pos="5760"/>
+        </w:tabs>
+        <w:ind w:left="5760" w:hanging="360"/>
+      </w:pPr>
+      <w:rPr>
+        <w:rFonts w:ascii="Wingdings" w:hAnsi="Wingdings" w:hint="default"/>
+        <w:sz w:val="20"/>
+      </w:rPr>
+    </w:lvl>
+    <w:lvl w:ilvl="8" w:tentative="1">
+      <w:start w:val="1"/>
+      <w:numFmt w:val="bullet"/>
+      <w:lvlText w:val=""/>
+      <w:lvlJc w:val="left"/>
+      <w:pPr>
+        <w:tabs>
+          <w:tab w:val="num" w:pos="6480"/>
+        </w:tabs>
+        <w:ind w:left="6480" w:hanging="360"/>
+      </w:pPr>
+      <w:rPr>
+        <w:rFonts w:ascii="Wingdings" w:hAnsi="Wingdings" w:hint="default"/>
+        <w:sz w:val="20"/>
+      </w:rPr>
+    </w:lvl>
+  </w:abstractNum>
+  <w:abstractNum w:abstractNumId="11" w15:restartNumberingAfterBreak="0">
+    <w:nsid w:val="48CA262A"/>
+    <w:multiLevelType w:val="multilevel"/>
+    <w:tmpl w:val="CA42EE74"/>
+    <w:lvl w:ilvl="0">
+      <w:start w:val="1"/>
+      <w:numFmt w:val="bullet"/>
+      <w:lvlText w:val=""/>
+      <w:lvlJc w:val="left"/>
+      <w:pPr>
+        <w:tabs>
+          <w:tab w:val="num" w:pos="720"/>
+        </w:tabs>
+        <w:ind w:left="720" w:hanging="360"/>
+      </w:pPr>
+      <w:rPr>
+        <w:rFonts w:ascii="Symbol" w:hAnsi="Symbol" w:hint="default"/>
+        <w:sz w:val="20"/>
+      </w:rPr>
+    </w:lvl>
+    <w:lvl w:ilvl="1" w:tentative="1">
+      <w:start w:val="1"/>
+      <w:numFmt w:val="bullet"/>
+      <w:lvlText w:val="o"/>
+      <w:lvlJc w:val="left"/>
+      <w:pPr>
+        <w:tabs>
+          <w:tab w:val="num" w:pos="1440"/>
+        </w:tabs>
+        <w:ind w:left="1440" w:hanging="360"/>
+      </w:pPr>
+      <w:rPr>
+        <w:rFonts w:ascii="Courier New" w:hAnsi="Courier New" w:hint="default"/>
+        <w:sz w:val="20"/>
+      </w:rPr>
+    </w:lvl>
+    <w:lvl w:ilvl="2" w:tentative="1">
+      <w:start w:val="1"/>
+      <w:numFmt w:val="bullet"/>
+      <w:lvlText w:val=""/>
+      <w:lvlJc w:val="left"/>
+      <w:pPr>
+        <w:tabs>
+          <w:tab w:val="num" w:pos="2160"/>
+        </w:tabs>
+        <w:ind w:left="2160" w:hanging="360"/>
+      </w:pPr>
+      <w:rPr>
+        <w:rFonts w:ascii="Wingdings" w:hAnsi="Wingdings" w:hint="default"/>
+        <w:sz w:val="20"/>
+      </w:rPr>
+    </w:lvl>
+    <w:lvl w:ilvl="3" w:tentative="1">
+      <w:start w:val="1"/>
+      <w:numFmt w:val="bullet"/>
+      <w:lvlText w:val=""/>
+      <w:lvlJc w:val="left"/>
+      <w:pPr>
+        <w:tabs>
+          <w:tab w:val="num" w:pos="2880"/>
+        </w:tabs>
+        <w:ind w:left="2880" w:hanging="360"/>
+      </w:pPr>
+      <w:rPr>
+        <w:rFonts w:ascii="Wingdings" w:hAnsi="Wingdings" w:hint="default"/>
+        <w:sz w:val="20"/>
+      </w:rPr>
+    </w:lvl>
+    <w:lvl w:ilvl="4" w:tentative="1">
+      <w:start w:val="1"/>
+      <w:numFmt w:val="bullet"/>
+      <w:lvlText w:val=""/>
+      <w:lvlJc w:val="left"/>
+      <w:pPr>
+        <w:tabs>
+          <w:tab w:val="num" w:pos="3600"/>
+        </w:tabs>
+        <w:ind w:left="3600" w:hanging="360"/>
+      </w:pPr>
+      <w:rPr>
+        <w:rFonts w:ascii="Wingdings" w:hAnsi="Wingdings" w:hint="default"/>
+        <w:sz w:val="20"/>
+      </w:rPr>
+    </w:lvl>
+    <w:lvl w:ilvl="5" w:tentative="1">
+      <w:start w:val="1"/>
+      <w:numFmt w:val="bullet"/>
+      <w:lvlText w:val=""/>
+      <w:lvlJc w:val="left"/>
+      <w:pPr>
+        <w:tabs>
+          <w:tab w:val="num" w:pos="4320"/>
+        </w:tabs>
+        <w:ind w:left="4320" w:hanging="360"/>
+      </w:pPr>
+      <w:rPr>
+        <w:rFonts w:ascii="Wingdings" w:hAnsi="Wingdings" w:hint="default"/>
+        <w:sz w:val="20"/>
+      </w:rPr>
+    </w:lvl>
+    <w:lvl w:ilvl="6" w:tentative="1">
+      <w:start w:val="1"/>
+      <w:numFmt w:val="bullet"/>
+      <w:lvlText w:val=""/>
+      <w:lvlJc w:val="left"/>
+      <w:pPr>
+        <w:tabs>
+          <w:tab w:val="num" w:pos="5040"/>
+        </w:tabs>
+        <w:ind w:left="5040" w:hanging="360"/>
+      </w:pPr>
+      <w:rPr>
+        <w:rFonts w:ascii="Wingdings" w:hAnsi="Wingdings" w:hint="default"/>
+        <w:sz w:val="20"/>
+      </w:rPr>
+    </w:lvl>
+    <w:lvl w:ilvl="7" w:tentative="1">
+      <w:start w:val="1"/>
+      <w:numFmt w:val="bullet"/>
+      <w:lvlText w:val=""/>
+      <w:lvlJc w:val="left"/>
+      <w:pPr>
+        <w:tabs>
+          <w:tab w:val="num" w:pos="5760"/>
+        </w:tabs>
+        <w:ind w:left="5760" w:hanging="360"/>
+      </w:pPr>
+      <w:rPr>
+        <w:rFonts w:ascii="Wingdings" w:hAnsi="Wingdings" w:hint="default"/>
+        <w:sz w:val="20"/>
+      </w:rPr>
+    </w:lvl>
+    <w:lvl w:ilvl="8" w:tentative="1">
+      <w:start w:val="1"/>
+      <w:numFmt w:val="bullet"/>
+      <w:lvlText w:val=""/>
+      <w:lvlJc w:val="left"/>
+      <w:pPr>
+        <w:tabs>
+          <w:tab w:val="num" w:pos="6480"/>
+        </w:tabs>
+        <w:ind w:left="6480" w:hanging="360"/>
+      </w:pPr>
+      <w:rPr>
+        <w:rFonts w:ascii="Wingdings" w:hAnsi="Wingdings" w:hint="default"/>
+        <w:sz w:val="20"/>
+      </w:rPr>
+    </w:lvl>
+  </w:abstractNum>
+  <w:abstractNum w:abstractNumId="12" w15:restartNumberingAfterBreak="0">
+    <w:nsid w:val="4C982440"/>
+    <w:multiLevelType w:val="multilevel"/>
+    <w:tmpl w:val="D5D021AC"/>
+    <w:lvl w:ilvl="0">
+      <w:start w:val="1"/>
+      <w:numFmt w:val="bullet"/>
+      <w:lvlText w:val=""/>
+      <w:lvlJc w:val="left"/>
+      <w:pPr>
+        <w:tabs>
+          <w:tab w:val="num" w:pos="720"/>
+        </w:tabs>
+        <w:ind w:left="720" w:hanging="360"/>
+      </w:pPr>
+      <w:rPr>
+        <w:rFonts w:ascii="Symbol" w:hAnsi="Symbol" w:hint="default"/>
+        <w:sz w:val="20"/>
+      </w:rPr>
+    </w:lvl>
+    <w:lvl w:ilvl="1" w:tentative="1">
+      <w:start w:val="1"/>
+      <w:numFmt w:val="bullet"/>
+      <w:lvlText w:val="o"/>
+      <w:lvlJc w:val="left"/>
+      <w:pPr>
+        <w:tabs>
+          <w:tab w:val="num" w:pos="1440"/>
+        </w:tabs>
+        <w:ind w:left="1440" w:hanging="360"/>
+      </w:pPr>
+      <w:rPr>
+        <w:rFonts w:ascii="Courier New" w:hAnsi="Courier New" w:hint="default"/>
+        <w:sz w:val="20"/>
+      </w:rPr>
+    </w:lvl>
+    <w:lvl w:ilvl="2" w:tentative="1">
+      <w:start w:val="1"/>
+      <w:numFmt w:val="bullet"/>
+      <w:lvlText w:val=""/>
+      <w:lvlJc w:val="left"/>
+      <w:pPr>
+        <w:tabs>
+          <w:tab w:val="num" w:pos="2160"/>
+        </w:tabs>
+        <w:ind w:left="2160" w:hanging="360"/>
+      </w:pPr>
+      <w:rPr>
+        <w:rFonts w:ascii="Wingdings" w:hAnsi="Wingdings" w:hint="default"/>
+        <w:sz w:val="20"/>
+      </w:rPr>
+    </w:lvl>
+    <w:lvl w:ilvl="3" w:tentative="1">
+      <w:start w:val="1"/>
+      <w:numFmt w:val="bullet"/>
+      <w:lvlText w:val=""/>
+      <w:lvlJc w:val="left"/>
+      <w:pPr>
+        <w:tabs>
+          <w:tab w:val="num" w:pos="2880"/>
+        </w:tabs>
+        <w:ind w:left="2880" w:hanging="360"/>
+      </w:pPr>
+      <w:rPr>
+        <w:rFonts w:ascii="Wingdings" w:hAnsi="Wingdings" w:hint="default"/>
+        <w:sz w:val="20"/>
+      </w:rPr>
+    </w:lvl>
+    <w:lvl w:ilvl="4" w:tentative="1">
+      <w:start w:val="1"/>
+      <w:numFmt w:val="bullet"/>
+      <w:lvlText w:val=""/>
+      <w:lvlJc w:val="left"/>
+      <w:pPr>
+        <w:tabs>
+          <w:tab w:val="num" w:pos="3600"/>
+        </w:tabs>
+        <w:ind w:left="3600" w:hanging="360"/>
+      </w:pPr>
+      <w:rPr>
+        <w:rFonts w:ascii="Wingdings" w:hAnsi="Wingdings" w:hint="default"/>
+        <w:sz w:val="20"/>
+      </w:rPr>
+    </w:lvl>
+    <w:lvl w:ilvl="5" w:tentative="1">
+      <w:start w:val="1"/>
+      <w:numFmt w:val="bullet"/>
+      <w:lvlText w:val=""/>
+      <w:lvlJc w:val="left"/>
+      <w:pPr>
+        <w:tabs>
+          <w:tab w:val="num" w:pos="4320"/>
+        </w:tabs>
+        <w:ind w:left="4320" w:hanging="360"/>
+      </w:pPr>
+      <w:rPr>
+        <w:rFonts w:ascii="Wingdings" w:hAnsi="Wingdings" w:hint="default"/>
+        <w:sz w:val="20"/>
+      </w:rPr>
+    </w:lvl>
+    <w:lvl w:ilvl="6" w:tentative="1">
+      <w:start w:val="1"/>
+      <w:numFmt w:val="bullet"/>
+      <w:lvlText w:val=""/>
+      <w:lvlJc w:val="left"/>
+      <w:pPr>
+        <w:tabs>
+          <w:tab w:val="num" w:pos="5040"/>
+        </w:tabs>
+        <w:ind w:left="5040" w:hanging="360"/>
+      </w:pPr>
+      <w:rPr>
+        <w:rFonts w:ascii="Wingdings" w:hAnsi="Wingdings" w:hint="default"/>
+        <w:sz w:val="20"/>
+      </w:rPr>
+    </w:lvl>
+    <w:lvl w:ilvl="7" w:tentative="1">
+      <w:start w:val="1"/>
+      <w:numFmt w:val="bullet"/>
+      <w:lvlText w:val=""/>
+      <w:lvlJc w:val="left"/>
+      <w:pPr>
+        <w:tabs>
+          <w:tab w:val="num" w:pos="5760"/>
+        </w:tabs>
+        <w:ind w:left="5760" w:hanging="360"/>
+      </w:pPr>
+      <w:rPr>
+        <w:rFonts w:ascii="Wingdings" w:hAnsi="Wingdings" w:hint="default"/>
+        <w:sz w:val="20"/>
+      </w:rPr>
+    </w:lvl>
+    <w:lvl w:ilvl="8" w:tentative="1">
+      <w:start w:val="1"/>
+      <w:numFmt w:val="bullet"/>
+      <w:lvlText w:val=""/>
+      <w:lvlJc w:val="left"/>
+      <w:pPr>
+        <w:tabs>
+          <w:tab w:val="num" w:pos="6480"/>
+        </w:tabs>
+        <w:ind w:left="6480" w:hanging="360"/>
+      </w:pPr>
+      <w:rPr>
+        <w:rFonts w:ascii="Wingdings" w:hAnsi="Wingdings" w:hint="default"/>
+        <w:sz w:val="20"/>
+      </w:rPr>
+    </w:lvl>
+  </w:abstractNum>
+  <w:abstractNum w:abstractNumId="13" w15:restartNumberingAfterBreak="0">
     <w:nsid w:val="533B5278"/>
     <w:multiLevelType w:val="multilevel"/>
     <w:tmpl w:val="0EEA8710"/>
@@ -4816,7 +7459,156 @@
       </w:pPr>
     </w:lvl>
   </w:abstractNum>
-  <w:abstractNum w:abstractNumId="3" w15:restartNumberingAfterBreak="0">
+  <w:abstractNum w:abstractNumId="14" w15:restartNumberingAfterBreak="0">
+    <w:nsid w:val="665877B8"/>
+    <w:multiLevelType w:val="multilevel"/>
+    <w:tmpl w:val="3AEAA7CC"/>
+    <w:lvl w:ilvl="0">
+      <w:start w:val="1"/>
+      <w:numFmt w:val="bullet"/>
+      <w:lvlText w:val=""/>
+      <w:lvlJc w:val="left"/>
+      <w:pPr>
+        <w:tabs>
+          <w:tab w:val="num" w:pos="720"/>
+        </w:tabs>
+        <w:ind w:left="720" w:hanging="360"/>
+      </w:pPr>
+      <w:rPr>
+        <w:rFonts w:ascii="Symbol" w:hAnsi="Symbol" w:hint="default"/>
+        <w:sz w:val="20"/>
+      </w:rPr>
+    </w:lvl>
+    <w:lvl w:ilvl="1" w:tentative="1">
+      <w:start w:val="1"/>
+      <w:numFmt w:val="bullet"/>
+      <w:lvlText w:val="o"/>
+      <w:lvlJc w:val="left"/>
+      <w:pPr>
+        <w:tabs>
+          <w:tab w:val="num" w:pos="1440"/>
+        </w:tabs>
+        <w:ind w:left="1440" w:hanging="360"/>
+      </w:pPr>
+      <w:rPr>
+        <w:rFonts w:ascii="Courier New" w:hAnsi="Courier New" w:hint="default"/>
+        <w:sz w:val="20"/>
+      </w:rPr>
+    </w:lvl>
+    <w:lvl w:ilvl="2" w:tentative="1">
+      <w:start w:val="1"/>
+      <w:numFmt w:val="bullet"/>
+      <w:lvlText w:val=""/>
+      <w:lvlJc w:val="left"/>
+      <w:pPr>
+        <w:tabs>
+          <w:tab w:val="num" w:pos="2160"/>
+        </w:tabs>
+        <w:ind w:left="2160" w:hanging="360"/>
+      </w:pPr>
+      <w:rPr>
+        <w:rFonts w:ascii="Wingdings" w:hAnsi="Wingdings" w:hint="default"/>
+        <w:sz w:val="20"/>
+      </w:rPr>
+    </w:lvl>
+    <w:lvl w:ilvl="3" w:tentative="1">
+      <w:start w:val="1"/>
+      <w:numFmt w:val="bullet"/>
+      <w:lvlText w:val=""/>
+      <w:lvlJc w:val="left"/>
+      <w:pPr>
+        <w:tabs>
+          <w:tab w:val="num" w:pos="2880"/>
+        </w:tabs>
+        <w:ind w:left="2880" w:hanging="360"/>
+      </w:pPr>
+      <w:rPr>
+        <w:rFonts w:ascii="Wingdings" w:hAnsi="Wingdings" w:hint="default"/>
+        <w:sz w:val="20"/>
+      </w:rPr>
+    </w:lvl>
+    <w:lvl w:ilvl="4" w:tentative="1">
+      <w:start w:val="1"/>
+      <w:numFmt w:val="bullet"/>
+      <w:lvlText w:val=""/>
+      <w:lvlJc w:val="left"/>
+      <w:pPr>
+        <w:tabs>
+          <w:tab w:val="num" w:pos="3600"/>
+        </w:tabs>
+        <w:ind w:left="3600" w:hanging="360"/>
+      </w:pPr>
+      <w:rPr>
+        <w:rFonts w:ascii="Wingdings" w:hAnsi="Wingdings" w:hint="default"/>
+        <w:sz w:val="20"/>
+      </w:rPr>
+    </w:lvl>
+    <w:lvl w:ilvl="5" w:tentative="1">
+      <w:start w:val="1"/>
+      <w:numFmt w:val="bullet"/>
+      <w:lvlText w:val=""/>
+      <w:lvlJc w:val="left"/>
+      <w:pPr>
+        <w:tabs>
+          <w:tab w:val="num" w:pos="4320"/>
+        </w:tabs>
+        <w:ind w:left="4320" w:hanging="360"/>
+      </w:pPr>
+      <w:rPr>
+        <w:rFonts w:ascii="Wingdings" w:hAnsi="Wingdings" w:hint="default"/>
+        <w:sz w:val="20"/>
+      </w:rPr>
+    </w:lvl>
+    <w:lvl w:ilvl="6" w:tentative="1">
+      <w:start w:val="1"/>
+      <w:numFmt w:val="bullet"/>
+      <w:lvlText w:val=""/>
+      <w:lvlJc w:val="left"/>
+      <w:pPr>
+        <w:tabs>
+          <w:tab w:val="num" w:pos="5040"/>
+        </w:tabs>
+        <w:ind w:left="5040" w:hanging="360"/>
+      </w:pPr>
+      <w:rPr>
+        <w:rFonts w:ascii="Wingdings" w:hAnsi="Wingdings" w:hint="default"/>
+        <w:sz w:val="20"/>
+      </w:rPr>
+    </w:lvl>
+    <w:lvl w:ilvl="7" w:tentative="1">
+      <w:start w:val="1"/>
+      <w:numFmt w:val="bullet"/>
+      <w:lvlText w:val=""/>
+      <w:lvlJc w:val="left"/>
+      <w:pPr>
+        <w:tabs>
+          <w:tab w:val="num" w:pos="5760"/>
+        </w:tabs>
+        <w:ind w:left="5760" w:hanging="360"/>
+      </w:pPr>
+      <w:rPr>
+        <w:rFonts w:ascii="Wingdings" w:hAnsi="Wingdings" w:hint="default"/>
+        <w:sz w:val="20"/>
+      </w:rPr>
+    </w:lvl>
+    <w:lvl w:ilvl="8" w:tentative="1">
+      <w:start w:val="1"/>
+      <w:numFmt w:val="bullet"/>
+      <w:lvlText w:val=""/>
+      <w:lvlJc w:val="left"/>
+      <w:pPr>
+        <w:tabs>
+          <w:tab w:val="num" w:pos="6480"/>
+        </w:tabs>
+        <w:ind w:left="6480" w:hanging="360"/>
+      </w:pPr>
+      <w:rPr>
+        <w:rFonts w:ascii="Wingdings" w:hAnsi="Wingdings" w:hint="default"/>
+        <w:sz w:val="20"/>
+      </w:rPr>
+    </w:lvl>
+  </w:abstractNum>
+  <w:abstractNum w:abstractNumId="15" w15:restartNumberingAfterBreak="0">
     <w:nsid w:val="6A7D03B9"/>
     <w:multiLevelType w:val="multilevel"/>
     <w:tmpl w:val="205843BE"/>
@@ -4965,7 +7757,305 @@
       </w:rPr>
     </w:lvl>
   </w:abstractNum>
-  <w:abstractNum w:abstractNumId="4" w15:restartNumberingAfterBreak="0">
+  <w:abstractNum w:abstractNumId="16" w15:restartNumberingAfterBreak="0">
+    <w:nsid w:val="6D9113C4"/>
+    <w:multiLevelType w:val="multilevel"/>
+    <w:tmpl w:val="D526CEA8"/>
+    <w:lvl w:ilvl="0">
+      <w:start w:val="1"/>
+      <w:numFmt w:val="bullet"/>
+      <w:lvlText w:val=""/>
+      <w:lvlJc w:val="left"/>
+      <w:pPr>
+        <w:tabs>
+          <w:tab w:val="num" w:pos="720"/>
+        </w:tabs>
+        <w:ind w:left="720" w:hanging="360"/>
+      </w:pPr>
+      <w:rPr>
+        <w:rFonts w:ascii="Symbol" w:hAnsi="Symbol" w:hint="default"/>
+        <w:sz w:val="20"/>
+      </w:rPr>
+    </w:lvl>
+    <w:lvl w:ilvl="1" w:tentative="1">
+      <w:start w:val="1"/>
+      <w:numFmt w:val="bullet"/>
+      <w:lvlText w:val="o"/>
+      <w:lvlJc w:val="left"/>
+      <w:pPr>
+        <w:tabs>
+          <w:tab w:val="num" w:pos="1440"/>
+        </w:tabs>
+        <w:ind w:left="1440" w:hanging="360"/>
+      </w:pPr>
+      <w:rPr>
+        <w:rFonts w:ascii="Courier New" w:hAnsi="Courier New" w:hint="default"/>
+        <w:sz w:val="20"/>
+      </w:rPr>
+    </w:lvl>
+    <w:lvl w:ilvl="2" w:tentative="1">
+      <w:start w:val="1"/>
+      <w:numFmt w:val="bullet"/>
+      <w:lvlText w:val=""/>
+      <w:lvlJc w:val="left"/>
+      <w:pPr>
+        <w:tabs>
+          <w:tab w:val="num" w:pos="2160"/>
+        </w:tabs>
+        <w:ind w:left="2160" w:hanging="360"/>
+      </w:pPr>
+      <w:rPr>
+        <w:rFonts w:ascii="Wingdings" w:hAnsi="Wingdings" w:hint="default"/>
+        <w:sz w:val="20"/>
+      </w:rPr>
+    </w:lvl>
+    <w:lvl w:ilvl="3" w:tentative="1">
+      <w:start w:val="1"/>
+      <w:numFmt w:val="bullet"/>
+      <w:lvlText w:val=""/>
+      <w:lvlJc w:val="left"/>
+      <w:pPr>
+        <w:tabs>
+          <w:tab w:val="num" w:pos="2880"/>
+        </w:tabs>
+        <w:ind w:left="2880" w:hanging="360"/>
+      </w:pPr>
+      <w:rPr>
+        <w:rFonts w:ascii="Wingdings" w:hAnsi="Wingdings" w:hint="default"/>
+        <w:sz w:val="20"/>
+      </w:rPr>
+    </w:lvl>
+    <w:lvl w:ilvl="4" w:tentative="1">
+      <w:start w:val="1"/>
+      <w:numFmt w:val="bullet"/>
+      <w:lvlText w:val=""/>
+      <w:lvlJc w:val="left"/>
+      <w:pPr>
+        <w:tabs>
+          <w:tab w:val="num" w:pos="3600"/>
+        </w:tabs>
+        <w:ind w:left="3600" w:hanging="360"/>
+      </w:pPr>
+      <w:rPr>
+        <w:rFonts w:ascii="Wingdings" w:hAnsi="Wingdings" w:hint="default"/>
+        <w:sz w:val="20"/>
+      </w:rPr>
+    </w:lvl>
+    <w:lvl w:ilvl="5" w:tentative="1">
+      <w:start w:val="1"/>
+      <w:numFmt w:val="bullet"/>
+      <w:lvlText w:val=""/>
+      <w:lvlJc w:val="left"/>
+      <w:pPr>
+        <w:tabs>
+          <w:tab w:val="num" w:pos="4320"/>
+        </w:tabs>
+        <w:ind w:left="4320" w:hanging="360"/>
+      </w:pPr>
+      <w:rPr>
+        <w:rFonts w:ascii="Wingdings" w:hAnsi="Wingdings" w:hint="default"/>
+        <w:sz w:val="20"/>
+      </w:rPr>
+    </w:lvl>
+    <w:lvl w:ilvl="6" w:tentative="1">
+      <w:start w:val="1"/>
+      <w:numFmt w:val="bullet"/>
+      <w:lvlText w:val=""/>
+      <w:lvlJc w:val="left"/>
+      <w:pPr>
+        <w:tabs>
+          <w:tab w:val="num" w:pos="5040"/>
+        </w:tabs>
+        <w:ind w:left="5040" w:hanging="360"/>
+      </w:pPr>
+      <w:rPr>
+        <w:rFonts w:ascii="Wingdings" w:hAnsi="Wingdings" w:hint="default"/>
+        <w:sz w:val="20"/>
+      </w:rPr>
+    </w:lvl>
+    <w:lvl w:ilvl="7" w:tentative="1">
+      <w:start w:val="1"/>
+      <w:numFmt w:val="bullet"/>
+      <w:lvlText w:val=""/>
+      <w:lvlJc w:val="left"/>
+      <w:pPr>
+        <w:tabs>
+          <w:tab w:val="num" w:pos="5760"/>
+        </w:tabs>
+        <w:ind w:left="5760" w:hanging="360"/>
+      </w:pPr>
+      <w:rPr>
+        <w:rFonts w:ascii="Wingdings" w:hAnsi="Wingdings" w:hint="default"/>
+        <w:sz w:val="20"/>
+      </w:rPr>
+    </w:lvl>
+    <w:lvl w:ilvl="8" w:tentative="1">
+      <w:start w:val="1"/>
+      <w:numFmt w:val="bullet"/>
+      <w:lvlText w:val=""/>
+      <w:lvlJc w:val="left"/>
+      <w:pPr>
+        <w:tabs>
+          <w:tab w:val="num" w:pos="6480"/>
+        </w:tabs>
+        <w:ind w:left="6480" w:hanging="360"/>
+      </w:pPr>
+      <w:rPr>
+        <w:rFonts w:ascii="Wingdings" w:hAnsi="Wingdings" w:hint="default"/>
+        <w:sz w:val="20"/>
+      </w:rPr>
+    </w:lvl>
+  </w:abstractNum>
+  <w:abstractNum w:abstractNumId="17" w15:restartNumberingAfterBreak="0">
+    <w:nsid w:val="6ECC63D1"/>
+    <w:multiLevelType w:val="multilevel"/>
+    <w:tmpl w:val="3B14DBDE"/>
+    <w:lvl w:ilvl="0">
+      <w:start w:val="1"/>
+      <w:numFmt w:val="bullet"/>
+      <w:lvlText w:val=""/>
+      <w:lvlJc w:val="left"/>
+      <w:pPr>
+        <w:tabs>
+          <w:tab w:val="num" w:pos="720"/>
+        </w:tabs>
+        <w:ind w:left="720" w:hanging="360"/>
+      </w:pPr>
+      <w:rPr>
+        <w:rFonts w:ascii="Symbol" w:hAnsi="Symbol" w:hint="default"/>
+        <w:sz w:val="20"/>
+      </w:rPr>
+    </w:lvl>
+    <w:lvl w:ilvl="1" w:tentative="1">
+      <w:start w:val="1"/>
+      <w:numFmt w:val="bullet"/>
+      <w:lvlText w:val="o"/>
+      <w:lvlJc w:val="left"/>
+      <w:pPr>
+        <w:tabs>
+          <w:tab w:val="num" w:pos="1440"/>
+        </w:tabs>
+        <w:ind w:left="1440" w:hanging="360"/>
+      </w:pPr>
+      <w:rPr>
+        <w:rFonts w:ascii="Courier New" w:hAnsi="Courier New" w:hint="default"/>
+        <w:sz w:val="20"/>
+      </w:rPr>
+    </w:lvl>
+    <w:lvl w:ilvl="2" w:tentative="1">
+      <w:start w:val="1"/>
+      <w:numFmt w:val="bullet"/>
+      <w:lvlText w:val=""/>
+      <w:lvlJc w:val="left"/>
+      <w:pPr>
+        <w:tabs>
+          <w:tab w:val="num" w:pos="2160"/>
+        </w:tabs>
+        <w:ind w:left="2160" w:hanging="360"/>
+      </w:pPr>
+      <w:rPr>
+        <w:rFonts w:ascii="Wingdings" w:hAnsi="Wingdings" w:hint="default"/>
+        <w:sz w:val="20"/>
+      </w:rPr>
+    </w:lvl>
+    <w:lvl w:ilvl="3" w:tentative="1">
+      <w:start w:val="1"/>
+      <w:numFmt w:val="bullet"/>
+      <w:lvlText w:val=""/>
+      <w:lvlJc w:val="left"/>
+      <w:pPr>
+        <w:tabs>
+          <w:tab w:val="num" w:pos="2880"/>
+        </w:tabs>
+        <w:ind w:left="2880" w:hanging="360"/>
+      </w:pPr>
+      <w:rPr>
+        <w:rFonts w:ascii="Wingdings" w:hAnsi="Wingdings" w:hint="default"/>
+        <w:sz w:val="20"/>
+      </w:rPr>
+    </w:lvl>
+    <w:lvl w:ilvl="4" w:tentative="1">
+      <w:start w:val="1"/>
+      <w:numFmt w:val="bullet"/>
+      <w:lvlText w:val=""/>
+      <w:lvlJc w:val="left"/>
+      <w:pPr>
+        <w:tabs>
+          <w:tab w:val="num" w:pos="3600"/>
+        </w:tabs>
+        <w:ind w:left="3600" w:hanging="360"/>
+      </w:pPr>
+      <w:rPr>
+        <w:rFonts w:ascii="Wingdings" w:hAnsi="Wingdings" w:hint="default"/>
+        <w:sz w:val="20"/>
+      </w:rPr>
+    </w:lvl>
+    <w:lvl w:ilvl="5" w:tentative="1">
+      <w:start w:val="1"/>
+      <w:numFmt w:val="bullet"/>
+      <w:lvlText w:val=""/>
+      <w:lvlJc w:val="left"/>
+      <w:pPr>
+        <w:tabs>
+          <w:tab w:val="num" w:pos="4320"/>
+        </w:tabs>
+        <w:ind w:left="4320" w:hanging="360"/>
+      </w:pPr>
+      <w:rPr>
+        <w:rFonts w:ascii="Wingdings" w:hAnsi="Wingdings" w:hint="default"/>
+        <w:sz w:val="20"/>
+      </w:rPr>
+    </w:lvl>
+    <w:lvl w:ilvl="6" w:tentative="1">
+      <w:start w:val="1"/>
+      <w:numFmt w:val="bullet"/>
+      <w:lvlText w:val=""/>
+      <w:lvlJc w:val="left"/>
+      <w:pPr>
+        <w:tabs>
+          <w:tab w:val="num" w:pos="5040"/>
+        </w:tabs>
+        <w:ind w:left="5040" w:hanging="360"/>
+      </w:pPr>
+      <w:rPr>
+        <w:rFonts w:ascii="Wingdings" w:hAnsi="Wingdings" w:hint="default"/>
+        <w:sz w:val="20"/>
+      </w:rPr>
+    </w:lvl>
+    <w:lvl w:ilvl="7" w:tentative="1">
+      <w:start w:val="1"/>
+      <w:numFmt w:val="bullet"/>
+      <w:lvlText w:val=""/>
+      <w:lvlJc w:val="left"/>
+      <w:pPr>
+        <w:tabs>
+          <w:tab w:val="num" w:pos="5760"/>
+        </w:tabs>
+        <w:ind w:left="5760" w:hanging="360"/>
+      </w:pPr>
+      <w:rPr>
+        <w:rFonts w:ascii="Wingdings" w:hAnsi="Wingdings" w:hint="default"/>
+        <w:sz w:val="20"/>
+      </w:rPr>
+    </w:lvl>
+    <w:lvl w:ilvl="8" w:tentative="1">
+      <w:start w:val="1"/>
+      <w:numFmt w:val="bullet"/>
+      <w:lvlText w:val=""/>
+      <w:lvlJc w:val="left"/>
+      <w:pPr>
+        <w:tabs>
+          <w:tab w:val="num" w:pos="6480"/>
+        </w:tabs>
+        <w:ind w:left="6480" w:hanging="360"/>
+      </w:pPr>
+      <w:rPr>
+        <w:rFonts w:ascii="Wingdings" w:hAnsi="Wingdings" w:hint="default"/>
+        <w:sz w:val="20"/>
+      </w:rPr>
+    </w:lvl>
+  </w:abstractNum>
+  <w:abstractNum w:abstractNumId="18" w15:restartNumberingAfterBreak="0">
     <w:nsid w:val="74676338"/>
     <w:multiLevelType w:val="multilevel"/>
     <w:tmpl w:val="2E921D20"/>
@@ -5114,20 +8204,214 @@
       </w:rPr>
     </w:lvl>
   </w:abstractNum>
+  <w:abstractNum w:abstractNumId="19" w15:restartNumberingAfterBreak="0">
+    <w:nsid w:val="748C79A6"/>
+    <w:multiLevelType w:val="multilevel"/>
+    <w:tmpl w:val="6D70DB6E"/>
+    <w:lvl w:ilvl="0">
+      <w:start w:val="1"/>
+      <w:numFmt w:val="bullet"/>
+      <w:lvlText w:val=""/>
+      <w:lvlJc w:val="left"/>
+      <w:pPr>
+        <w:tabs>
+          <w:tab w:val="num" w:pos="720"/>
+        </w:tabs>
+        <w:ind w:left="720" w:hanging="360"/>
+      </w:pPr>
+      <w:rPr>
+        <w:rFonts w:ascii="Symbol" w:hAnsi="Symbol" w:hint="default"/>
+        <w:sz w:val="20"/>
+      </w:rPr>
+    </w:lvl>
+    <w:lvl w:ilvl="1" w:tentative="1">
+      <w:start w:val="1"/>
+      <w:numFmt w:val="bullet"/>
+      <w:lvlText w:val="o"/>
+      <w:lvlJc w:val="left"/>
+      <w:pPr>
+        <w:tabs>
+          <w:tab w:val="num" w:pos="1440"/>
+        </w:tabs>
+        <w:ind w:left="1440" w:hanging="360"/>
+      </w:pPr>
+      <w:rPr>
+        <w:rFonts w:ascii="Courier New" w:hAnsi="Courier New" w:hint="default"/>
+        <w:sz w:val="20"/>
+      </w:rPr>
+    </w:lvl>
+    <w:lvl w:ilvl="2" w:tentative="1">
+      <w:start w:val="1"/>
+      <w:numFmt w:val="bullet"/>
+      <w:lvlText w:val=""/>
+      <w:lvlJc w:val="left"/>
+      <w:pPr>
+        <w:tabs>
+          <w:tab w:val="num" w:pos="2160"/>
+        </w:tabs>
+        <w:ind w:left="2160" w:hanging="360"/>
+      </w:pPr>
+      <w:rPr>
+        <w:rFonts w:ascii="Wingdings" w:hAnsi="Wingdings" w:hint="default"/>
+        <w:sz w:val="20"/>
+      </w:rPr>
+    </w:lvl>
+    <w:lvl w:ilvl="3" w:tentative="1">
+      <w:start w:val="1"/>
+      <w:numFmt w:val="bullet"/>
+      <w:lvlText w:val=""/>
+      <w:lvlJc w:val="left"/>
+      <w:pPr>
+        <w:tabs>
+          <w:tab w:val="num" w:pos="2880"/>
+        </w:tabs>
+        <w:ind w:left="2880" w:hanging="360"/>
+      </w:pPr>
+      <w:rPr>
+        <w:rFonts w:ascii="Wingdings" w:hAnsi="Wingdings" w:hint="default"/>
+        <w:sz w:val="20"/>
+      </w:rPr>
+    </w:lvl>
+    <w:lvl w:ilvl="4" w:tentative="1">
+      <w:start w:val="1"/>
+      <w:numFmt w:val="bullet"/>
+      <w:lvlText w:val=""/>
+      <w:lvlJc w:val="left"/>
+      <w:pPr>
+        <w:tabs>
+          <w:tab w:val="num" w:pos="3600"/>
+        </w:tabs>
+        <w:ind w:left="3600" w:hanging="360"/>
+      </w:pPr>
+      <w:rPr>
+        <w:rFonts w:ascii="Wingdings" w:hAnsi="Wingdings" w:hint="default"/>
+        <w:sz w:val="20"/>
+      </w:rPr>
+    </w:lvl>
+    <w:lvl w:ilvl="5" w:tentative="1">
+      <w:start w:val="1"/>
+      <w:numFmt w:val="bullet"/>
+      <w:lvlText w:val=""/>
+      <w:lvlJc w:val="left"/>
+      <w:pPr>
+        <w:tabs>
+          <w:tab w:val="num" w:pos="4320"/>
+        </w:tabs>
+        <w:ind w:left="4320" w:hanging="360"/>
+      </w:pPr>
+      <w:rPr>
+        <w:rFonts w:ascii="Wingdings" w:hAnsi="Wingdings" w:hint="default"/>
+        <w:sz w:val="20"/>
+      </w:rPr>
+    </w:lvl>
+    <w:lvl w:ilvl="6" w:tentative="1">
+      <w:start w:val="1"/>
+      <w:numFmt w:val="bullet"/>
+      <w:lvlText w:val=""/>
+      <w:lvlJc w:val="left"/>
+      <w:pPr>
+        <w:tabs>
+          <w:tab w:val="num" w:pos="5040"/>
+        </w:tabs>
+        <w:ind w:left="5040" w:hanging="360"/>
+      </w:pPr>
+      <w:rPr>
+        <w:rFonts w:ascii="Wingdings" w:hAnsi="Wingdings" w:hint="default"/>
+        <w:sz w:val="20"/>
+      </w:rPr>
+    </w:lvl>
+    <w:lvl w:ilvl="7" w:tentative="1">
+      <w:start w:val="1"/>
+      <w:numFmt w:val="bullet"/>
+      <w:lvlText w:val=""/>
+      <w:lvlJc w:val="left"/>
+      <w:pPr>
+        <w:tabs>
+          <w:tab w:val="num" w:pos="5760"/>
+        </w:tabs>
+        <w:ind w:left="5760" w:hanging="360"/>
+      </w:pPr>
+      <w:rPr>
+        <w:rFonts w:ascii="Wingdings" w:hAnsi="Wingdings" w:hint="default"/>
+        <w:sz w:val="20"/>
+      </w:rPr>
+    </w:lvl>
+    <w:lvl w:ilvl="8" w:tentative="1">
+      <w:start w:val="1"/>
+      <w:numFmt w:val="bullet"/>
+      <w:lvlText w:val=""/>
+      <w:lvlJc w:val="left"/>
+      <w:pPr>
+        <w:tabs>
+          <w:tab w:val="num" w:pos="6480"/>
+        </w:tabs>
+        <w:ind w:left="6480" w:hanging="360"/>
+      </w:pPr>
+      <w:rPr>
+        <w:rFonts w:ascii="Wingdings" w:hAnsi="Wingdings" w:hint="default"/>
+        <w:sz w:val="20"/>
+      </w:rPr>
+    </w:lvl>
+  </w:abstractNum>
   <w:num w:numId="1" w16cid:durableId="92216111">
+    <w:abstractNumId w:val="13"/>
+  </w:num>
+  <w:num w:numId="2" w16cid:durableId="527187117">
+    <w:abstractNumId w:val="3"/>
+  </w:num>
+  <w:num w:numId="3" w16cid:durableId="1281455928">
+    <w:abstractNumId w:val="18"/>
+  </w:num>
+  <w:num w:numId="4" w16cid:durableId="337585272">
+    <w:abstractNumId w:val="15"/>
+  </w:num>
+  <w:num w:numId="5" w16cid:durableId="1064065451">
+    <w:abstractNumId w:val="9"/>
+  </w:num>
+  <w:num w:numId="6" w16cid:durableId="1688293376">
+    <w:abstractNumId w:val="8"/>
+  </w:num>
+  <w:num w:numId="7" w16cid:durableId="956333315">
+    <w:abstractNumId w:val="11"/>
+  </w:num>
+  <w:num w:numId="8" w16cid:durableId="20712761">
+    <w:abstractNumId w:val="10"/>
+  </w:num>
+  <w:num w:numId="9" w16cid:durableId="1205945375">
+    <w:abstractNumId w:val="16"/>
+  </w:num>
+  <w:num w:numId="10" w16cid:durableId="857935102">
     <w:abstractNumId w:val="2"/>
   </w:num>
-  <w:num w:numId="2" w16cid:durableId="527187117">
+  <w:num w:numId="11" w16cid:durableId="1681007850">
+    <w:abstractNumId w:val="4"/>
+  </w:num>
+  <w:num w:numId="12" w16cid:durableId="1171602475">
+    <w:abstractNumId w:val="5"/>
+  </w:num>
+  <w:num w:numId="13" w16cid:durableId="2115589936">
+    <w:abstractNumId w:val="1"/>
+  </w:num>
+  <w:num w:numId="14" w16cid:durableId="1431387997">
     <w:abstractNumId w:val="0"/>
   </w:num>
-  <w:num w:numId="3" w16cid:durableId="1281455928">
-    <w:abstractNumId w:val="4"/>
+  <w:num w:numId="15" w16cid:durableId="1719359795">
+    <w:abstractNumId w:val="6"/>
   </w:num>
-  <w:num w:numId="4" w16cid:durableId="337585272">
-    <w:abstractNumId w:val="3"/>
+  <w:num w:numId="16" w16cid:durableId="218714346">
+    <w:abstractNumId w:val="12"/>
   </w:num>
-  <w:num w:numId="5" w16cid:durableId="1064065451">
-    <w:abstractNumId w:val="1"/>
+  <w:num w:numId="17" w16cid:durableId="1109668883">
+    <w:abstractNumId w:val="17"/>
+  </w:num>
+  <w:num w:numId="18" w16cid:durableId="1664121591">
+    <w:abstractNumId w:val="19"/>
+  </w:num>
+  <w:num w:numId="19" w16cid:durableId="18237834">
+    <w:abstractNumId w:val="7"/>
+  </w:num>
+  <w:num w:numId="20" w16cid:durableId="1835217564">
+    <w:abstractNumId w:val="14"/>
   </w:num>
 </w:numbering>
 </file>
@@ -5735,7 +9019,6 @@
   <w:style w:type="character" w:default="1" w:styleId="DefaultParagraphFont">
     <w:name w:val="Default Paragraph Font"/>
     <w:uiPriority w:val="1"/>
-    <w:semiHidden/>
     <w:unhideWhenUsed/>
   </w:style>
   <w:style w:type="table" w:default="1" w:styleId="TableNormal">

</xml_diff>

<commit_message>
Commit 5: - Added the summary of Burgess2014 paper in the "literature review.docx" file. - Also generate its pdf.
</commit_message>
<xml_diff>
--- a/Literature Review/literature review.docx
+++ b/Literature Review/literature review.docx
@@ -3,6 +3,22 @@
 <w:document xmlns:wpc="http://schemas.microsoft.com/office/word/2010/wordprocessingCanvas" xmlns:cx="http://schemas.microsoft.com/office/drawing/2014/chartex" xmlns:cx1="http://schemas.microsoft.com/office/drawing/2015/9/8/chartex" xmlns:cx2="http://schemas.microsoft.com/office/drawing/2015/10/21/chartex" xmlns:cx3="http://schemas.microsoft.com/office/drawing/2016/5/9/chartex" xmlns:cx4="http://schemas.microsoft.com/office/drawing/2016/5/10/chartex" xmlns:cx5="http://schemas.microsoft.com/office/drawing/2016/5/11/chartex" xmlns:cx6="http://schemas.microsoft.com/office/drawing/2016/5/12/chartex" xmlns:cx7="http://schemas.microsoft.com/office/drawing/2016/5/13/chartex" xmlns:cx8="http://schemas.microsoft.com/office/drawing/2016/5/14/chartex" xmlns:mc="http://schemas.openxmlformats.org/markup-compatibility/2006" xmlns:aink="http://schemas.microsoft.com/office/drawing/2016/ink" xmlns:am3d="http://schemas.microsoft.com/office/drawing/2017/model3d" xmlns:o="urn:schemas-microsoft-com:office:office" xmlns:oel="http://schemas.microsoft.com/office/2019/extlst" xmlns:r="http://schemas.openxmlformats.org/officeDocument/2006/relationships" xmlns:m="http://schemas.openxmlformats.org/officeDocument/2006/math" xmlns:v="urn:schemas-microsoft-com:vml" xmlns:wp14="http://schemas.microsoft.com/office/word/2010/wordprocessingDrawing" xmlns:wp="http://schemas.openxmlformats.org/drawingml/2006/wordprocessingDrawing" xmlns:w10="urn:schemas-microsoft-com:office:word" xmlns:w="http://schemas.openxmlformats.org/wordprocessingml/2006/main" xmlns:w14="http://schemas.microsoft.com/office/word/2010/wordml" xmlns:w15="http://schemas.microsoft.com/office/word/2012/wordml" xmlns:w16cex="http://schemas.microsoft.com/office/word/2018/wordml/cex" xmlns:w16cid="http://schemas.microsoft.com/office/word/2016/wordml/cid" xmlns:w16="http://schemas.microsoft.com/office/word/2018/wordml" xmlns:w16du="http://schemas.microsoft.com/office/word/2023/wordml/word16du" xmlns:w16sdtdh="http://schemas.microsoft.com/office/word/2020/wordml/sdtdatahash" xmlns:w16sdtfl="http://schemas.microsoft.com/office/word/2024/wordml/sdtformatlock" xmlns:w16se="http://schemas.microsoft.com/office/word/2015/wordml/symex" xmlns:wpg="http://schemas.microsoft.com/office/word/2010/wordprocessingGroup" xmlns:wpi="http://schemas.microsoft.com/office/word/2010/wordprocessingInk" xmlns:wne="http://schemas.microsoft.com/office/word/2006/wordml" xmlns:wps="http://schemas.microsoft.com/office/word/2010/wordprocessingShape" mc:Ignorable="w14 w15 w16se w16cid w16 w16cex w16sdtdh w16sdtfl w16du wp14">
   <w:body>
     <w:p>
+      <w:pPr>
+        <w:jc w:val="center"/>
+        <w:rPr>
+          <w:b/>
+          <w:bCs/>
+        </w:rPr>
+      </w:pPr>
+      <w:r>
+        <w:rPr>
+          <w:b/>
+          <w:bCs/>
+        </w:rPr>
+        <w:t>Literature review on the papers related to GRBs</w:t>
+      </w:r>
+    </w:p>
+    <w:p>
       <w:r>
         <w:t xml:space="preserve">A </w:t>
       </w:r>
@@ -113,11 +129,11 @@
     <w:p/>
     <w:p>
       <w:r>
-        <w:t xml:space="preserve">To resolve this, Goodman (1986) and Paczyński (1986) independently proposed the relativistic fireball model. In this scenario, the central engine injects a vast amount of energy into a very small volume, creating a hot, dense plasma composed of photons and abundant electron–positron pairs. The system is initially optically thick: photons scatter so frequently on pairs that their mean free path is much smaller than the source size, trapping the radiation and thermalizing it into a blackbody distribution. Radiation pressure then drives the plasma to expand at ultra–relativistic speeds. As the fireball expands, the density falls and the optical depth decreases. Eventually, at a certain radius, the outflow becomes optically thin, meaning </w:t>
+        <w:t xml:space="preserve">To resolve this, Goodman (1986) and Paczyński (1986) independently proposed the relativistic fireball model. In this scenario, the central engine injects a vast amount of energy into a very small volume, creating a hot, dense plasma composed of photons and abundant electron–positron pairs. The system is initially optically thick: photons scatter so frequently on pairs that their mean free path is much smaller than the source size, trapping the radiation and thermalizing it into a blackbody distribution. Radiation pressure then drives the plasma to expand at ultra–relativistic speeds. As the fireball expands, the density falls and the optical </w:t>
       </w:r>
       <w:r>
         <w:lastRenderedPageBreak/>
-        <w:t>photons can escape without further scattering. This “last scattering surface” is called the photosphere, and the emergent radiation is expected to be quasi–thermal.</w:t>
+        <w:t>depth decreases. Eventually, at a certain radius, the outflow becomes optically thin, meaning photons can escape without further scattering. This “last scattering surface” is called the photosphere, and the emergent radiation is expected to be quasi–thermal.</w:t>
       </w:r>
     </w:p>
     <w:p/>
@@ -154,17 +170,12 @@
       </w:r>
       <w:proofErr w:type="spellStart"/>
       <w:r>
-        <w:t>pache-</w:t>
-      </w:r>
-      <w:proofErr w:type="gramStart"/>
-      <w:r>
-        <w:t>zinski</w:t>
+        <w:t>pache-zinski</w:t>
       </w:r>
       <w:proofErr w:type="spellEnd"/>
       <w:r>
         <w:t xml:space="preserve"> )</w:t>
       </w:r>
-      <w:proofErr w:type="gramEnd"/>
       <w:r>
         <w:t>, 1986).</w:t>
       </w:r>
@@ -587,6 +598,14 @@
       <w:r>
         <w:t>.</w:t>
       </w:r>
+    </w:p>
+    <w:p>
+      <w:pPr>
+        <w:numPr>
+          <w:ilvl w:val="1"/>
+          <w:numId w:val="1"/>
+        </w:numPr>
+      </w:pPr>
       <w:r>
         <w:br w:type="page"/>
       </w:r>
@@ -1722,15 +1741,7 @@
           </w:tcPr>
           <w:p>
             <w:r>
-              <w:t>Time-resolved BATSE analysis. Introduced BB+PL fits to pulses, with decaying blackbody temperature (t</w:t>
-            </w:r>
-            <w:proofErr w:type="gramStart"/>
-            <w:r>
-              <w:t>^(</w:t>
-            </w:r>
-            <w:proofErr w:type="gramEnd"/>
-            <w:r>
-              <w:t xml:space="preserve">-2/3)). Showed thermal emission can be hidden in time-integrated spectra. Pioneering evidence for </w:t>
+              <w:t xml:space="preserve">Time-resolved BATSE analysis. Introduced BB+PL fits to pulses, with decaying blackbody temperature (t^(-2/3)). Showed thermal emission can be hidden in time-integrated spectra. Pioneering evidence for </w:t>
             </w:r>
             <w:proofErr w:type="spellStart"/>
             <w:r>
@@ -3635,7 +3646,7 @@
     <w:p>
       <w:r>
         <w:pict w14:anchorId="4D1B4159">
-          <v:rect id="_x0000_i1050" style="width:0;height:1.5pt" o:hralign="center" o:hrstd="t" o:hr="t" fillcolor="#a0a0a0" stroked="f"/>
+          <v:rect id="_x0000_i1026" style="width:0;height:1.5pt" o:hralign="center" o:hrstd="t" o:hr="t" fillcolor="#a0a0a0" stroked="f"/>
         </w:pict>
       </w:r>
     </w:p>
@@ -3807,7 +3818,7 @@
     <w:p>
       <w:r>
         <w:pict w14:anchorId="29A6CF0C">
-          <v:rect id="_x0000_i1051" style="width:0;height:1.5pt" o:hralign="center" o:hrstd="t" o:hr="t" fillcolor="#a0a0a0" stroked="f"/>
+          <v:rect id="_x0000_i1027" style="width:0;height:1.5pt" o:hralign="center" o:hrstd="t" o:hr="t" fillcolor="#a0a0a0" stroked="f"/>
         </w:pict>
       </w:r>
     </w:p>
@@ -3934,7 +3945,7 @@
     <w:p>
       <w:r>
         <w:pict w14:anchorId="7F61BF6B">
-          <v:rect id="_x0000_i1052" style="width:0;height:1.5pt" o:hralign="center" o:hrstd="t" o:hr="t" fillcolor="#a0a0a0" stroked="f"/>
+          <v:rect id="_x0000_i1028" style="width:0;height:1.5pt" o:hralign="center" o:hrstd="t" o:hr="t" fillcolor="#a0a0a0" stroked="f"/>
         </w:pict>
       </w:r>
     </w:p>
@@ -4034,7 +4045,7 @@
     <w:p>
       <w:r>
         <w:pict w14:anchorId="63F977AF">
-          <v:rect id="_x0000_i1053" style="width:0;height:1.5pt" o:hralign="center" o:hrstd="t" o:hr="t" fillcolor="#a0a0a0" stroked="f"/>
+          <v:rect id="_x0000_i1029" style="width:0;height:1.5pt" o:hralign="center" o:hrstd="t" o:hr="t" fillcolor="#a0a0a0" stroked="f"/>
         </w:pict>
       </w:r>
     </w:p>
@@ -4251,6 +4262,9 @@
     </w:p>
     <w:p>
       <w:r>
+        <w:rPr>
+          <w:noProof/>
+        </w:rPr>
         <w:lastRenderedPageBreak/>
         <w:drawing>
           <wp:anchor distT="0" distB="0" distL="114300" distR="114300" simplePos="0" relativeHeight="251658240" behindDoc="1" locked="0" layoutInCell="1" allowOverlap="1" wp14:anchorId="698C14B5" wp14:editId="10C67B1F">
@@ -4420,7 +4434,7 @@
     <w:p>
       <w:r>
         <w:pict w14:anchorId="67D57914">
-          <v:rect id="_x0000_i1070" style="width:0;height:1.5pt" o:hralign="center" o:hrstd="t" o:hr="t" fillcolor="#a0a0a0" stroked="f"/>
+          <v:rect id="_x0000_i1030" style="width:0;height:1.5pt" o:hralign="center" o:hrstd="t" o:hr="t" fillcolor="#a0a0a0" stroked="f"/>
         </w:pict>
       </w:r>
     </w:p>
@@ -4716,7 +4730,7 @@
     <w:p>
       <w:r>
         <w:pict w14:anchorId="0392F020">
-          <v:rect id="_x0000_i1071" style="width:0;height:1.5pt" o:hralign="center" o:hrstd="t" o:hr="t" fillcolor="#a0a0a0" stroked="f"/>
+          <v:rect id="_x0000_i1031" style="width:0;height:1.5pt" o:hralign="center" o:hrstd="t" o:hr="t" fillcolor="#a0a0a0" stroked="f"/>
         </w:pict>
       </w:r>
     </w:p>
@@ -4799,6 +4813,9 @@
     </w:p>
     <w:p>
       <w:r>
+        <w:rPr>
+          <w:noProof/>
+        </w:rPr>
         <w:drawing>
           <wp:anchor distT="0" distB="0" distL="114300" distR="114300" simplePos="0" relativeHeight="251659264" behindDoc="1" locked="0" layoutInCell="1" allowOverlap="1" wp14:anchorId="21B727B5" wp14:editId="4A4F89B0">
             <wp:simplePos x="0" y="0"/>
@@ -4910,11 +4927,7 @@
       </w:r>
       <w:proofErr w:type="spellEnd"/>
       <w:r>
-        <w:t>_{\text{peak</w:t>
-      </w:r>
-      <w:proofErr w:type="gramStart"/>
-      <w:r>
-        <w:t>}}</w:t>
+        <w:t>_{\text{peak}}</w:t>
       </w:r>
       <w:proofErr w:type="spellStart"/>
       <w:r>
@@ -4922,11 +4935,7 @@
       </w:r>
       <w:proofErr w:type="spellEnd"/>
       <w:r>
-        <w:t>​</w:t>
-      </w:r>
-      <w:proofErr w:type="gramEnd"/>
-      <w:r>
-        <w:t xml:space="preserve"> typically lies between </w:t>
+        <w:t xml:space="preserve">​ typically lies between </w:t>
       </w:r>
       <w:r>
         <w:rPr>
@@ -5043,7 +5052,7 @@
     <w:p>
       <w:r>
         <w:pict w14:anchorId="46F9EC96">
-          <v:rect id="_x0000_i1092" style="width:0;height:1.5pt" o:hralign="center" o:hrstd="t" o:hr="t" fillcolor="#a0a0a0" stroked="f"/>
+          <v:rect id="_x0000_i1032" style="width:0;height:1.5pt" o:hralign="center" o:hrstd="t" o:hr="t" fillcolor="#a0a0a0" stroked="f"/>
         </w:pict>
       </w:r>
     </w:p>
@@ -5157,7 +5166,7 @@
     <w:p>
       <w:r>
         <w:pict w14:anchorId="7CF6041D">
-          <v:rect id="_x0000_i1093" style="width:0;height:1.5pt" o:hralign="center" o:hrstd="t" o:hr="t" fillcolor="#a0a0a0" stroked="f"/>
+          <v:rect id="_x0000_i1033" style="width:0;height:1.5pt" o:hralign="center" o:hrstd="t" o:hr="t" fillcolor="#a0a0a0" stroked="f"/>
         </w:pict>
       </w:r>
     </w:p>
@@ -5336,7 +5345,7 @@
     <w:p>
       <w:r>
         <w:pict w14:anchorId="0508D3A3">
-          <v:rect id="_x0000_i1094" style="width:0;height:1.5pt" o:hralign="center" o:hrstd="t" o:hr="t" fillcolor="#a0a0a0" stroked="f"/>
+          <v:rect id="_x0000_i1034" style="width:0;height:1.5pt" o:hralign="center" o:hrstd="t" o:hr="t" fillcolor="#a0a0a0" stroked="f"/>
         </w:pict>
       </w:r>
     </w:p>
@@ -5458,6 +5467,899 @@
       </w:r>
       <w:r>
         <w:t xml:space="preserve"> rather than Galactic.</w:t>
+      </w:r>
+    </w:p>
+    <w:p>
+      <w:pPr>
+        <w:rPr>
+          <w:u w:val="single"/>
+        </w:rPr>
+      </w:pPr>
+      <w:r>
+        <w:rPr>
+          <w:u w:val="single"/>
+        </w:rPr>
+        <w:br w:type="page"/>
+      </w:r>
+    </w:p>
+    <w:p>
+      <w:pPr>
+        <w:jc w:val="center"/>
+        <w:rPr>
+          <w:b/>
+          <w:bCs/>
+          <w:u w:val="single"/>
+        </w:rPr>
+      </w:pPr>
+      <w:r>
+        <w:rPr>
+          <w:b/>
+          <w:bCs/>
+          <w:u w:val="single"/>
+        </w:rPr>
+        <w:lastRenderedPageBreak/>
+        <w:t>Papers suggested by Ali Mohsin for GRB paper</w:t>
+      </w:r>
+    </w:p>
+    <w:p>
+      <w:pPr>
+        <w:jc w:val="center"/>
+        <w:rPr>
+          <w:b/>
+          <w:bCs/>
+          <w:u w:val="single"/>
+        </w:rPr>
+      </w:pPr>
+      <w:r>
+        <w:rPr>
+          <w:b/>
+          <w:bCs/>
+          <w:u w:val="single"/>
+        </w:rPr>
+        <w:t>Dated: 6</w:t>
+      </w:r>
+      <w:r>
+        <w:rPr>
+          <w:b/>
+          <w:bCs/>
+          <w:u w:val="single"/>
+          <w:vertAlign w:val="superscript"/>
+        </w:rPr>
+        <w:t>th</w:t>
+      </w:r>
+      <w:r>
+        <w:rPr>
+          <w:b/>
+          <w:bCs/>
+          <w:u w:val="single"/>
+        </w:rPr>
+        <w:t xml:space="preserve"> Oct 2025</w:t>
+      </w:r>
+    </w:p>
+    <w:p>
+      <w:pPr>
+        <w:rPr>
+          <w:b/>
+          <w:bCs/>
+        </w:rPr>
+      </w:pPr>
+      <w:r>
+        <w:rPr>
+          <w:b/>
+          <w:bCs/>
+        </w:rPr>
+        <w:t>Summary of Burgess 2014 paper</w:t>
+      </w:r>
+    </w:p>
+    <w:p>
+      <w:pPr>
+        <w:rPr>
+          <w:b/>
+          <w:bCs/>
+        </w:rPr>
+      </w:pPr>
+      <w:r>
+        <w:rPr>
+          <w:b/>
+          <w:bCs/>
+        </w:rPr>
+        <w:t>TIME-RESOLVED ANALYSIS OF FERMI GAMMA-RAY BURSTS WITH</w:t>
+      </w:r>
+      <w:r>
+        <w:rPr>
+          <w:b/>
+          <w:bCs/>
+        </w:rPr>
+        <w:t xml:space="preserve"> </w:t>
+      </w:r>
+      <w:r>
+        <w:rPr>
+          <w:b/>
+          <w:bCs/>
+        </w:rPr>
+        <w:t>FAST- AND SLOW-COOLED SYNCHROTRON PHOTON MODELS</w:t>
+      </w:r>
+    </w:p>
+    <w:p>
+      <w:r>
+        <w:t>I just have to read 2</w:t>
+      </w:r>
+      <w:r>
+        <w:rPr>
+          <w:vertAlign w:val="superscript"/>
+        </w:rPr>
+        <w:t>nd</w:t>
+      </w:r>
+      <w:r>
+        <w:t xml:space="preserve"> section of this paper.</w:t>
+      </w:r>
+    </w:p>
+    <w:p>
+      <w:pPr>
+        <w:rPr>
+          <w:b/>
+          <w:bCs/>
+        </w:rPr>
+      </w:pPr>
+      <w:r>
+        <w:rPr>
+          <w:b/>
+          <w:bCs/>
+        </w:rPr>
+        <w:t>Section 2 — “Model Spectral Components”</w:t>
+      </w:r>
+    </w:p>
+    <w:p>
+      <w:r>
+        <w:t xml:space="preserve">This section explains the </w:t>
+      </w:r>
+      <w:r>
+        <w:rPr>
+          <w:b/>
+          <w:bCs/>
+        </w:rPr>
+        <w:t>two physical parts</w:t>
+      </w:r>
+      <w:r>
+        <w:t xml:space="preserve"> of GRB prompt emission that the authors use in their modeling:</w:t>
+      </w:r>
+    </w:p>
+    <w:p>
+      <w:pPr>
+        <w:numPr>
+          <w:ilvl w:val="0"/>
+          <w:numId w:val="21"/>
+        </w:numPr>
+      </w:pPr>
+      <w:r>
+        <w:rPr>
+          <w:b/>
+          <w:bCs/>
+        </w:rPr>
+        <w:t>Synchrotron radiation</w:t>
+      </w:r>
+      <w:r>
+        <w:t xml:space="preserve"> → the </w:t>
+      </w:r>
+      <w:r>
+        <w:rPr>
+          <w:i/>
+          <w:iCs/>
+        </w:rPr>
+        <w:t>non-thermal</w:t>
+      </w:r>
+      <w:r>
+        <w:t xml:space="preserve"> part (from fast, charged particles in magnetic fields).</w:t>
+      </w:r>
+    </w:p>
+    <w:p>
+      <w:pPr>
+        <w:numPr>
+          <w:ilvl w:val="0"/>
+          <w:numId w:val="21"/>
+        </w:numPr>
+      </w:pPr>
+      <w:r>
+        <w:rPr>
+          <w:b/>
+          <w:bCs/>
+        </w:rPr>
+        <w:t>Blackbody radiation</w:t>
+      </w:r>
+      <w:r>
+        <w:t xml:space="preserve"> → the </w:t>
+      </w:r>
+      <w:r>
+        <w:rPr>
+          <w:i/>
+          <w:iCs/>
+        </w:rPr>
+        <w:t>thermal</w:t>
+      </w:r>
+      <w:r>
+        <w:t xml:space="preserve"> part (from the hot photosphere of the GRB jet).</w:t>
+      </w:r>
+    </w:p>
+    <w:p>
+      <w:r>
+        <w:t xml:space="preserve">They want to describe the GRB spectrum using </w:t>
+      </w:r>
+      <w:r>
+        <w:rPr>
+          <w:b/>
+          <w:bCs/>
+        </w:rPr>
+        <w:t>real physics</w:t>
+      </w:r>
+      <w:r>
+        <w:t xml:space="preserve"> instead of just the mathematical Band function.</w:t>
+      </w:r>
+    </w:p>
+    <w:p>
+      <w:r>
+        <w:pict w14:anchorId="3F0FDF1F">
+          <v:rect id="_x0000_i1041" style="width:0;height:1.5pt" o:hralign="center" o:hrstd="t" o:hr="t" fillcolor="#a0a0a0" stroked="f"/>
+        </w:pict>
+      </w:r>
+    </w:p>
+    <w:p>
+      <w:pPr>
+        <w:rPr>
+          <w:b/>
+          <w:bCs/>
+        </w:rPr>
+      </w:pPr>
+      <w:r>
+        <w:rPr>
+          <w:rFonts w:ascii="Segoe UI Emoji" w:hAnsi="Segoe UI Emoji" w:cs="Segoe UI Emoji"/>
+          <w:b/>
+          <w:bCs/>
+        </w:rPr>
+        <w:t>⚡</w:t>
+      </w:r>
+      <w:r>
+        <w:rPr>
+          <w:b/>
+          <w:bCs/>
+        </w:rPr>
+        <w:t xml:space="preserve"> 1. Synchrotron radiation model</w:t>
+      </w:r>
+    </w:p>
+    <w:p>
+      <w:r>
+        <w:t>Electrons in the GRB jet move extremely fast and spiral around magnetic-field lines.</w:t>
+      </w:r>
+      <w:r>
+        <w:br/>
+        <w:t xml:space="preserve">As they do this, they emit light called </w:t>
+      </w:r>
+      <w:r>
+        <w:rPr>
+          <w:b/>
+          <w:bCs/>
+        </w:rPr>
+        <w:t>synchrotron radiation</w:t>
+      </w:r>
+      <w:r>
+        <w:t>.</w:t>
+      </w:r>
+      <w:r>
+        <w:br/>
+        <w:t xml:space="preserve">To know what the total spectrum looks like, we must first know </w:t>
+      </w:r>
+      <w:r>
+        <w:rPr>
+          <w:b/>
+          <w:bCs/>
+        </w:rPr>
+        <w:t>how many electrons exist at each energy</w:t>
+      </w:r>
+      <w:r>
+        <w:t>.</w:t>
+      </w:r>
+    </w:p>
+    <w:p>
+      <w:r>
+        <w:lastRenderedPageBreak/>
+        <w:drawing>
+          <wp:anchor distT="0" distB="0" distL="114300" distR="114300" simplePos="0" relativeHeight="251660288" behindDoc="1" locked="0" layoutInCell="1" allowOverlap="1" wp14:anchorId="5FE1135B" wp14:editId="38731485">
+            <wp:simplePos x="0" y="0"/>
+            <wp:positionH relativeFrom="column">
+              <wp:posOffset>426720</wp:posOffset>
+            </wp:positionH>
+            <wp:positionV relativeFrom="paragraph">
+              <wp:posOffset>120650</wp:posOffset>
+            </wp:positionV>
+            <wp:extent cx="5600700" cy="2667000"/>
+            <wp:effectExtent l="0" t="0" r="0" b="0"/>
+            <wp:wrapTight wrapText="bothSides">
+              <wp:wrapPolygon edited="0">
+                <wp:start x="0" y="0"/>
+                <wp:lineTo x="0" y="21446"/>
+                <wp:lineTo x="21527" y="21446"/>
+                <wp:lineTo x="21527" y="0"/>
+                <wp:lineTo x="0" y="0"/>
+              </wp:wrapPolygon>
+            </wp:wrapTight>
+            <wp:docPr id="164165966" name="Picture 1"/>
+            <wp:cNvGraphicFramePr>
+              <a:graphicFrameLocks xmlns:a="http://schemas.openxmlformats.org/drawingml/2006/main" noChangeAspect="1"/>
+            </wp:cNvGraphicFramePr>
+            <a:graphic xmlns:a="http://schemas.openxmlformats.org/drawingml/2006/main">
+              <a:graphicData uri="http://schemas.openxmlformats.org/drawingml/2006/picture">
+                <pic:pic xmlns:pic="http://schemas.openxmlformats.org/drawingml/2006/picture">
+                  <pic:nvPicPr>
+                    <pic:cNvPr id="164165966" name=""/>
+                    <pic:cNvPicPr/>
+                  </pic:nvPicPr>
+                  <pic:blipFill>
+                    <a:blip r:embed="rId7">
+                      <a:extLst>
+                        <a:ext uri="{28A0092B-C50C-407E-A947-70E740481C1C}">
+                          <a14:useLocalDpi xmlns:a14="http://schemas.microsoft.com/office/drawing/2010/main" val="0"/>
+                        </a:ext>
+                      </a:extLst>
+                    </a:blip>
+                    <a:stretch>
+                      <a:fillRect/>
+                    </a:stretch>
+                  </pic:blipFill>
+                  <pic:spPr>
+                    <a:xfrm>
+                      <a:off x="0" y="0"/>
+                      <a:ext cx="5600700" cy="2667000"/>
+                    </a:xfrm>
+                    <a:prstGeom prst="rect">
+                      <a:avLst/>
+                    </a:prstGeom>
+                  </pic:spPr>
+                </pic:pic>
+              </a:graphicData>
+            </a:graphic>
+            <wp14:sizeRelH relativeFrom="margin">
+              <wp14:pctWidth>0</wp14:pctWidth>
+            </wp14:sizeRelH>
+            <wp14:sizeRelV relativeFrom="margin">
+              <wp14:pctHeight>0</wp14:pctHeight>
+            </wp14:sizeRelV>
+          </wp:anchor>
+        </w:drawing>
+      </w:r>
+    </w:p>
+    <w:p/>
+    <w:p/>
+    <w:p/>
+    <w:p/>
+    <w:p/>
+    <w:p/>
+    <w:p/>
+    <w:p/>
+    <w:p/>
+    <w:p>
+      <w:r>
+        <w:drawing>
+          <wp:anchor distT="0" distB="0" distL="114300" distR="114300" simplePos="0" relativeHeight="251661312" behindDoc="1" locked="0" layoutInCell="1" allowOverlap="1" wp14:anchorId="552D8EA8" wp14:editId="2D5EF705">
+            <wp:simplePos x="0" y="0"/>
+            <wp:positionH relativeFrom="column">
+              <wp:posOffset>358140</wp:posOffset>
+            </wp:positionH>
+            <wp:positionV relativeFrom="paragraph">
+              <wp:posOffset>0</wp:posOffset>
+            </wp:positionV>
+            <wp:extent cx="5052060" cy="3489325"/>
+            <wp:effectExtent l="0" t="0" r="0" b="0"/>
+            <wp:wrapTight wrapText="bothSides">
+              <wp:wrapPolygon edited="0">
+                <wp:start x="0" y="0"/>
+                <wp:lineTo x="0" y="21462"/>
+                <wp:lineTo x="21502" y="21462"/>
+                <wp:lineTo x="21502" y="0"/>
+                <wp:lineTo x="0" y="0"/>
+              </wp:wrapPolygon>
+            </wp:wrapTight>
+            <wp:docPr id="1192711449" name="Picture 1"/>
+            <wp:cNvGraphicFramePr>
+              <a:graphicFrameLocks xmlns:a="http://schemas.openxmlformats.org/drawingml/2006/main" noChangeAspect="1"/>
+            </wp:cNvGraphicFramePr>
+            <a:graphic xmlns:a="http://schemas.openxmlformats.org/drawingml/2006/main">
+              <a:graphicData uri="http://schemas.openxmlformats.org/drawingml/2006/picture">
+                <pic:pic xmlns:pic="http://schemas.openxmlformats.org/drawingml/2006/picture">
+                  <pic:nvPicPr>
+                    <pic:cNvPr id="1192711449" name=""/>
+                    <pic:cNvPicPr/>
+                  </pic:nvPicPr>
+                  <pic:blipFill>
+                    <a:blip r:embed="rId8">
+                      <a:extLst>
+                        <a:ext uri="{28A0092B-C50C-407E-A947-70E740481C1C}">
+                          <a14:useLocalDpi xmlns:a14="http://schemas.microsoft.com/office/drawing/2010/main" val="0"/>
+                        </a:ext>
+                      </a:extLst>
+                    </a:blip>
+                    <a:stretch>
+                      <a:fillRect/>
+                    </a:stretch>
+                  </pic:blipFill>
+                  <pic:spPr>
+                    <a:xfrm>
+                      <a:off x="0" y="0"/>
+                      <a:ext cx="5052060" cy="3489325"/>
+                    </a:xfrm>
+                    <a:prstGeom prst="rect">
+                      <a:avLst/>
+                    </a:prstGeom>
+                  </pic:spPr>
+                </pic:pic>
+              </a:graphicData>
+            </a:graphic>
+            <wp14:sizeRelH relativeFrom="margin">
+              <wp14:pctWidth>0</wp14:pctWidth>
+            </wp14:sizeRelH>
+            <wp14:sizeRelV relativeFrom="margin">
+              <wp14:pctHeight>0</wp14:pctHeight>
+            </wp14:sizeRelV>
+          </wp:anchor>
+        </w:drawing>
+      </w:r>
+    </w:p>
+    <w:p/>
+    <w:p/>
+    <w:p/>
+    <w:p/>
+    <w:p/>
+    <w:p/>
+    <w:p/>
+    <w:p/>
+    <w:p/>
+    <w:p/>
+    <w:p/>
+    <w:p>
+      <w:r>
+        <w:lastRenderedPageBreak/>
+        <w:drawing>
+          <wp:anchor distT="0" distB="0" distL="114300" distR="114300" simplePos="0" relativeHeight="251662336" behindDoc="1" locked="0" layoutInCell="1" allowOverlap="1" wp14:anchorId="43128C6C" wp14:editId="230FBBB3">
+            <wp:simplePos x="0" y="0"/>
+            <wp:positionH relativeFrom="column">
+              <wp:posOffset>403860</wp:posOffset>
+            </wp:positionH>
+            <wp:positionV relativeFrom="paragraph">
+              <wp:posOffset>203200</wp:posOffset>
+            </wp:positionV>
+            <wp:extent cx="4861560" cy="3236595"/>
+            <wp:effectExtent l="0" t="0" r="0" b="1905"/>
+            <wp:wrapTight wrapText="bothSides">
+              <wp:wrapPolygon edited="0">
+                <wp:start x="0" y="0"/>
+                <wp:lineTo x="0" y="21486"/>
+                <wp:lineTo x="21498" y="21486"/>
+                <wp:lineTo x="21498" y="0"/>
+                <wp:lineTo x="0" y="0"/>
+              </wp:wrapPolygon>
+            </wp:wrapTight>
+            <wp:docPr id="216240390" name="Picture 1"/>
+            <wp:cNvGraphicFramePr>
+              <a:graphicFrameLocks xmlns:a="http://schemas.openxmlformats.org/drawingml/2006/main" noChangeAspect="1"/>
+            </wp:cNvGraphicFramePr>
+            <a:graphic xmlns:a="http://schemas.openxmlformats.org/drawingml/2006/main">
+              <a:graphicData uri="http://schemas.openxmlformats.org/drawingml/2006/picture">
+                <pic:pic xmlns:pic="http://schemas.openxmlformats.org/drawingml/2006/picture">
+                  <pic:nvPicPr>
+                    <pic:cNvPr id="216240390" name=""/>
+                    <pic:cNvPicPr/>
+                  </pic:nvPicPr>
+                  <pic:blipFill>
+                    <a:blip r:embed="rId9">
+                      <a:extLst>
+                        <a:ext uri="{28A0092B-C50C-407E-A947-70E740481C1C}">
+                          <a14:useLocalDpi xmlns:a14="http://schemas.microsoft.com/office/drawing/2010/main" val="0"/>
+                        </a:ext>
+                      </a:extLst>
+                    </a:blip>
+                    <a:stretch>
+                      <a:fillRect/>
+                    </a:stretch>
+                  </pic:blipFill>
+                  <pic:spPr>
+                    <a:xfrm>
+                      <a:off x="0" y="0"/>
+                      <a:ext cx="4861560" cy="3236595"/>
+                    </a:xfrm>
+                    <a:prstGeom prst="rect">
+                      <a:avLst/>
+                    </a:prstGeom>
+                  </pic:spPr>
+                </pic:pic>
+              </a:graphicData>
+            </a:graphic>
+            <wp14:sizeRelH relativeFrom="margin">
+              <wp14:pctWidth>0</wp14:pctWidth>
+            </wp14:sizeRelH>
+            <wp14:sizeRelV relativeFrom="margin">
+              <wp14:pctHeight>0</wp14:pctHeight>
+            </wp14:sizeRelV>
+          </wp:anchor>
+        </w:drawing>
+      </w:r>
+    </w:p>
+    <w:p/>
+    <w:p/>
+    <w:p/>
+    <w:p/>
+    <w:p/>
+    <w:p/>
+    <w:p/>
+    <w:p/>
+    <w:p/>
+    <w:p/>
+    <w:p/>
+    <w:p>
+      <w:r>
+        <w:t>So:</w:t>
+      </w:r>
+    </w:p>
+    <w:p>
+      <w:pPr>
+        <w:numPr>
+          <w:ilvl w:val="0"/>
+          <w:numId w:val="22"/>
+        </w:numPr>
+      </w:pPr>
+      <w:r>
+        <w:t>Stronger magnetic fields → higher photon energy.</w:t>
+      </w:r>
+    </w:p>
+    <w:p>
+      <w:pPr>
+        <w:numPr>
+          <w:ilvl w:val="0"/>
+          <w:numId w:val="22"/>
+        </w:numPr>
+      </w:pPr>
+      <w:r>
+        <w:t>Faster jet motion (higher Γ) → higher photon energy.</w:t>
+      </w:r>
+    </w:p>
+    <w:p>
+      <w:r>
+        <w:t xml:space="preserve">That’s how the </w:t>
+      </w:r>
+      <w:r>
+        <w:rPr>
+          <w:b/>
+          <w:bCs/>
+        </w:rPr>
+        <w:t>synchrotron peak</w:t>
+      </w:r>
+      <w:r>
+        <w:t xml:space="preserve"> in the GRB spectrum is determined.</w:t>
+      </w:r>
+    </w:p>
+    <w:p>
+      <w:r>
+        <w:drawing>
+          <wp:anchor distT="0" distB="0" distL="114300" distR="114300" simplePos="0" relativeHeight="251663360" behindDoc="1" locked="0" layoutInCell="1" allowOverlap="1" wp14:anchorId="6586F849" wp14:editId="03D76C2F">
+            <wp:simplePos x="0" y="0"/>
+            <wp:positionH relativeFrom="column">
+              <wp:posOffset>381000</wp:posOffset>
+            </wp:positionH>
+            <wp:positionV relativeFrom="paragraph">
+              <wp:posOffset>65405</wp:posOffset>
+            </wp:positionV>
+            <wp:extent cx="5410200" cy="2806700"/>
+            <wp:effectExtent l="0" t="0" r="0" b="0"/>
+            <wp:wrapTight wrapText="bothSides">
+              <wp:wrapPolygon edited="0">
+                <wp:start x="0" y="0"/>
+                <wp:lineTo x="0" y="21405"/>
+                <wp:lineTo x="21524" y="21405"/>
+                <wp:lineTo x="21524" y="0"/>
+                <wp:lineTo x="0" y="0"/>
+              </wp:wrapPolygon>
+            </wp:wrapTight>
+            <wp:docPr id="146402481" name="Picture 1"/>
+            <wp:cNvGraphicFramePr>
+              <a:graphicFrameLocks xmlns:a="http://schemas.openxmlformats.org/drawingml/2006/main" noChangeAspect="1"/>
+            </wp:cNvGraphicFramePr>
+            <a:graphic xmlns:a="http://schemas.openxmlformats.org/drawingml/2006/main">
+              <a:graphicData uri="http://schemas.openxmlformats.org/drawingml/2006/picture">
+                <pic:pic xmlns:pic="http://schemas.openxmlformats.org/drawingml/2006/picture">
+                  <pic:nvPicPr>
+                    <pic:cNvPr id="146402481" name=""/>
+                    <pic:cNvPicPr/>
+                  </pic:nvPicPr>
+                  <pic:blipFill>
+                    <a:blip r:embed="rId10">
+                      <a:extLst>
+                        <a:ext uri="{28A0092B-C50C-407E-A947-70E740481C1C}">
+                          <a14:useLocalDpi xmlns:a14="http://schemas.microsoft.com/office/drawing/2010/main" val="0"/>
+                        </a:ext>
+                      </a:extLst>
+                    </a:blip>
+                    <a:stretch>
+                      <a:fillRect/>
+                    </a:stretch>
+                  </pic:blipFill>
+                  <pic:spPr>
+                    <a:xfrm>
+                      <a:off x="0" y="0"/>
+                      <a:ext cx="5410200" cy="2806700"/>
+                    </a:xfrm>
+                    <a:prstGeom prst="rect">
+                      <a:avLst/>
+                    </a:prstGeom>
+                  </pic:spPr>
+                </pic:pic>
+              </a:graphicData>
+            </a:graphic>
+            <wp14:sizeRelH relativeFrom="margin">
+              <wp14:pctWidth>0</wp14:pctWidth>
+            </wp14:sizeRelH>
+            <wp14:sizeRelV relativeFrom="margin">
+              <wp14:pctHeight>0</wp14:pctHeight>
+            </wp14:sizeRelV>
+          </wp:anchor>
+        </w:drawing>
+      </w:r>
+    </w:p>
+    <w:p/>
+    <w:p/>
+    <w:p/>
+    <w:p/>
+    <w:p/>
+    <w:p/>
+    <w:p/>
+    <w:p/>
+    <w:p/>
+    <w:p>
+      <w:r>
+        <w:lastRenderedPageBreak/>
+        <w:drawing>
+          <wp:anchor distT="0" distB="0" distL="114300" distR="114300" simplePos="0" relativeHeight="251664384" behindDoc="1" locked="0" layoutInCell="1" allowOverlap="1" wp14:anchorId="06DAE5B8" wp14:editId="1B8C24BA">
+            <wp:simplePos x="0" y="0"/>
+            <wp:positionH relativeFrom="column">
+              <wp:posOffset>381000</wp:posOffset>
+            </wp:positionH>
+            <wp:positionV relativeFrom="paragraph">
+              <wp:posOffset>155575</wp:posOffset>
+            </wp:positionV>
+            <wp:extent cx="5143500" cy="2970530"/>
+            <wp:effectExtent l="0" t="0" r="0" b="1270"/>
+            <wp:wrapTight wrapText="bothSides">
+              <wp:wrapPolygon edited="0">
+                <wp:start x="0" y="0"/>
+                <wp:lineTo x="0" y="21471"/>
+                <wp:lineTo x="21520" y="21471"/>
+                <wp:lineTo x="21520" y="0"/>
+                <wp:lineTo x="0" y="0"/>
+              </wp:wrapPolygon>
+            </wp:wrapTight>
+            <wp:docPr id="1939496963" name="Picture 1"/>
+            <wp:cNvGraphicFramePr>
+              <a:graphicFrameLocks xmlns:a="http://schemas.openxmlformats.org/drawingml/2006/main" noChangeAspect="1"/>
+            </wp:cNvGraphicFramePr>
+            <a:graphic xmlns:a="http://schemas.openxmlformats.org/drawingml/2006/main">
+              <a:graphicData uri="http://schemas.openxmlformats.org/drawingml/2006/picture">
+                <pic:pic xmlns:pic="http://schemas.openxmlformats.org/drawingml/2006/picture">
+                  <pic:nvPicPr>
+                    <pic:cNvPr id="1939496963" name=""/>
+                    <pic:cNvPicPr/>
+                  </pic:nvPicPr>
+                  <pic:blipFill>
+                    <a:blip r:embed="rId11">
+                      <a:extLst>
+                        <a:ext uri="{28A0092B-C50C-407E-A947-70E740481C1C}">
+                          <a14:useLocalDpi xmlns:a14="http://schemas.microsoft.com/office/drawing/2010/main" val="0"/>
+                        </a:ext>
+                      </a:extLst>
+                    </a:blip>
+                    <a:stretch>
+                      <a:fillRect/>
+                    </a:stretch>
+                  </pic:blipFill>
+                  <pic:spPr>
+                    <a:xfrm>
+                      <a:off x="0" y="0"/>
+                      <a:ext cx="5143500" cy="2970530"/>
+                    </a:xfrm>
+                    <a:prstGeom prst="rect">
+                      <a:avLst/>
+                    </a:prstGeom>
+                  </pic:spPr>
+                </pic:pic>
+              </a:graphicData>
+            </a:graphic>
+            <wp14:sizeRelH relativeFrom="margin">
+              <wp14:pctWidth>0</wp14:pctWidth>
+            </wp14:sizeRelH>
+            <wp14:sizeRelV relativeFrom="margin">
+              <wp14:pctHeight>0</wp14:pctHeight>
+            </wp14:sizeRelV>
+          </wp:anchor>
+        </w:drawing>
+      </w:r>
+    </w:p>
+    <w:p/>
+    <w:p/>
+    <w:p/>
+    <w:p/>
+    <w:p/>
+    <w:p/>
+    <w:p/>
+    <w:p/>
+    <w:p/>
+    <w:p/>
+    <w:p>
+      <w:pPr>
+        <w:rPr>
+          <w:b/>
+          <w:bCs/>
+        </w:rPr>
+      </w:pPr>
+      <w:r>
+        <w:rPr>
+          <w:b/>
+          <w:bCs/>
+        </w:rPr>
+        <w:t>Summary</w:t>
+      </w:r>
+    </w:p>
+    <w:p>
+      <w:pPr>
+        <w:numPr>
+          <w:ilvl w:val="0"/>
+          <w:numId w:val="23"/>
+        </w:numPr>
+      </w:pPr>
+      <w:r>
+        <w:t xml:space="preserve">GRB light comes from </w:t>
+      </w:r>
+      <w:r>
+        <w:rPr>
+          <w:b/>
+          <w:bCs/>
+        </w:rPr>
+        <w:t>two kinds of radiation</w:t>
+      </w:r>
+      <w:r>
+        <w:t>:</w:t>
+      </w:r>
+    </w:p>
+    <w:p>
+      <w:pPr>
+        <w:numPr>
+          <w:ilvl w:val="1"/>
+          <w:numId w:val="23"/>
+        </w:numPr>
+      </w:pPr>
+      <w:r>
+        <w:rPr>
+          <w:b/>
+          <w:bCs/>
+        </w:rPr>
+        <w:t>Synchrotron (non-thermal)</w:t>
+      </w:r>
+      <w:r>
+        <w:t xml:space="preserve"> — from very fast electrons spiraling in magnetic fields.</w:t>
+      </w:r>
+    </w:p>
+    <w:p>
+      <w:pPr>
+        <w:numPr>
+          <w:ilvl w:val="1"/>
+          <w:numId w:val="23"/>
+        </w:numPr>
+      </w:pPr>
+      <w:r>
+        <w:rPr>
+          <w:b/>
+          <w:bCs/>
+        </w:rPr>
+        <w:t>Blackbody (thermal)</w:t>
+      </w:r>
+      <w:r>
+        <w:t xml:space="preserve"> — from the hot surface (photosphere) of the jet.</w:t>
+      </w:r>
+    </w:p>
+    <w:p>
+      <w:pPr>
+        <w:numPr>
+          <w:ilvl w:val="0"/>
+          <w:numId w:val="23"/>
+        </w:numPr>
+      </w:pPr>
+      <w:r>
+        <w:t xml:space="preserve">The electrons’ energy distribution has a </w:t>
+      </w:r>
+      <w:r>
+        <w:rPr>
+          <w:b/>
+          <w:bCs/>
+        </w:rPr>
+        <w:t>thermal core</w:t>
+      </w:r>
+      <w:r>
+        <w:t xml:space="preserve"> plus a </w:t>
+      </w:r>
+      <w:r>
+        <w:rPr>
+          <w:b/>
+          <w:bCs/>
+        </w:rPr>
+        <w:t>power-law tail</w:t>
+      </w:r>
+      <w:r>
+        <w:t>.</w:t>
+      </w:r>
+    </w:p>
+    <w:p>
+      <w:pPr>
+        <w:numPr>
+          <w:ilvl w:val="1"/>
+          <w:numId w:val="24"/>
+        </w:numPr>
+      </w:pPr>
+      <w:r>
+        <w:t>Most electrons: γ ≈ 300</w:t>
+      </w:r>
+    </w:p>
+    <w:p>
+      <w:pPr>
+        <w:numPr>
+          <w:ilvl w:val="1"/>
+          <w:numId w:val="24"/>
+        </w:numPr>
+      </w:pPr>
+      <w:r>
+        <w:t>High-energy tail starts at γ ≈ 900</w:t>
+      </w:r>
+    </w:p>
+    <w:p>
+      <w:pPr>
+        <w:numPr>
+          <w:ilvl w:val="1"/>
+          <w:numId w:val="24"/>
+        </w:numPr>
+      </w:pPr>
+      <w:r>
+        <w:t>Tail slope δ is fitted from data.</w:t>
+      </w:r>
+    </w:p>
+    <w:p>
+      <w:pPr>
+        <w:numPr>
+          <w:ilvl w:val="0"/>
+          <w:numId w:val="23"/>
+        </w:numPr>
+      </w:pPr>
+      <w:r>
+        <w:t>These electrons emit photons with energy roughly proportional to γ² × B × Γ.</w:t>
+      </w:r>
+    </w:p>
+    <w:p>
+      <w:pPr>
+        <w:numPr>
+          <w:ilvl w:val="0"/>
+          <w:numId w:val="23"/>
+        </w:numPr>
+      </w:pPr>
+      <w:r>
+        <w:t>The fixed numbers (</w:t>
+      </w:r>
+      <w:proofErr w:type="spellStart"/>
+      <w:r>
+        <w:t>γ_th</w:t>
+      </w:r>
+      <w:proofErr w:type="spellEnd"/>
+      <w:r>
+        <w:t xml:space="preserve"> = 300, </w:t>
+      </w:r>
+      <w:proofErr w:type="spellStart"/>
+      <w:r>
+        <w:t>γ_min</w:t>
+      </w:r>
+      <w:proofErr w:type="spellEnd"/>
+      <w:r>
+        <w:t xml:space="preserve"> = 900, ε ≈ 0.1) define realistic conditions for MeV-range emission.</w:t>
       </w:r>
     </w:p>
     <w:p/>
@@ -7460,6 +8362,155 @@
     </w:lvl>
   </w:abstractNum>
   <w:abstractNum w:abstractNumId="14" w15:restartNumberingAfterBreak="0">
+    <w:nsid w:val="56542861"/>
+    <w:multiLevelType w:val="multilevel"/>
+    <w:tmpl w:val="B206FDE2"/>
+    <w:lvl w:ilvl="0">
+      <w:start w:val="1"/>
+      <w:numFmt w:val="bullet"/>
+      <w:lvlText w:val=""/>
+      <w:lvlJc w:val="left"/>
+      <w:pPr>
+        <w:tabs>
+          <w:tab w:val="num" w:pos="720"/>
+        </w:tabs>
+        <w:ind w:left="720" w:hanging="360"/>
+      </w:pPr>
+      <w:rPr>
+        <w:rFonts w:ascii="Symbol" w:hAnsi="Symbol" w:hint="default"/>
+        <w:sz w:val="20"/>
+      </w:rPr>
+    </w:lvl>
+    <w:lvl w:ilvl="1" w:tentative="1">
+      <w:start w:val="1"/>
+      <w:numFmt w:val="bullet"/>
+      <w:lvlText w:val="o"/>
+      <w:lvlJc w:val="left"/>
+      <w:pPr>
+        <w:tabs>
+          <w:tab w:val="num" w:pos="1440"/>
+        </w:tabs>
+        <w:ind w:left="1440" w:hanging="360"/>
+      </w:pPr>
+      <w:rPr>
+        <w:rFonts w:ascii="Courier New" w:hAnsi="Courier New" w:hint="default"/>
+        <w:sz w:val="20"/>
+      </w:rPr>
+    </w:lvl>
+    <w:lvl w:ilvl="2" w:tentative="1">
+      <w:start w:val="1"/>
+      <w:numFmt w:val="bullet"/>
+      <w:lvlText w:val=""/>
+      <w:lvlJc w:val="left"/>
+      <w:pPr>
+        <w:tabs>
+          <w:tab w:val="num" w:pos="2160"/>
+        </w:tabs>
+        <w:ind w:left="2160" w:hanging="360"/>
+      </w:pPr>
+      <w:rPr>
+        <w:rFonts w:ascii="Wingdings" w:hAnsi="Wingdings" w:hint="default"/>
+        <w:sz w:val="20"/>
+      </w:rPr>
+    </w:lvl>
+    <w:lvl w:ilvl="3" w:tentative="1">
+      <w:start w:val="1"/>
+      <w:numFmt w:val="bullet"/>
+      <w:lvlText w:val=""/>
+      <w:lvlJc w:val="left"/>
+      <w:pPr>
+        <w:tabs>
+          <w:tab w:val="num" w:pos="2880"/>
+        </w:tabs>
+        <w:ind w:left="2880" w:hanging="360"/>
+      </w:pPr>
+      <w:rPr>
+        <w:rFonts w:ascii="Wingdings" w:hAnsi="Wingdings" w:hint="default"/>
+        <w:sz w:val="20"/>
+      </w:rPr>
+    </w:lvl>
+    <w:lvl w:ilvl="4" w:tentative="1">
+      <w:start w:val="1"/>
+      <w:numFmt w:val="bullet"/>
+      <w:lvlText w:val=""/>
+      <w:lvlJc w:val="left"/>
+      <w:pPr>
+        <w:tabs>
+          <w:tab w:val="num" w:pos="3600"/>
+        </w:tabs>
+        <w:ind w:left="3600" w:hanging="360"/>
+      </w:pPr>
+      <w:rPr>
+        <w:rFonts w:ascii="Wingdings" w:hAnsi="Wingdings" w:hint="default"/>
+        <w:sz w:val="20"/>
+      </w:rPr>
+    </w:lvl>
+    <w:lvl w:ilvl="5" w:tentative="1">
+      <w:start w:val="1"/>
+      <w:numFmt w:val="bullet"/>
+      <w:lvlText w:val=""/>
+      <w:lvlJc w:val="left"/>
+      <w:pPr>
+        <w:tabs>
+          <w:tab w:val="num" w:pos="4320"/>
+        </w:tabs>
+        <w:ind w:left="4320" w:hanging="360"/>
+      </w:pPr>
+      <w:rPr>
+        <w:rFonts w:ascii="Wingdings" w:hAnsi="Wingdings" w:hint="default"/>
+        <w:sz w:val="20"/>
+      </w:rPr>
+    </w:lvl>
+    <w:lvl w:ilvl="6" w:tentative="1">
+      <w:start w:val="1"/>
+      <w:numFmt w:val="bullet"/>
+      <w:lvlText w:val=""/>
+      <w:lvlJc w:val="left"/>
+      <w:pPr>
+        <w:tabs>
+          <w:tab w:val="num" w:pos="5040"/>
+        </w:tabs>
+        <w:ind w:left="5040" w:hanging="360"/>
+      </w:pPr>
+      <w:rPr>
+        <w:rFonts w:ascii="Wingdings" w:hAnsi="Wingdings" w:hint="default"/>
+        <w:sz w:val="20"/>
+      </w:rPr>
+    </w:lvl>
+    <w:lvl w:ilvl="7" w:tentative="1">
+      <w:start w:val="1"/>
+      <w:numFmt w:val="bullet"/>
+      <w:lvlText w:val=""/>
+      <w:lvlJc w:val="left"/>
+      <w:pPr>
+        <w:tabs>
+          <w:tab w:val="num" w:pos="5760"/>
+        </w:tabs>
+        <w:ind w:left="5760" w:hanging="360"/>
+      </w:pPr>
+      <w:rPr>
+        <w:rFonts w:ascii="Wingdings" w:hAnsi="Wingdings" w:hint="default"/>
+        <w:sz w:val="20"/>
+      </w:rPr>
+    </w:lvl>
+    <w:lvl w:ilvl="8" w:tentative="1">
+      <w:start w:val="1"/>
+      <w:numFmt w:val="bullet"/>
+      <w:lvlText w:val=""/>
+      <w:lvlJc w:val="left"/>
+      <w:pPr>
+        <w:tabs>
+          <w:tab w:val="num" w:pos="6480"/>
+        </w:tabs>
+        <w:ind w:left="6480" w:hanging="360"/>
+      </w:pPr>
+      <w:rPr>
+        <w:rFonts w:ascii="Wingdings" w:hAnsi="Wingdings" w:hint="default"/>
+        <w:sz w:val="20"/>
+      </w:rPr>
+    </w:lvl>
+  </w:abstractNum>
+  <w:abstractNum w:abstractNumId="15" w15:restartNumberingAfterBreak="0">
     <w:nsid w:val="665877B8"/>
     <w:multiLevelType w:val="multilevel"/>
     <w:tmpl w:val="3AEAA7CC"/>
@@ -7608,7 +8659,7 @@
       </w:rPr>
     </w:lvl>
   </w:abstractNum>
-  <w:abstractNum w:abstractNumId="15" w15:restartNumberingAfterBreak="0">
+  <w:abstractNum w:abstractNumId="16" w15:restartNumberingAfterBreak="0">
     <w:nsid w:val="6A7D03B9"/>
     <w:multiLevelType w:val="multilevel"/>
     <w:tmpl w:val="205843BE"/>
@@ -7757,7 +8808,7 @@
       </w:rPr>
     </w:lvl>
   </w:abstractNum>
-  <w:abstractNum w:abstractNumId="16" w15:restartNumberingAfterBreak="0">
+  <w:abstractNum w:abstractNumId="17" w15:restartNumberingAfterBreak="0">
     <w:nsid w:val="6D9113C4"/>
     <w:multiLevelType w:val="multilevel"/>
     <w:tmpl w:val="D526CEA8"/>
@@ -7906,7 +8957,265 @@
       </w:rPr>
     </w:lvl>
   </w:abstractNum>
-  <w:abstractNum w:abstractNumId="17" w15:restartNumberingAfterBreak="0">
+  <w:abstractNum w:abstractNumId="18" w15:restartNumberingAfterBreak="0">
+    <w:nsid w:val="6D97086D"/>
+    <w:multiLevelType w:val="multilevel"/>
+    <w:tmpl w:val="F6F012FE"/>
+    <w:lvl w:ilvl="0">
+      <w:start w:val="1"/>
+      <w:numFmt w:val="decimal"/>
+      <w:lvlText w:val="%1."/>
+      <w:lvlJc w:val="left"/>
+      <w:pPr>
+        <w:tabs>
+          <w:tab w:val="num" w:pos="720"/>
+        </w:tabs>
+        <w:ind w:left="720" w:hanging="360"/>
+      </w:pPr>
+    </w:lvl>
+    <w:lvl w:ilvl="1" w:tentative="1">
+      <w:start w:val="1"/>
+      <w:numFmt w:val="decimal"/>
+      <w:lvlText w:val="%2."/>
+      <w:lvlJc w:val="left"/>
+      <w:pPr>
+        <w:tabs>
+          <w:tab w:val="num" w:pos="1440"/>
+        </w:tabs>
+        <w:ind w:left="1440" w:hanging="360"/>
+      </w:pPr>
+    </w:lvl>
+    <w:lvl w:ilvl="2" w:tentative="1">
+      <w:start w:val="1"/>
+      <w:numFmt w:val="decimal"/>
+      <w:lvlText w:val="%3."/>
+      <w:lvlJc w:val="left"/>
+      <w:pPr>
+        <w:tabs>
+          <w:tab w:val="num" w:pos="2160"/>
+        </w:tabs>
+        <w:ind w:left="2160" w:hanging="360"/>
+      </w:pPr>
+    </w:lvl>
+    <w:lvl w:ilvl="3" w:tentative="1">
+      <w:start w:val="1"/>
+      <w:numFmt w:val="decimal"/>
+      <w:lvlText w:val="%4."/>
+      <w:lvlJc w:val="left"/>
+      <w:pPr>
+        <w:tabs>
+          <w:tab w:val="num" w:pos="2880"/>
+        </w:tabs>
+        <w:ind w:left="2880" w:hanging="360"/>
+      </w:pPr>
+    </w:lvl>
+    <w:lvl w:ilvl="4" w:tentative="1">
+      <w:start w:val="1"/>
+      <w:numFmt w:val="decimal"/>
+      <w:lvlText w:val="%5."/>
+      <w:lvlJc w:val="left"/>
+      <w:pPr>
+        <w:tabs>
+          <w:tab w:val="num" w:pos="3600"/>
+        </w:tabs>
+        <w:ind w:left="3600" w:hanging="360"/>
+      </w:pPr>
+    </w:lvl>
+    <w:lvl w:ilvl="5" w:tentative="1">
+      <w:start w:val="1"/>
+      <w:numFmt w:val="decimal"/>
+      <w:lvlText w:val="%6."/>
+      <w:lvlJc w:val="left"/>
+      <w:pPr>
+        <w:tabs>
+          <w:tab w:val="num" w:pos="4320"/>
+        </w:tabs>
+        <w:ind w:left="4320" w:hanging="360"/>
+      </w:pPr>
+    </w:lvl>
+    <w:lvl w:ilvl="6" w:tentative="1">
+      <w:start w:val="1"/>
+      <w:numFmt w:val="decimal"/>
+      <w:lvlText w:val="%7."/>
+      <w:lvlJc w:val="left"/>
+      <w:pPr>
+        <w:tabs>
+          <w:tab w:val="num" w:pos="5040"/>
+        </w:tabs>
+        <w:ind w:left="5040" w:hanging="360"/>
+      </w:pPr>
+    </w:lvl>
+    <w:lvl w:ilvl="7" w:tentative="1">
+      <w:start w:val="1"/>
+      <w:numFmt w:val="decimal"/>
+      <w:lvlText w:val="%8."/>
+      <w:lvlJc w:val="left"/>
+      <w:pPr>
+        <w:tabs>
+          <w:tab w:val="num" w:pos="5760"/>
+        </w:tabs>
+        <w:ind w:left="5760" w:hanging="360"/>
+      </w:pPr>
+    </w:lvl>
+    <w:lvl w:ilvl="8" w:tentative="1">
+      <w:start w:val="1"/>
+      <w:numFmt w:val="decimal"/>
+      <w:lvlText w:val="%9."/>
+      <w:lvlJc w:val="left"/>
+      <w:pPr>
+        <w:tabs>
+          <w:tab w:val="num" w:pos="6480"/>
+        </w:tabs>
+        <w:ind w:left="6480" w:hanging="360"/>
+      </w:pPr>
+    </w:lvl>
+  </w:abstractNum>
+  <w:abstractNum w:abstractNumId="19" w15:restartNumberingAfterBreak="0">
+    <w:nsid w:val="6E9403C3"/>
+    <w:multiLevelType w:val="multilevel"/>
+    <w:tmpl w:val="F4D2A696"/>
+    <w:lvl w:ilvl="0">
+      <w:start w:val="1"/>
+      <w:numFmt w:val="bullet"/>
+      <w:lvlText w:val=""/>
+      <w:lvlJc w:val="left"/>
+      <w:pPr>
+        <w:tabs>
+          <w:tab w:val="num" w:pos="720"/>
+        </w:tabs>
+        <w:ind w:left="720" w:hanging="360"/>
+      </w:pPr>
+      <w:rPr>
+        <w:rFonts w:ascii="Symbol" w:hAnsi="Symbol" w:hint="default"/>
+        <w:sz w:val="20"/>
+      </w:rPr>
+    </w:lvl>
+    <w:lvl w:ilvl="1">
+      <w:start w:val="1"/>
+      <w:numFmt w:val="decimal"/>
+      <w:lvlText w:val="%2."/>
+      <w:lvlJc w:val="left"/>
+      <w:pPr>
+        <w:tabs>
+          <w:tab w:val="num" w:pos="1440"/>
+        </w:tabs>
+        <w:ind w:left="1440" w:hanging="360"/>
+      </w:pPr>
+    </w:lvl>
+    <w:lvl w:ilvl="2" w:tentative="1">
+      <w:start w:val="1"/>
+      <w:numFmt w:val="bullet"/>
+      <w:lvlText w:val=""/>
+      <w:lvlJc w:val="left"/>
+      <w:pPr>
+        <w:tabs>
+          <w:tab w:val="num" w:pos="2160"/>
+        </w:tabs>
+        <w:ind w:left="2160" w:hanging="360"/>
+      </w:pPr>
+      <w:rPr>
+        <w:rFonts w:ascii="Wingdings" w:hAnsi="Wingdings" w:hint="default"/>
+        <w:sz w:val="20"/>
+      </w:rPr>
+    </w:lvl>
+    <w:lvl w:ilvl="3" w:tentative="1">
+      <w:start w:val="1"/>
+      <w:numFmt w:val="bullet"/>
+      <w:lvlText w:val=""/>
+      <w:lvlJc w:val="left"/>
+      <w:pPr>
+        <w:tabs>
+          <w:tab w:val="num" w:pos="2880"/>
+        </w:tabs>
+        <w:ind w:left="2880" w:hanging="360"/>
+      </w:pPr>
+      <w:rPr>
+        <w:rFonts w:ascii="Wingdings" w:hAnsi="Wingdings" w:hint="default"/>
+        <w:sz w:val="20"/>
+      </w:rPr>
+    </w:lvl>
+    <w:lvl w:ilvl="4" w:tentative="1">
+      <w:start w:val="1"/>
+      <w:numFmt w:val="bullet"/>
+      <w:lvlText w:val=""/>
+      <w:lvlJc w:val="left"/>
+      <w:pPr>
+        <w:tabs>
+          <w:tab w:val="num" w:pos="3600"/>
+        </w:tabs>
+        <w:ind w:left="3600" w:hanging="360"/>
+      </w:pPr>
+      <w:rPr>
+        <w:rFonts w:ascii="Wingdings" w:hAnsi="Wingdings" w:hint="default"/>
+        <w:sz w:val="20"/>
+      </w:rPr>
+    </w:lvl>
+    <w:lvl w:ilvl="5" w:tentative="1">
+      <w:start w:val="1"/>
+      <w:numFmt w:val="bullet"/>
+      <w:lvlText w:val=""/>
+      <w:lvlJc w:val="left"/>
+      <w:pPr>
+        <w:tabs>
+          <w:tab w:val="num" w:pos="4320"/>
+        </w:tabs>
+        <w:ind w:left="4320" w:hanging="360"/>
+      </w:pPr>
+      <w:rPr>
+        <w:rFonts w:ascii="Wingdings" w:hAnsi="Wingdings" w:hint="default"/>
+        <w:sz w:val="20"/>
+      </w:rPr>
+    </w:lvl>
+    <w:lvl w:ilvl="6" w:tentative="1">
+      <w:start w:val="1"/>
+      <w:numFmt w:val="bullet"/>
+      <w:lvlText w:val=""/>
+      <w:lvlJc w:val="left"/>
+      <w:pPr>
+        <w:tabs>
+          <w:tab w:val="num" w:pos="5040"/>
+        </w:tabs>
+        <w:ind w:left="5040" w:hanging="360"/>
+      </w:pPr>
+      <w:rPr>
+        <w:rFonts w:ascii="Wingdings" w:hAnsi="Wingdings" w:hint="default"/>
+        <w:sz w:val="20"/>
+      </w:rPr>
+    </w:lvl>
+    <w:lvl w:ilvl="7" w:tentative="1">
+      <w:start w:val="1"/>
+      <w:numFmt w:val="bullet"/>
+      <w:lvlText w:val=""/>
+      <w:lvlJc w:val="left"/>
+      <w:pPr>
+        <w:tabs>
+          <w:tab w:val="num" w:pos="5760"/>
+        </w:tabs>
+        <w:ind w:left="5760" w:hanging="360"/>
+      </w:pPr>
+      <w:rPr>
+        <w:rFonts w:ascii="Wingdings" w:hAnsi="Wingdings" w:hint="default"/>
+        <w:sz w:val="20"/>
+      </w:rPr>
+    </w:lvl>
+    <w:lvl w:ilvl="8" w:tentative="1">
+      <w:start w:val="1"/>
+      <w:numFmt w:val="bullet"/>
+      <w:lvlText w:val=""/>
+      <w:lvlJc w:val="left"/>
+      <w:pPr>
+        <w:tabs>
+          <w:tab w:val="num" w:pos="6480"/>
+        </w:tabs>
+        <w:ind w:left="6480" w:hanging="360"/>
+      </w:pPr>
+      <w:rPr>
+        <w:rFonts w:ascii="Wingdings" w:hAnsi="Wingdings" w:hint="default"/>
+        <w:sz w:val="20"/>
+      </w:rPr>
+    </w:lvl>
+  </w:abstractNum>
+  <w:abstractNum w:abstractNumId="20" w15:restartNumberingAfterBreak="0">
     <w:nsid w:val="6ECC63D1"/>
     <w:multiLevelType w:val="multilevel"/>
     <w:tmpl w:val="3B14DBDE"/>
@@ -8055,7 +9364,7 @@
       </w:rPr>
     </w:lvl>
   </w:abstractNum>
-  <w:abstractNum w:abstractNumId="18" w15:restartNumberingAfterBreak="0">
+  <w:abstractNum w:abstractNumId="21" w15:restartNumberingAfterBreak="0">
     <w:nsid w:val="74676338"/>
     <w:multiLevelType w:val="multilevel"/>
     <w:tmpl w:val="2E921D20"/>
@@ -8204,7 +9513,7 @@
       </w:rPr>
     </w:lvl>
   </w:abstractNum>
-  <w:abstractNum w:abstractNumId="19" w15:restartNumberingAfterBreak="0">
+  <w:abstractNum w:abstractNumId="22" w15:restartNumberingAfterBreak="0">
     <w:nsid w:val="748C79A6"/>
     <w:multiLevelType w:val="multilevel"/>
     <w:tmpl w:val="6D70DB6E"/>
@@ -8360,10 +9669,10 @@
     <w:abstractNumId w:val="3"/>
   </w:num>
   <w:num w:numId="3" w16cid:durableId="1281455928">
-    <w:abstractNumId w:val="18"/>
+    <w:abstractNumId w:val="21"/>
   </w:num>
   <w:num w:numId="4" w16cid:durableId="337585272">
-    <w:abstractNumId w:val="15"/>
+    <w:abstractNumId w:val="16"/>
   </w:num>
   <w:num w:numId="5" w16cid:durableId="1064065451">
     <w:abstractNumId w:val="9"/>
@@ -8378,7 +9687,7 @@
     <w:abstractNumId w:val="10"/>
   </w:num>
   <w:num w:numId="9" w16cid:durableId="1205945375">
-    <w:abstractNumId w:val="16"/>
+    <w:abstractNumId w:val="17"/>
   </w:num>
   <w:num w:numId="10" w16cid:durableId="857935102">
     <w:abstractNumId w:val="2"/>
@@ -8402,16 +9711,45 @@
     <w:abstractNumId w:val="12"/>
   </w:num>
   <w:num w:numId="17" w16cid:durableId="1109668883">
-    <w:abstractNumId w:val="17"/>
+    <w:abstractNumId w:val="20"/>
   </w:num>
   <w:num w:numId="18" w16cid:durableId="1664121591">
-    <w:abstractNumId w:val="19"/>
+    <w:abstractNumId w:val="22"/>
   </w:num>
   <w:num w:numId="19" w16cid:durableId="18237834">
     <w:abstractNumId w:val="7"/>
   </w:num>
   <w:num w:numId="20" w16cid:durableId="1835217564">
+    <w:abstractNumId w:val="15"/>
+  </w:num>
+  <w:num w:numId="21" w16cid:durableId="268396427">
+    <w:abstractNumId w:val="18"/>
+  </w:num>
+  <w:num w:numId="22" w16cid:durableId="662971784">
     <w:abstractNumId w:val="14"/>
+  </w:num>
+  <w:num w:numId="23" w16cid:durableId="528379730">
+    <w:abstractNumId w:val="19"/>
+  </w:num>
+  <w:num w:numId="24" w16cid:durableId="1090157176">
+    <w:abstractNumId w:val="19"/>
+    <w:lvlOverride w:ilvl="1">
+      <w:lvl w:ilvl="1">
+        <w:numFmt w:val="bullet"/>
+        <w:lvlText w:val="o"/>
+        <w:lvlJc w:val="left"/>
+        <w:pPr>
+          <w:tabs>
+            <w:tab w:val="num" w:pos="1440"/>
+          </w:tabs>
+          <w:ind w:left="1440" w:hanging="360"/>
+        </w:pPr>
+        <w:rPr>
+          <w:rFonts w:ascii="Courier New" w:hAnsi="Courier New" w:hint="default"/>
+          <w:sz w:val="20"/>
+        </w:rPr>
+      </w:lvl>
+    </w:lvlOverride>
   </w:num>
 </w:numbering>
 </file>

</xml_diff>